<commit_message>
Proofread German edition: 263 fixes applied, 15 decisions logged
Co-Authored-By: Claude Opus 5.5 <noreply@anthropic.com>
Claude-Session: https://claude.ai/code/session_015bGU9R5VguxHZDVriTWnnq
</commit_message>
<xml_diff>
--- a/corrected/Inn Trouble - ASSEMBLED - FORMATTED_German.docx
+++ b/corrected/Inn Trouble - ASSEMBLED - FORMATTED_German.docx
@@ -135,12 +135,12 @@
     </w:p>
     <w:p>
       <w:r>
-        <w:t>Der Zettel forderte eine halbe Million Dollar. Er wusste, was ihre Urgroßmutter 1924 den Blackburns weggenommen hatte, und nannte das Geschäft zwei Städte weiter, wo sie es verkauft hatte, sowie den Saphir im Herzen der Brosche – Einzelheiten, die in genau einer verschlossenen Truhe auf Fionas Dachboden und an einem einzigen anderen Ort in der Stadt existierten.</w:t>
-      </w:r>
-    </w:p>
-    <w:p>
-      <w:r>
-        <w:t>Jessica Claus fing dort an, wo das Wissen hergekommen sein konnte, statt dort, wo die Stadt es gern hinlenken wollte. Ein Hufschmied schuldete zwanzig Dollar und verweigerte eine klare Antwort. Ein Fremder, der Visitenkarten wegen einer verschwundenen Brosche an jeden verteilte, der sie annahm. Ein Historiker, der auf einer Pritsche neben einem Heizkessel schlief, dessen Reparatur er sich nicht leisten konnte.</w:t>
+        <w:t xml:space="preserve">Der Zettel forderte eine halbe Million Dollar. Er wusste, was ihre Urgroßmutter 1924 den Blackburns weggenommen hatte, und nannte das Geschäft zwei Städte weiter, wo sie es verkauft hatte, sowie den Stein im Herzen der Brosche – Einzelheiten, die in genau einem verschlossenen Koffer auf Fionas Dachboden und an einem einzigen anderen Ort in der Stadt existierten.</w:t>
+      </w:r>
+    </w:p>
+    <w:p>
+      <w:r>
+        <w:t xml:space="preserve">Jessica Claus fing dort an, wo das Wissen hergekommen sein konnte, statt dort, wo die Stadt es gern hinlenken wollte. Ein Schmied, dem man zwanzig Dollar schuldete und eine klare Antwort verweigerte. Ein Fremder, der Visitenkarten wegen einer verschwundenen Brosche an jeden verteilte, der sie annahm. Ein Historiker, der auf einer Pritsche neben einem Heizkessel schlief, dessen Reparatur er sich nicht leisten konnte.</w:t>
       </w:r>
     </w:p>
     <w:p>
@@ -176,7 +176,7 @@
     </w:p>
     <w:p>
       <w:r>
-        <w:t>Der Vormittag war halb Herbst und halb etwas Kälteres. Das war das Erste, was mir auffiel, als ich mit dem Korb am Arm die Stufen der Veranda hinabging. Die Ahornbäume entlang der Evergreen Avenue hatten über das Wochenende den Großteil ihres Goldes abgeworfen, und was übrig geblieben war, kam bei jeder Windböe in kleinen, trockenen Schüben herunter, huschte über den Gehweg und türmte sich in den Rinnsteinen. Unter dem Geruch nach trockenem Laub des späten Herbstes lag eine saubere, kalte Schärfe in der Luft, die ich schon sehr lange kannte. Schnee. Nicht heute, vielleicht nicht morgen. Aber im Anmarsch. Es hatte in der Woche, als wir Marthas Hund fanden, bereits geschneit, vier Zoll hoch, aber eine Reihe milder Tage hatte ihn wieder weggeschmolzen, und niemand im Ort war schon bereit, an den Winter zu glauben. In den Schaufenstern leuchteten orangefarbene Lichter und auf jeder Treppe standen Kürbisse, und jeder, den ich kannte, steckte mitten in den Vorbereitungen für das Halloween-Fest.</w:t>
+        <w:t xml:space="preserve">Der Vormittag war halb Herbst und halb etwas Kälteres. Das war das Erste, was mir auffiel, als ich mit dem Korb am Arm die Stufen der Veranda hinabging. Die Ahornbäume entlang der Evergreen Avenue hatten über das Wochenende den Großteil ihres Goldes abgeworfen, und was übrig geblieben war, kam bei jeder Windböe in kleinen, trockenen Schüben herunter, huschte über den Gehweg und türmte sich in den Rinnsteinen. Unter dem Geruch nach trockenem Laub des späten Herbstes lag eine saubere, kalte Schärfe in der Luft, die ich schon sehr lange kannte. Schnee. Nicht heute, vielleicht nicht morgen. Aber im Anmarsch. Es hatte in der Woche, als wir Marthas Hund fanden, bereits geschneit, zehn Zentimeter hoch, aber eine Reihe milder Tage hatte ihn wieder weggeschmolzen, und niemand im Ort war schon bereit, an den Winter zu glauben. In den Schaufenstern leuchteten orangefarbene Lichter und auf jeder Treppe standen Kürbisse, und jeder, den ich kannte, steckte mitten in den Vorbereitungen für das Halloween-Fest.</w:t>
       </w:r>
     </w:p>
     <w:p>
@@ -220,7 +220,7 @@
     </w:p>
     <w:p>
       <w:r>
-        <w:t>„Sie dir nur dieses Band an“, sagte ich.</w:t>
+        <w:t xml:space="preserve">„Sieh dir nur dieses Band an“, sagte ich.</w:t>
       </w:r>
     </w:p>
     <w:p>
@@ -260,7 +260,7 @@
     </w:p>
     <w:p>
       <w:r>
-        <w:t>Das brachte ihr ein halbes Lächeln ab, was immerhin etwas war. Sie nahm den Korb an sich und drückte ihn mit beiden Armen an ihren Körper, wie ein Kind, das eine Wärmflasche umklammert. Über den Rand hinweg glitten ihre Blicke an meiner Schulter vorbei zur Tür, kehrten zurück und glitten wieder vorbei. Sie beobachtete die Tür. Ich kannte diesen Blick. Ich habe in meinem Leben sehr viele Briefe von Menschen gelesen, die ihre Tage damit verbringen, eine Tür nach dem zu beobachten, was sie fürchten, und nach einer Weile setzt sich dieser Blick im Körper fest. Jetzt hatte er sich in Fionas Körper festgesetzt.</w:t>
+        <w:t xml:space="preserve">Das rang ihr ein halbes Lächeln ab, was immerhin etwas war. Sie nahm den Korb an sich und drückte ihn mit beiden Armen an ihren Körper, wie ein Kind, das eine Wärmflasche umklammert. Über den Rand hinweg glitten ihre Blicke an meiner Schulter vorbei zur Tür, kehrten zurück und glitten wieder vorbei. Sie beobachtete die Tür. Ich kannte diesen Blick. Ich habe in meinem Leben sehr viele Briefe von Menschen gelesen, die ihre Tage damit verbringen, eine Tür nach dem zu beobachten, was sie fürchten, und nach einer Weile setzt sich dieser Blick im Körper fest. Jetzt hatte er sich in Fionas Körper festgesetzt.</w:t>
       </w:r>
     </w:p>
     <w:p>
@@ -280,7 +280,7 @@
     </w:p>
     <w:p>
       <w:r>
-        <w:t>„Mehr als eingelebt.“ Der Mann hatte silbernes Haar und war akkurat gekleidet, freundlich und gemächlich, ein Mann, der offenkundig noch nie im Leben auf seinen Zug hatte warten müssen. Seine Frau trug Kaschmir in der Farbe von Sahne und Perlenohrringe – nein, Diamanten, kleine, die das Kaminfeuer fingen, als sie den Kopf drehte, und es an der Decke tanzten ließen. „Wir hatten gehofft, Fiona, dass Sie uns die Suite vielleicht noch eine Woche überlassen könnten. Wir haben uns in den Ort verliebt. Meine Frau sagt, sie habe seit Jahren nicht mehr so gut geschlafen.“</w:t>
+        <w:t xml:space="preserve">„Mehr als eingelebt.“ Der Mann hatte silbernes Haar und war akkurat gekleidet, freundlich und gemächlich, ein Mann, der offenkundig noch nie im Leben hatte warten müssen, bis er an der Reihe war. Seine Frau trug Kaschmir in der Farbe von Sahne und Perlenohrringe – nein, Diamanten, kleine, die das Kaminfeuer fingen, als sie den Kopf drehte, und es an der Decke tanzen ließen. „Wir hatten gehofft, Fiona, dass Sie uns die Suite vielleicht noch eine Woche überlassen könnten. Wir haben uns in den Ort verliebt. Meine Frau sagt, sie habe seit Jahren nicht mehr so gut geschlafen.“</w:t>
       </w:r>
     </w:p>
     <w:p>
@@ -315,7 +315,7 @@
     </w:p>
     <w:p>
       <w:r>
-        <w:t>Es war diesmal Sam Patel, der mit einer Kiste voll Eisenwaren im Arm rückwärts hereintrat, wobei die Halterungen für die Veranda hohl und dumpf gegeneinanderstießen, als er sich umdrehte und sie mit einem Grunzen neben dem Tresen absetzte. Sam war ein kräftiger, sorgsamer Mann, in dessen Knochenfalten sich Ruß so tief hineingesetzt hatte, dass ich bezweifelte, ob Seife da überhaupt noch heranreichen konnte, und gewöhnlich besaß er die gelassene Ruhe eines Handwerkers. Davon war jetzt nichts mehr zu spüren. Mit zusammenbissener Kieferpartie ging er auf Fiona zu.</w:t>
+        <w:t xml:space="preserve">Es war diesmal Sam Patel, der mit einer Kiste voll Eisenwaren im Arm rückwärts hereintrat, wobei die Halterungen für die Veranda hohl und dumpf gegeneinanderstießen, als er sich umdrehte und sie mit einem Grunzen neben dem Tresen absetzte. Sam war ein kräftiger, sorgsamer Mann, in dessen Knöchelfalten sich Ruß so tief hineingesetzt hatte, dass ich bezweifelte, ob Seife da überhaupt noch heranreichen konnte, und gewöhnlich besaß er die gelassene Ruhe eines Handwerkers. Davon war jetzt nichts mehr zu spüren. Mit zusammengebissener Kieferpartie ging er auf Fiona zu.</w:t>
       </w:r>
     </w:p>
     <w:p>
@@ -345,7 +345,7 @@
     </w:p>
     <w:p>
       <w:r>
-        <w:t>Sam nickte, nicht unkindlich, nahm den Freitag hin und ging zurück zu seinem Lastwagen. Ein Mann, den ich nicht kannte, trat nahtlos in den Raum, den er freigemacht hatte, gerade so, als hätte er genau darauf gewartet.</w:t>
+        <w:t xml:space="preserve">Sam nickte, nicht unfreundlich, nahm den Freitag hin und ging zurück zu seinem Lastwagen. Ein Mann, den ich nicht kannte, trat nahtlos in den Raum, den er freigemacht hatte, gerade so, als hätte er genau darauf gewartet.</w:t>
       </w:r>
     </w:p>
     <w:p>
@@ -400,7 +400,7 @@
     </w:p>
     <w:p>
       <w:r>
-        <w:t>„Beschäftigt“, sagte ich. „Es ist das Fest. Das ist verdammt viel Arbeit für eine einzelne Frau.“</w:t>
+        <w:t xml:space="preserve">„Beschäftigt“, sagte ich. „Es ist das Fest. Das ist sehr viel Arbeit für eine einzelne Frau.“</w:t>
       </w:r>
     </w:p>
     <w:p>
@@ -410,7 +410,7 @@
     </w:p>
     <w:p>
       <w:r>
-        <w:t>Ich sammelte Pip ein, die sich in der Zwischenzeit quer durch die Lobby zu einem niedrigen Tisch an der Treppe vorgearbeitet hatte, auf dem ein großer, glänzender Blickfang thronte – eine geschliffene Kristallschale voll mit gläsernem Obst, das Regenbogenfarben verstreute, wenn das Kaminfeuer hineinfiel. Sie stand mit dem Schnabel kaum einen Zoll von einer Glasbirne entfernt, vor Begehren leicht vibrierend.</w:t>
+        <w:t xml:space="preserve">Ich sammelte Pip ein, die sich in der Zwischenzeit quer durch die Lobby zu einem niedrigen Tisch an der Treppe vorgearbeitet hatte, auf dem ein großer, glänzender Blickfang thronte – eine geschliffene Kristallschale voll mit gläsernem Obst, das Regenbogenfarben verstreute, wenn das Kaminfeuer hineinfiel. Sie stand mit dem Schnabel kaum zwei Zentimeter von einer Glasbirne entfernt, vor Begehren leicht vibrierend.</w:t>
       </w:r>
     </w:p>
     <w:p>
@@ -425,12 +425,12 @@
     </w:p>
     <w:p>
       <w:r>
-        <w:t>Draußen war die Kälte eine Erholung nach der drückenden, warmen Sorge in der Lobby. Ich blieb einen Augenblick am Geländer der Veranda stehen und ließ mir den Kopf frei pusten. Unten auf dem Anger spannten Männer Leitern und zogen Festbeleuchtung zwischen den Masten ein, während sie einander zuriefen. Irgendwo Richtung Park barkte ein Hund, und in der Ferne ertönte der Pfiff des Zuges, der in den Bahnhof fuhr. Das alles war so alltäglich, dass die Falschheit in Fionas Gesicht mir für einen Moment wie etwas vorkam, das ich mir nur eingebildet hatte.</w:t>
-      </w:r>
-    </w:p>
-    <w:p>
-      <w:r>
-        <w:t>Ich ging die Stufen hinab, und als ich mich unten umdrehte, um noch einmal zum Gasthof hinaufzublicken, flackerte die unterste Lichterkette mit den orangefarbenen Festleuchten an der Dachtraufe.</w:t>
+        <w:t xml:space="preserve">Draußen war die Kälte eine Erholung nach der drückenden, warmen Sorge in der Lobby. Ich blieb einen Augenblick am Geländer der Veranda stehen und ließ mir den Kopf frei pusten. Unten auf dem Anger spannten Männer auf Leitern die Festbeleuchtung zwischen den Laternenmasten, während sie einander zuriefen. Irgendwo Richtung Park bellte ein Hund, und in der Ferne ertönte der Pfiff des Zuges, der in den Bahnhof fuhr. Das alles war so alltäglich, dass die Falschheit in Fionas Gesicht mir für einen Moment wie etwas vorkam, das ich mir nur eingebildet hatte.</w:t>
+      </w:r>
+    </w:p>
+    <w:p>
+      <w:r>
+        <w:t xml:space="preserve">Ich ging die Stufen hinab, und als ich mich unten umdrehte, um noch einmal zum Gasthof hinaufzublicken, flackerte die nächstgelegene Lichterkette mit den orangefarbenen Festleuchten an der Dachtraufe.</w:t>
       </w:r>
     </w:p>
     <w:p>
@@ -500,7 +500,7 @@
     </w:p>
     <w:p>
       <w:r>
-        <w:t>„Jessica?“, Fionas Stimme klang dünn und straff wie eine Drahtseil. Darunter hörte ich sie falsch atmen, schnell und flach. „Könntest du kommen? Zum Gasthof. Jetzt, wenn du es einrichten kannst. Bitte.“</w:t>
+        <w:t xml:space="preserve">„Jessica?“ Fionas Stimme klang dünn und straff wie ein Drahtseil. Darunter hörte ich sie falsch atmen, schnell und flach. „Könntest du kommen? Zum Gasthof. Jetzt, wenn du es einrichten kannst. Bitte.“</w:t>
       </w:r>
     </w:p>
     <w:p>
@@ -530,7 +530,7 @@
     </w:p>
     <w:p>
       <w:r>
-        <w:t>Der Morgen war über Nacht kalt und starr geworden. Die Pfützen im Weg waren mit einer Eisschicht überzogen, die unter meinen Stiefeln knackte, und das trockene Laub war steif und silbrig vom Frost geworden. Der Geruch von Holzrauch aus den Schornsteinen entlang der Evergreen Street lag schwer in der windstillen Kälte. Die Stadt war kaum wach. Die meisten Geschäfte lagen noch im Dunkeln, ihre Festtagskürbisse auf den Treppenstufen, und unsere Schritte hallten auf dem leeren Gehweg wider.</w:t>
+        <w:t xml:space="preserve">Der Morgen war über Nacht kalt und starr geworden. Die Pfützen im Weg waren mit einer Eisschicht überzogen, die unter meinen Stiefeln knackte, und das trockene Laub war steif und silbrig vom Frost geworden. Der Geruch von Holzrauch aus den Schornsteinen entlang der Evergreen Avenue lag schwer in der windstillen Kälte. Die Stadt war kaum wach. Die meisten Geschäfte lagen noch im Dunkeln, ihre Festtagskürbisse auf den Treppenstufen, und unsere Schritte hallten auf dem leeren Gehweg wider.</w:t>
       </w:r>
     </w:p>
     <w:p>
@@ -576,7 +576,7 @@
         <w:rPr>
           <w:i/>
         </w:rPr>
-        <w:t>Ich weiß, wie deine Familie zu diesem Gasthof gekommen ist. Ich weiß von der Brosche, die deine Urgroßmutter den Blackburns gestohlen hat, der mit dem Saphir im Herzen, und dem Geschäft in Ridgeline, wo sie sie verkaufte, um diesen Ort zu kaufen. Zahlt, oder die ganze Stadt erfährt die Wahrheit. Lass das Geld unter den Stufen des Haupteingangs zurück. Nimm die goldene Schleife vom Kranz ab und steck stattdessen eine rote an ihren Platz, damit ich weiß, dass das Geld da ist.</w:t>
+        <w:t xml:space="preserve">Ich weiß, wie deine Familie zu diesem Gasthof gekommen ist. Ich weiß von der Brosche, die deine Urgroßmutter den Blackburns gestohlen hat, der mit dem Saphir im Herzen, und dem Geschäft in Ridgeline, wo sie sie verkaufte, um diesen Ort zu kaufen. Zahl, oder die ganze Stadt erfährt die Wahrheit. Lass das Geld unter den Stufen des Haupteingangs zurück. Nimm die goldene Schleife vom Kranz ab und steck stattdessen eine rote an ihren Platz, damit ich weiß, dass das Geld da ist.</w:t>
       </w:r>
     </w:p>
     <w:p>
@@ -596,7 +596,7 @@
     </w:p>
     <w:p>
       <w:r>
-        <w:t>Ich sah hin. Das Foto zeigte eine Frau in der Kleidung von vor hundert Jahren, schmal und ernst, ihr dunkles Haar in den Zwanzigern dicht am Kopf gewellt, das Kinn gehoben, ihren Blick gerade auf die Kamera gerichtet mit etwas darin, das nicht ganz ein Lächeln und nicht ganz Trotz war, aber mit beidem nah verwandt. Sie trug ein hochgeschlossenes Kleid, und an ihrer Kehle, direkt unter dem Kragen festgesteckt, war eine Brosche. Selbst auf dem weichen, braunen Bild konnte man erkennen, dass es ein feines Stück war, Gold in einer kunstvollen Fassung um einen einzigen großen Stein gearbeitet, den der alte Film als blassen, grauen Schimmer eingefangen hatte.</w:t>
+        <w:t xml:space="preserve">Ich sah hin. Das Foto zeigte eine Frau in der Kleidung von vor hundert Jahren, schmal und ernst, ihr dunkles Haar im Stil der Zwanzigerjahre dicht am Kopf gewellt, das Kinn gehoben, ihren Blick gerade auf die Kamera gerichtet mit etwas darin, das nicht ganz ein Lächeln und nicht ganz Trotz war, aber mit beidem nah verwandt. Sie trug ein hochgeschlossenes Kleid, und an ihrer Kehle, direkt unter dem Kragen festgesteckt, war eine Brosche. Selbst auf dem weichen, braunen Bild konnte man erkennen, dass es ein feines Stück war, Gold in einer kunstvollen Fassung um einen einzigen großen Stein gearbeitet, den der alte Film als blassen, grauen Schimmer eingefangen hatte.</w:t>
       </w:r>
     </w:p>
     <w:p>
@@ -606,7 +606,7 @@
     </w:p>
     <w:p>
       <w:r>
-        <w:t>„Nein.“ Fionas Stimme versagte. „Nein, das ist eine Blackburn. Eine der alten Blackburns, aus der Zeit, als sie das ganze Geld im Landkreis hatten. Ich kenne nicht einmal ihren Namen.“ Sie berührte den braunen Rand des Fotos. „Constance hat sie all die Jahre behalten. Ich glaube, es war die Brosche, von der sie nicht lassen konnte, nicht die Frau. Aber die Brosche, die sie trägt.“ Sie presste ihre Hand flach gegen ihre Brust, als täte es ihr dort weh. „Die Brosche gehört uns, Jessica. Das ist es, womit sie mich in der Hand haben. Diese Brosche.“</w:t>
+        <w:t xml:space="preserve">„Nein.“ Fionas Stimme versagte. „Nein, das ist eine Blackburn. Eine der alten Blackburns, aus der Zeit, als sie das ganze Geld im Landkreis hatten. Ich kenne nicht einmal ihren Namen.“ Sie berührte den braunen Rand des Fotos. „Constance hat es all die Jahre behalten. Ich glaube, es war die Brosche, von der sie nicht lassen konnte, nicht die Frau. Aber die Brosche, die sie trägt.“ Sie presste ihre Hand flach gegen ihre Brust, als täte es ihr dort weh. „Die Brosche gehört uns, Jessica. Das ist es, womit sie mich in der Hand haben. Diese Brosche.“</w:t>
       </w:r>
     </w:p>
     <w:p>
@@ -616,7 +616,7 @@
     </w:p>
     <w:p>
       <w:r>
-        <w:t>„1924 arbeitete meine Urgroßmutter, Constance Okafor, als Hausmädchen bei den Blackburns“, sagte sie. „Sie war jung. Neunzehn, vielleicht zwanzig. Sie waren damals die reichste Familie in Frost Falls, die reichsten im Umkreis von fünfzig Meilen, und sie putzte ihre Zimmer, machte ihre Feuer und entstaubte ihre Sachen, diese Brosche eingeschlossen, Tag für Tag.“ Sie holte einen zittrigen Atemzug. „Und in einem Winter hat Constance sie genommen. Sie hat sie gestohlen, Jessica. Diese Brosche, direkt vom Frisiertisch oder aus ihrer Schatulle, ich weiß nicht genau wie. Und sie hat sie aus diesem Haus geschafft und ist nie zurückgekehrt.“</w:t>
+        <w:t xml:space="preserve">„1924 arbeitete meine Urgroßmutter, Constance Okafor, als Hausmädchen bei den Blackburns“, sagte sie. „Sie war jung. Neunzehn, vielleicht zwanzig. Sie waren damals die reichste Familie in Frost Falls, die reichste im Umkreis von fünfzig Meilen, und sie putzte ihre Zimmer, machte ihre Feuer und entstaubte ihre Sachen, diese Brosche eingeschlossen, Tag für Tag.“ Sie holte einen zittrigen Atemzug. „Und in einem Winter hat Constance sie genommen. Sie hat sie gestohlen, Jessica. Diese Brosche, direkt vom Frisiertisch oder aus ihrer Schatulle, ich weiß nicht genau wie. Und sie hat sie aus diesem Haus geschafft und ist nie zurückgekehrt.“</w:t>
       </w:r>
     </w:p>
     <w:p>
@@ -631,7 +631,7 @@
     </w:p>
     <w:p>
       <w:r>
-        <w:t>Die Schwere davon legte sich über das kleine Zimmer. Ich saß mit dem Foto in der einen Hand und dem Zettel in der anderen da und versuchte, es zu begreifen. Der Gasthof, in dem die halbe Stadt zu der einen oder anderen Zeit etwas gefeiert hatte, erbaut auf einen Diebstahl vor einem Jahrhundert.</w:t>
+        <w:t xml:space="preserve">Die Schwere davon legte sich über das kleine Zimmer. Ich saß mit dem Foto in der einen Hand und dem Zettel in der anderen da und versuchte, es zu begreifen. Der Gasthof, in dem die halbe Stadt zu der einen oder anderen Zeit etwas gefeiert hatte, erbaut auf einem Diebstahl vor einem Jahrhundert.</w:t>
       </w:r>
     </w:p>
     <w:p>
@@ -650,7 +650,7 @@
         <w:t>verlier ihn nicht</w:t>
       </w:r>
       <w:r>
-        <w:t xml:space="preserve"> stand. Also habe ich ihn natürlich geöffnet.“ Ein kleines, gebrochenes Lachen. „Briefe. Ein Pfandbeleg, der echte, aus dem Geschäft in Ridgeline, mit dem Datum und dem Betrag. Ein paar andere Dinge. Alles klein zusammengelegt und in die Ecken gesteckt, wie etwas, das man nicht übers Herz bringt, wegzuwerfen, und auf das man auch nicht zu blicken erträgt. Meine Mutter wusste es. Ihre Mutter wusste es. Und jetzt weiß ich es. Und nicht eine von uns hat je einem leiblichen Menschen ein Wort gesagt.“ Sie blickte zu mir auf, und ihre Augen waren roh. „Wem hätte ich es erzählen können? Wie erzählt man so etwas irgendjemandem? Wie würden sie mich ansehen, den Gasthof, wenn sie es wüssten?“</w:t>
+        <w:t xml:space="preserve"> stand. Also habe ich ihn natürlich geöffnet.“ Ein kleines, gebrochenes Lachen. „Briefe. Ein Pfandbeleg, der echte, aus dem Geschäft in Ridgeline, mit dem Datum und dem Betrag. Ein paar andere Dinge. Alles klein zusammengelegt und in die Ecken gesteckt, wie etwas, das man nicht übers Herz bringt, wegzuwerfen, und auf das man auch nicht zu blicken erträgt. Meine Mutter wusste es. Ihre Mutter wusste es. Und jetzt weiß ich es. Und nicht eine von uns hat je einer Menschenseele ein Wort gesagt.“ Sie blickte zu mir auf, und ihre Augen waren wund. „Wem hätte ich es erzählen können? Wie erzählt man so etwas irgendjemandem? Wie würden sie mich ansehen, den Gasthof, wenn sie es wüssten?“</w:t>
       </w:r>
     </w:p>
     <w:p>
@@ -660,7 +660,7 @@
     </w:p>
     <w:p>
       <w:r>
-        <w:t>„Aber verstehst du denn nicht?“ Sie schüttelte gequält den Kopf. „Es spielt keine Rolle, was an mir wahr ist. Es spielt nur eine Rolle, was sie sagen können. Wenn das herauskommt, ruiniert es alles. Den Namen des Gasthofs. Den Namen meiner Familie. Hundert Jahre Arbeit, dahin, wegen eines Mädchens, das ich nie getroffen habe, und einer Sache, die ich nie getan habe.“ Sie gestikulierte auf den Zettel. „Und jetzt weiß es jemand. Jemand weiß es, Jessica, und ich verstehe nicht wie, denn ich habe diesen Koffer auf dem Dachboden verschlossen und bin der einzige lebende Mensch, der ihn je geöffnet hat. Der Einzige. Also wie?“</w:t>
+        <w:t xml:space="preserve">„Aber verstehst du denn nicht?“ Sie schüttelte gequält den Kopf. „Es spielt keine Rolle, was an mir wahr ist. Es spielt nur eine Rolle, was sie sagen können. Wenn das herauskommt, ruiniert es alles. Den Namen des Gasthofs. Den Namen meiner Familie. Hundert Jahre Arbeit, dahin, wegen eines Mädchens, das ich nie getroffen habe, und einer Sache, die ich nie getan habe.“ Sie deutete auf den Zettel. „Und jetzt weiß es jemand. Jemand weiß es, Jessica, und ich verstehe nicht wie, denn ich habe diesen Koffer auf dem Dachboden verschlossen und bin der einzige lebende Mensch, der ihn je geöffnet hat. Der Einzige. Also wie?“</w:t>
       </w:r>
     </w:p>
     <w:p>
@@ -670,7 +670,7 @@
     </w:p>
     <w:p>
       <w:r>
-        <w:t>Ich hob den Zettel wieder auf und las ihn noch einmal, diesmal sorgfältiger, und als ich ihn dicht heranzog, um das gedrängte Gekritzel zu lesen, stieg ein Geruch von dem Papier auf. Schwach, aber vorhanden. Stechend, ein wenig metallisch, mit etwas Mineralischem darunter. Ich kannte ihn von irgendwoher aus jüngster Zeit und konnte mir verdammt noch mal nicht ins Gedächtnis rufen, woher.</w:t>
+        <w:t xml:space="preserve">Ich hob den Zettel wieder auf und las ihn noch einmal, diesmal sorgfältiger, und als ich ihn dicht heranzog, um das gedrängte Gekritzel zu lesen, stieg ein Geruch von dem Papier auf. Schwach, aber vorhanden. Stechend, ein wenig metallisch, mit etwas Mineralischem darunter. Ich kannte ihn von irgendwoher aus jüngster Zeit und konnte mir beim besten Willen nicht ins Gedächtnis rufen, woher.</w:t>
       </w:r>
     </w:p>
     <w:p>
@@ -730,7 +730,7 @@
     </w:p>
     <w:p>
       <w:r>
-        <w:t>„Wir werden das herausfinden“, sagte ich, und das meinte ich von Grund auf so. Ich steckte den Zettel und das Foto sorgfältig in die Innentasche meines Mantels, an mein Herz. „Hörst du mich? Du trägst das nicht länger allein. Nicht einen einzigen Tag mehr. Was immer es kostet, wer immer es am Ende sein mag, du hast jetzt eine Freundin darin, und ich bin sehr starrschnäppig und habe mehr Zeit und Geduld als jeder Mensch, den du kennst.“</w:t>
+        <w:t xml:space="preserve">„Wir werden das herausfinden“, sagte ich, und das meinte ich von Grund auf so. Ich steckte den Zettel und das Foto sorgfältig in die Innentasche meines Mantels, an mein Herz. „Hörst du mich? Du trägst das nicht länger allein. Nicht einen einzigen Tag mehr. Was immer es kostet, wer immer es am Ende sein mag, du hast jetzt eine Freundin darin, und ich bin sehr stur und habe mehr Zeit und Geduld als jeder Mensch, den du kennst.“</w:t>
       </w:r>
     </w:p>
     <w:p>
@@ -778,13 +778,13 @@
     <w:p/>
     <w:p>
       <w:r>
-        <w:t>Also erzählte ich es ihm. Alles, während die Suppe dampfte und Pip am Herd döste, den Flossen über den Augen. Das Telefongespräch. Das kleine Empfangszimmer mit der lauten Uhr. Der Zettel, das rote Band und das Bargeld unter den Stufen. Das Foto der namenlosen Blackburn-Frau mit der Brosche am Hals. Constance Okafor, neunzehn oder zwanzig in einem harten Winter, der Diebstahl, das Pfandhaus zwei Ortschaften weiter in Ridgeline, das mit dem Geld gekaufte Gasthaus. Und der verschlossene Koffer auf dem Dachboden, den außer Fiona selbst niemand geöffnet hatte.</w:t>
-      </w:r>
-    </w:p>
-    <w:p/>
-    <w:p>
-      <w:r>
-        <w:t>Als ich den Zettel auf den Tisch legte, wachte Pip auf. Sie kam an den Rand des Tisches, streckte sich und drückte ihren Schnabel flach gegen das Papier. Dann hielt sie ganz still, genau wie damals, wenn sie eine Fährte aufgenommen hatte und sich ihrer sicher sein wollte. Schließlich ging sie zurück zum Herd und legte sich wieder hin, den Rücken uns zugewandt.</w:t>
+        <w:t xml:space="preserve">Also erzählte ich es ihm. Alles, während die Suppe dampfte und Pip am Herd döste, eine Flosse über den Augen. Das Telefongespräch. Das kleine Empfangszimmer mit der lauten Uhr. Der Zettel, das rote Band und das Bargeld unter den Stufen. Das Foto der namenlosen Blackburn-Frau mit der Brosche am Hals. Constance Okafor, neunzehn oder zwanzig in einem harten Winter, der Diebstahl, das Pfandhaus zwei Ortschaften weiter in Ridgeline, den mit dem Geld gekauften Gasthof. Und der verschlossene Koffer auf dem Dachboden, den außer Fiona selbst niemand geöffnet hatte.</w:t>
+      </w:r>
+    </w:p>
+    <w:p/>
+    <w:p>
+      <w:r>
+        <w:t xml:space="preserve">Als ich den Zettel auf den Tisch legte, wachte Pip auf. Sie kam an den Rand des Tisches, streckte sich und drückte ihren Schnabel flach gegen das Papier. Dann hielt sie ganz still, genau wie immer, wenn sie eine Fährte aufgenommen hatte und sich ihrer sicher sein wollte. Schließlich ging sie zurück zum Herd und legte sich wieder hin, den Rücken uns zugewandt.</w:t>
       </w:r>
     </w:p>
     <w:p/>
@@ -802,13 +802,13 @@
     <w:p/>
     <w:p>
       <w:r>
-        <w:t>„Genau darauf kam ich auch hinaus.“ Ich stellte meinen Löffel hin. „Sie ist sich sicher was den Koffer angeht, und ich glaube ihr, Nick. Man muss ihr einfach glauben, wenn man ihr Gesicht gesehen hat. Das Geheimnis ist also nicht von ihrer Seite durchsickert. Es kam von der anderen Seite. Der der Blackburns. Ihre Briefe, ihre Haushaltsbücher, was auch immer die Familie vor hundert Jahren aufschrieb, als eine Brosche aus dem Haus verschwand. Und wo landen hundert Jahre Blackburn-Papier schließlich?“</w:t>
-      </w:r>
-    </w:p>
-    <w:p/>
-    <w:p>
-      <w:r>
-        <w:t>„Wo alles Alte in dieser Stadt landet.“ Er nickte langsam. „Theos Archiv. Der Geschichtsverein.“</w:t>
+        <w:t xml:space="preserve">„Genau darauf kam ich auch hinaus.“ Ich stellte meinen Löffel hin. „Sie ist sich sicher, was den Koffer angeht, und ich glaube ihr, Nick. Man muss ihr einfach glauben, wenn man ihr Gesicht gesehen hat. Das Geheimnis ist also nicht von ihrer Seite durchgesickert. Es kam von der anderen Seite. Der der Blackburns. Ihre Briefe, ihre Haushaltsbücher, was auch immer die Familie vor hundert Jahren aufschrieb, als eine Brosche aus dem Haus verschwand. Und wo landen hundert Jahre Blackburn-Papier schließlich?“</w:t>
+      </w:r>
+    </w:p>
+    <w:p/>
+    <w:p>
+      <w:r>
+        <w:t xml:space="preserve">„Wo alles Alte in dieser Stadt landet.“ Er nickte langsam. „Theos Archiv. Der Historische Verein.“</w:t>
       </w:r>
     </w:p>
     <w:p/>
@@ -826,7 +826,7 @@
     <w:p/>
     <w:p>
       <w:r>
-        <w:t>„Theo Hussein“, sagte er, „ist einer der gütigsten Menschen in Frost Falls. Das weißt du genauso gut wie ich. Er hat damals fast geweint, als wir ihn den alten Werkstattschlitten für seine Sammlung fotografieren ließen. Er bringt Kakao für die Kindernachlesestunde samstags vorbei, den guten Kakao mit den kleinen Marshmallows, aus eigener Tasche, weil er findet, dass die Kinder von Frost Falls mit dem Bewusstsein aufwachsen sollten, woher sie kommen.“ Er sah mich an. „Ich sage das nicht, um mit dir zu streiten. Ich sage es, weil es wahr ist, und weil du dir das während dieser ganzen Sache ununterbrochen vor Augen halten musst, sonst machst du es nicht richtig.“</w:t>
+        <w:t xml:space="preserve">„Theo Hussein“, sagte er, „ist einer der gütigsten Menschen in Frost Falls. Das weißt du genauso gut wie ich. Er hat damals fast geweint, als wir ihn den alten Werkstattschlitten für seine Sammlung fotografieren ließen. Er bringt Kakao für die Kindervorlesestunde samstags vorbei, den guten Kakao mit den kleinen Marshmallows, aus eigener Tasche, weil er findet, dass die Kinder von Frost Falls mit dem Bewusstsein aufwachsen sollten, woher sie kommen.“ Er sah mich an. „Ich sage das nicht, um mit dir zu streiten. Ich sage es, weil es wahr ist, und weil du dir das während dieser ganzen Sache ununterbrochen vor Augen halten musst, sonst machst du es nicht richtig.“</w:t>
       </w:r>
     </w:p>
     <w:p/>
@@ -838,7 +838,7 @@
     <w:p/>
     <w:p>
       <w:r>
-        <w:t>„Dann ist hier noch etwas anderes, das wahr ist, und das vielleicht helfen könnte.“ Er lehnte sich nach vorn. „Viele Hände berühren diese Kisten, Jess. Freiwillige kommen und gehen. Forschende melden sich vorher an und verbringen hier eine Woche. Schulkinder auf Wandertag. Jeder, den Theo hereinlässt, und Theo lässt jeden herein, denn für Theo ist ein interessierter Fremder das Beste, was einem Dienstag passieren kann. Zu wissen, dass das Geheimnis aus den Blackburn-Papieren stammt, verrät dir also noch lange nicht, dass es Theo war. Es zeigt dir nur, wo du stehen musst. Es zeigt dir den Brunnen, aus dem geschöpft wurde. Jetzt musst du herausfinden, wessen Eimer hinabgelassen wurde.“</w:t>
+        <w:t xml:space="preserve">„Dann ist hier noch etwas anderes, das wahr ist, und das vielleicht helfen könnte.“ Er lehnte sich nach vorn. „Viele Hände berühren diese Kisten, Jess. Freiwillige kommen und gehen. Forschende melden sich vorher an und verbringen hier eine Woche. Schulkinder beim Wandertag. Jeder, den Theo hereinlässt, und Theo lässt jeden herein, denn für Theo ist ein interessierter Fremder das Beste, was einem Dienstag passieren kann. Zu wissen, dass das Geheimnis aus den Blackburn-Papieren stammt, verrät dir also noch lange nicht, dass es Theo war. Es zeigt dir nur, wo du stehen musst. Es zeigt dir den Brunnen, aus dem geschöpft wurde. Jetzt musst du herausfinden, wessen Eimer hinabgelassen wurde.“</w:t>
       </w:r>
     </w:p>
     <w:p/>
@@ -868,7 +868,7 @@
     <w:p/>
     <w:p>
       <w:r>
-        <w:t>Pip wachte beim Schaben des Topfes auf und kam an den Tisch, um nach einer Sardine zu sehen – ein ihr seit jeher zustehendes und unentziehbares Recht. Die Küche wärmte sich auf. Eine kleine Weile waren da nur wir beide, das Feuer und der Wasserdampf am Fenster, und ich ließ es dabei bewogen sein.</w:t>
+        <w:t xml:space="preserve">Pip wachte beim Schaben des Topfes auf und kam an den Tisch, um nach einer Sardine zu sehen – ein ihr seit jeher zustehendes und unentziehbares Recht. Die Küche wärmte sich auf. Eine kleine Weile waren da nur wir beide, das Feuer und der Wasserdampf am Fenster, und ich ließ es dabei bewenden.</w:t>
       </w:r>
     </w:p>
     <w:p/>
@@ -880,7 +880,7 @@
     <w:p/>
     <w:p>
       <w:r>
-        <w:t>„What are you building out there?“ Ich brach ab. „Was baust du da draußen eigentlich?“, fragte ich ihn und trocknete mir die Hände ab. Ich hatte schon vorher gefragt. Er hielt sich nun schon seit Wochen damit auf, sich nach dem Abendessen mit einer Laterne davonzumachen, summend, und kam spät zurück mit dem Geruch von frisch geschnittenem Kiefernholz und etwas Wärmerem, das ich nicht benennen konnte.</w:t>
+        <w:t xml:space="preserve">„Was baust du da draußen eigentlich?“, fragte ich ihn und trocknete mir die Hände ab. Ich hatte schon vorher gefragt. Er hielt sich nun schon seit Wochen damit auf, sich nach dem Abendessen mit einer Laterne davonzumachen, summend, und kam spät zurück mit dem Geruch von frisch geschnittenem Kiefernholz und etwas Wärmerem, das ich nicht benennen konnte.</w:t>
       </w:r>
     </w:p>
     <w:p/>
@@ -922,7 +922,7 @@
     <w:p/>
     <w:p>
       <w:r>
-        <w:t>Die Festbeleuchtung entlang der hinteren Dächer, die Lichterketten, welche die Männer zwischen den Laternenpfählen auf dem Anger gespannt hatten, leuchteten in einem tiefen, ruhigen Gold statt in Orange, jede einzelne Strähne, vom Grün bis zum Bahnhof, so weit mein Auge reichte.</w:t>
+        <w:t xml:space="preserve">Die Festbeleuchtung entlang der hinteren Dächer, die Lichterketten, welche die Männer zwischen den Laternenpfählen auf dem Anger gespannt hatten, leuchteten in einem tiefen, ruhigen Gold statt in Orange, jede einzelne Kette, vom Anger bis zum Bahnhof, so weit mein Auge reichte.</w:t>
       </w:r>
     </w:p>
     <w:p/>
@@ -970,13 +970,13 @@
     <w:p/>
     <w:p>
       <w:r>
-        <w:t>„Hat das mit deiner Überraschung zu tun? Mit dem, what ever da draußen in der Werkstatt ist?“ Ich strich den Anglizismus. „Mit dem, was da draußen in der Werkstatt ist?“</w:t>
-      </w:r>
-    </w:p>
-    <w:p/>
-    <w:p>
-      <w:r>
-        <w:t>Er schwieg einen Moment, während unsere beiden Atemzüge das kalte Glas beschlagen ließen. „Um diese Jahreszeit hat alles mit allem zu tun“, sagte er – was Nicks Art war zu sagen, wenn die wahre Antwort ja lautet und er noch nicht bereit war, es laut auszusprechen. Er legte seine Arme von hinten um mich. „Es wird niemandem wehtun, Jess. Was immer es da draußen mit den Lichtern anstellt. Es weiß gar nicht, wie man jemandem wehtut. Das hat es nie gewusst. Es sucht nur nach etwas.“</w:t>
+        <w:t xml:space="preserve">„Hat das mit deiner Überraschung zu tun? Mit dem, was da draußen in der Werkstatt ist?“</w:t>
+      </w:r>
+    </w:p>
+    <w:p/>
+    <w:p>
+      <w:r>
+        <w:t xml:space="preserve">Er schwieg einen Moment, während unsere beiden Atemzüge das kalte Glas beschlagen ließen. „Um diese Jahreszeit hat alles mit allem zu tun“, sagte er – was Nicks Art war zu sagen, wenn die wahre Antwort ja lautete und er noch nicht bereit war, es laut auszusprechen. Er legte seine Arme von hinten um mich. „Es wird niemandem wehtun, Jess. Was immer es da draußen mit den Lichtern anstellt. Es weiß gar nicht, wie man jemandem wehtut. Das hat es nie gewusst. Es sucht nur nach etwas.“</w:t>
       </w:r>
     </w:p>
     <w:p/>
@@ -1096,7 +1096,7 @@
     </w:p>
     <w:p>
       <w:r>
-        <w:t xml:space="preserve">Ich driftete zu Neil hinüber, denn Neil hatte sich genau dorthin begeben, was ich sehen wollte. Die Ausstellung war eine lange Vitrine, in deren Innerem ein halbes Dutzend alter Briefe aufgefächert lag; die Tinte war braun geworden, das Papier an den Rändern stockfleckig, und dazu gab es ein Kärtchen von Theos Hand mit der Aufschrift: </w:t>
+        <w:t xml:space="preserve">Ich driftete zu Neil hinüber, denn Neil hatte sich genau zu dem begeben, was ich sehen wollte. Die Ausstellung war eine lange Vitrine, in deren Innerem ein halbes Dutzend alter Briefe aufgefächert lag; die Tinte war braun geworden, das Papier an den Rändern stockfleckig, und dazu gab es ein Kärtchen von Theos Hand mit der Aufschrift: </w:t>
       </w:r>
       <w:r>
         <w:rPr>
@@ -1107,7 +1107,7 @@
     </w:p>
     <w:p>
       <w:r>
-        <w:t>„Mrs. Claus.“ Neil blickte nicht von dem Glas auf. „Faszinierend, das alles. Ihr Mr. Hussein hat der Stadt einen echten Dienst erwiesen, ob die Stadt das nun weiß oder nicht.“ Er deutete mit einem Finger auf die Vitrine, ohne das Glas ganz zu berühren. „Ein kompletter, fortlaufender Schriftwechsel über den Haushalt. Wer eingestellt wurde, wer entlassen wurde, was gekauft, was verkauft wurde.“ Dann drehte er den Kopf, und das Lächeln erschien. „Was verloren ging.“</w:t>
+        <w:t xml:space="preserve">„Mrs. Claus.“ Neil blickte nicht von dem Glas auf. „Faszinierend, das alles. Ihr Mr. Hussein hat der Stadt einen echten Dienst erwiesen, ob die Stadt das nun weiß oder nicht. Sehen Sie hier.“ Er deutete mit einem Finger auf die Vitrine, ohne das Glas ganz zu berühren. „Ein kompletter, fortlaufender Schriftwechsel über den Haushalt. Wer eingestellt wurde, wer entlassen wurde, was gekauft, was verkauft wurde.“ Dann drehte er den Kopf, und das Lächeln erschien. „Was verloren ging.“</w:t>
       </w:r>
     </w:p>
     <w:p>
@@ -1122,7 +1122,7 @@
     </w:p>
     <w:p>
       <w:r>
-        <w:t>Das war schärfer formuliert, als ich es von ihm erwartet hatte, und es traf den Nagel auf den Kopf, und ich hegte diesen Gedanken weiter. Neil Carter hatte sich darüber viel mehr Gedanken gemacht, als er durchblicken ließ.</w:t>
+        <w:t xml:space="preserve">Das war schärfer formuliert, als ich es von ihm erwartet hatte, und es traf den Nagel auf den Kopf, und ich merkte es mir. Neil Carter hatte sich darüber viel mehr Gedanken gemacht, als er durchblicken ließ.</w:t>
       </w:r>
     </w:p>
     <w:p>
@@ -1192,12 +1192,12 @@
     </w:p>
     <w:p>
       <w:r>
-        <w:t>Aber ich steckte es trotzdem in meine Manteltasche, direkt neben den Brief. Ich richtete mich auf und warf noch einen letzten Blick durch den warmen, vollen Raum. Auf Theo, der nun in die Hocke gegangen am Apfelweintisch saß und einem kleinen Jungen mit ganzem, müden Herzen von der Gründung der Stadt erzählte, während die Augen des Jungen groß wurden. Auf Vera am Schreibtisch, die den Karton mit den Papieren noch einmal um einen Viertelzoll zurechtrückte. Auf Neil Carter an der Vitrine, der etwas in sein Notizbuch schrieb. Und auf den Stapel cremefarbenen Papiers neben Veras Ellenbogen, der das Licht fing.</w:t>
-      </w:r>
-    </w:p>
-    <w:p>
-      <w:r>
-        <w:t>Die Briefe waren hier gewesen. Das Papier war hier gewesen.</w:t>
+        <w:t xml:space="preserve">Aber ich steckte es trotzdem in meine Manteltasche, direkt neben den Brief. Ich richtete mich auf und warf noch einen letzten Blick durch den warmen, vollen Raum. Auf Theo, der nun in die Hocke gegangen am Apfelweintisch saß und einem kleinen Jungen mit ganzem, müdem Herzen von der Gründung der Stadt erzählte, während die Augen des Jungen groß wurden. Auf Vera am Schreibtisch, die den Karton mit den Papieren noch einmal um einen halben Zentimeter zurechtrückte. Auf Neil Carter an der Vitrine, der etwas in sein Notizbuch schrieb. Und auf den Stapel cremefarbenen Papiers neben Veras Ellenbogen, der das Licht fing.</w:t>
+      </w:r>
+    </w:p>
+    <w:p>
+      <w:r>
+        <w:t xml:space="preserve">Die Briefe waren hier gewesen. Das Papier war hier.</w:t>
       </w:r>
     </w:p>
     <w:p>
@@ -1212,7 +1212,7 @@
     </w:p>
     <w:p>
       <w:r>
-        <w:t>Yarn Tales lag an der Ecke von Evergreen und Maple, und sein Schaufenster war voller Wollstränge, die nach Farben gestapelt waren wie ein geöffneter Farbkasten. Drinnen war es warm und schummrig. Es roch nach Wolle und nach der Kamille, die Olivia immer auf der kleinen Heizplatte hinter der Theke ziehen ließ. Die Strickrunde hatte an diesem Nachmittag ihre Stühle weit nach vorn gezogen, in das wässrige Oktoberlicht aus dem Fenster, und sie waren alle da. Olivia saß natürlich mittenminder, denn es war ihr Laden, ihre Kamille und irgendwie immer ihre Gesprächsführung; Dot saß neben ihr, stämmig und grau, trocken wie Zwieback; Claire mit ihrer schnellen Reporterauffassungsgabe, die den anderen schon drei Reihen voraus war; Ivy, die über Witze lachte, bevor sie überhaupt richtig fertig waren; Martha, aufrecht im guten Sessel mit übergeschlagenen Fußgelenken; und Ellie, die sanfte Ellie, die über einer fallen gelassenen Masche die Stirn in Falten legte.</w:t>
+        <w:t xml:space="preserve">Yarn Tales lag an der Ecke von Evergreen und Maple, und sein Schaufenster war voller Wollstränge, die nach Farben gestapelt waren wie ein geöffneter Farbkasten. Drinnen war es warm und schummrig. Es roch nach Wolle und nach der Kamille, die Olivia immer auf der kleinen Heizplatte hinter der Theke ziehen ließ. Die Strickrunde hatte an diesem Nachmittag ihre Stühle weit nach vorn gezogen, in das wässrige Oktoberlicht aus dem Fenster, und sie waren alle da. Olivia saß natürlich mittendrin, denn es war ihr Laden, ihre Kamille und irgendwie immer ihre Gesprächsführung; Dot saß neben ihr, stämmig und grau, trocken wie Zwieback; Claire mit ihrer schnellen Reporterauffassungsgabe, die den anderen schon drei Reihen voraus war; Ivy, die über Witze lachte, bevor sie überhaupt richtig fertig waren; Martha, aufrecht im guten Sessel mit übergeschlagenen Fußgelenken; und Ellie, die sanfte Ellie, die über einer fallen gelassenen Masche die Stirn in Falten legte.</w:t>
       </w:r>
     </w:p>
     <w:p>
@@ -1227,7 +1227,7 @@
     </w:p>
     <w:p>
       <w:r>
-        <w:t>Sie waren bei den Festsocken, den Socken mit eingestricktem Namen, die die Strickrunde jedes Jahr für die Schulkinder strickte – jedes Paar in den Schulfarben gearbeitet mit dem Namen des Kindes über dem Bund, damit nie eine Socke mit dem falschen Kind nach Hause ging. Claire hielt eine halbefertige in der Farbe von Tannengrün hoch und drehte sie ins Licht.</w:t>
+        <w:t xml:space="preserve">Sie waren bei den Festfäustlingen, den Fäustlingen mit eingestricktem Namen, die die Strickrunde jedes Jahr für die Schulkinder strickte – jedes Paar in den Schulfarben gearbeitet mit dem Namen des Kindes über dem Bund, damit nie ein Fäustling mit dem falschen Kind nach Hause ging. Claire hielt einen halbfertigen in der Farbe von Tannengrün hoch und drehte ihn ins Licht.</w:t>
       </w:r>
     </w:p>
     <w:p>
@@ -1247,7 +1247,7 @@
     </w:p>
     <w:p>
       <w:r>
-        <w:t>„Du strickst wie eine Arbeiterin im Akkord.“</w:t>
+        <w:t xml:space="preserve">„Du strickst wie eine, die nach Stunden bezahlt wird.“</w:t>
       </w:r>
     </w:p>
     <w:p>
@@ -1272,7 +1272,7 @@
     </w:p>
     <w:p>
       <w:r>
-        <w:t>„Ich war gestern bei der Ausstellung“, sagte Olivia. „Es ist wirklich wunderschön, all die alten Briefe. Aber oje, dieser arme Mann. Hast du ihn gesehen, Jessica? Er sieht aus wie vom Winde verweht.“</w:t>
+        <w:t xml:space="preserve">„Ich war gestern bei der Ausstellung“, sagte Olivia. „Es ist wirklich wunderschön, all die alten Briefe. Aber oje, dieser arme Mann. Hast du ihn gesehen, Jessica? Er sieht aus wie durch den Wolf gedreht.“</w:t>
       </w:r>
     </w:p>
     <w:p>
@@ -1287,7 +1287,7 @@
     </w:p>
     <w:p>
       <w:r>
-        <w:t>„Es ist nicht die Ausstellung.“ Martha legte ihre Nadeln in den Schoß. „Es ist das Geld. Die Gesellschaft ist pleite, Jessica. Völlig pleite. Theo hat es mir selbst anvertraut, im vergangenen Frühjahr, bevor er aufhörte, es überhaupt noch jemandem einzugestehen. Sie haben kein nennenswertes Stiftungskapital. Das hatten sie noch nie. Sie sind mit einem kleinen Zuschuss der Stadt und allem, was sie beim Sommerfest eingenommen haben, über die Runden gekommen, bis die Stadt den Zuschuss vor zwei Haushalten gekürzt hat. Das Dach über den Hinterzimmern lässt jedes Mal Wasser durch, wenn es regnet. Der Heizkessel ist älter als ich. Und er hat sich bei jedem Fonds und jeder Stiftung in drei Bundesstaaten beworben.“ Sie schüttelte langsam den Kopf. „Abgelehnt. Abgelehnt. Abgelehnt. Ich habe die Briefe kommen sehen. Einmal hat er mir einen gezeigt, und dann hat er aufgehört, sie mir zu zeigen.“</w:t>
+        <w:t xml:space="preserve">„Es ist nicht die Ausstellung.“ Martha legte ihre Nadeln in den Schoß. „Es ist das Geld. Der Verein ist pleite, Jessica. Völlig pleite. Theo hat es mir selbst anvertraut, im vergangenen Frühjahr, bevor er aufhörte, es überhaupt noch jemandem einzugestehen. Sie haben kein nennenswertes Stiftungskapital. Das hatten sie noch nie. Sie sind mit einem kleinen Zuschuss der Stadt und allem, was sie beim Sommerfest eingenommen haben, über die Runden gekommen, bis die Stadt den Zuschuss vor zwei Haushalten gekürzt hat. Das Dach über den Hinterzimmern lässt jedes Mal Wasser durch, wenn es regnet. Der Heizkessel ist älter als ich. Und er hat sich bei jedem Fonds und jeder Stiftung in drei Bundesstaaten beworben.“ Sie schüttelte langsam den Kopf. „Abgelehnt. Abgelehnt. Abgelehnt. Ich habe die Briefe kommen sehen. Einmal hat er mir einen gezeigt, und dann hat er aufgehört, sie mir zu zeigen.“</w:t>
       </w:r>
     </w:p>
     <w:p>
@@ -1317,12 +1317,12 @@
     </w:p>
     <w:p>
       <w:r>
-        <w:t>Wenn man das Geheimnis aus den Papieren kennt, weiß man, wo man suchen muss, hatte Nick gesagt. Nicht wer. Sehr viele Leute in Frost Falls taten Theo leid. Die halbe Stadt hätte geweint, wenn sie erfahren hätte, wie schlimm es um ihn stand. Mitleid mit einem Mann zu haben, selbst wenn man der verzweifeltste Mann der Stadt ist, ist eben nicht dasselbe wie einen Freund um Geld zu erpressen, und ich war nicht bereit, das eine in meinem Kopf mit dem anderen verschwimmen zu lassen, ohne mehr in der Hand zu haben als Rechenexempel und ein schlechtes Gefühl. Also strickte ich weiter, ließ die Faust offen und trug den Verdacht leicht, wie eine glühende Kohle, bereit, sie fallen zu lassen.</w:t>
-      </w:r>
-    </w:p>
-    <w:p>
-      <w:r>
-        <w:t>„Sie halten eine Sitzung ab“, sagte Claire. „Der Vorstand. Am Montag. Um zu entscheiden, ob sie die Türen über das Neujahr hinaus überhaupt noch offen halten können. Theo hat die Gazette gebeten, jemanden zu schicken. Ich glaube, er hofft, dass eine traurige Geschichte genügt, um irgendwo ein paar Gelder locker zu machen.“</w:t>
+        <w:t xml:space="preserve">Zu wissen, dass das Geheimnis aus den Papieren stammt, zeigt einem, wo man stehen muss, hatte Nick gesagt. Nicht wer. Theo tat sehr vielen Leuten in Frost Falls leid. Die halbe Stadt hätte geweint, wenn sie erfahren hätte, wie schlimm es um ihn stand. Mitleid mit einem Mann zu haben, selbst wenn man der verzweifeltste Mann der Stadt ist, ist eben nicht dasselbe wie einen Freund um Geld zu erpressen, und ich war nicht bereit, das eine in meinem Kopf mit dem anderen verschwimmen zu lassen, ohne mehr in der Hand zu haben als Rechenexempel und ein schlechtes Gefühl. Also strickte ich weiter, ließ die Faust offen und trug den Verdacht leicht, wie eine glühende Kohle, bereit, sie fallen zu lassen.</w:t>
+      </w:r>
+    </w:p>
+    <w:p>
+      <w:r>
+        <w:t xml:space="preserve">„Sie halten eine Sitzung ab“, sagte Claire. „Der Vorstand. Am Montag. Um zu entscheiden, ob sie die Türen über Neujahr hinaus überhaupt noch offen halten können. Theo hat die Gazette gebeten, jemanden zu schicken. Ich glaube, er hofft, dass eine traurige Geschichte genügt, um irgendwo ein paar Gelder locker zu machen.“</w:t>
       </w:r>
     </w:p>
     <w:p>
@@ -1337,7 +1337,7 @@
     </w:p>
     <w:p>
       <w:r>
-        <w:t>Das Gespräch wandte sich danach anderen Dingen zu: den Socken, dem neuen Baby von Ivys Tochter und der Frage, ob ein Schnee am ersten Oktober einen harten oder einen milden Winter bedeutete, was jedoch niemand klärte. Ich ließ das Gespräch weiterlaufen. Neben mir war Martha bei ihrer Arbeit still geworden. Nach einer Weile neigte sie sich ein wenig zu mir herüber und sagte leise, nur für uns beide: „Und wie geht es unserer Fiona? Ich habe gehört, sie ist nicht sie selbst.“</w:t>
+        <w:t xml:space="preserve">Das Gespräch wandte sich danach anderen Dingen zu: den Fäustlingen, dem neuen Baby von Ivys Tochter und der Frage, ob ein erster Schnee im Oktober einen harten oder einen milden Winter bedeutete, was jedoch niemand klärte. Ich ließ das Gespräch weiterlaufen. Neben mir war Martha bei ihrer Arbeit still geworden. Nach einer Weile neigte sie sich ein wenig zu mir herüber und sagte leise, nur für uns beide: „Und wie geht es unserer Fiona? Ich habe gehört, sie ist nicht sie selbst.“</w:t>
       </w:r>
     </w:p>
     <w:p>
@@ -1372,7 +1372,7 @@
     </w:p>
     <w:p>
       <w:r>
-        <w:t>„Sieh zu, dass du das tust.“ Und sie wandte sich wieder ihrer Socke zu, als hätte sie mir gerade überhaupt nichts Wichtiges mit auf den Weg gegeben.</w:t>
+        <w:t xml:space="preserve">„Sieh zu, dass du das tust.“ Und sie wandte sich wieder ihrem Fäustling zu, als hätte sie mir gerade überhaupt nichts Wichtiges mit auf den Weg gegeben.</w:t>
       </w:r>
     </w:p>
     <w:p>
@@ -1407,7 +1407,7 @@
     </w:p>
     <w:p>
       <w:r>
-        <w:t>Das Fest fand auf dem Anger statt, dem großen Gemeindegelände südlich des Evergreen-Viertels, das sich vom Platz aus erstreckte, mit dem Kriegerdenkmal am oberen Ende und der großen Ulme am weit entfernten Ende. Die ganze Stadt war auf den Beinen, um den Platz herzurichten. Es gab Biertische, die hinausgetragen und in Reihen aufgestellt werden mussten, eine Bühne, die am nördlichen Ende aufgebaut werden sollte, und schätzungsweise tausend kleine Zierkürbisse, die so arrangiert werden mussten, dass es vollkommen ungezwungen aussah. Tatsächlich würde ein Komitee eine volle Stunde lang daran herumfummeln. Ich war nur gekommen, um das erste Dutzend Fäustlinge des Strickkreises beim Festkomitee abzugeben, und keine neunzig Sekunden nach meiner Ankunft hatte mir ein Mann, den ich nicht kannte, eine Kiste mit Backkürbissen in die Hand gedrückt und gesagt: „Würden Sie die da vorne an der Bühne verteilen? Passen Sie auf den weichen auf.“ So lief das eben in dieser Stadt, und es machte mir gar nichts aus. Mit einer Kiste Kürbisse im Arm gab es nichts zu grübeln, und das kam mir gerade recht.</w:t>
+        <w:t xml:space="preserve">Das Fest fand auf dem Anger statt, dem großen Gemeindegelände südlich der Evergreen Avenue, das sich vom Platz aus erstreckte, mit dem Kriegerdenkmal am oberen Ende und der großen Ulme am weit entfernten Ende. Die ganze Stadt war auf den Beinen, um den Platz herzurichten. Es gab Biertische, die hinausgetragen und in Reihen aufgestellt werden mussten, eine Bühne, die am nördlichen Ende aufgebaut werden sollte, und schätzungsweise tausend kleine Zierkürbisse, die so arrangiert werden mussten, dass es vollkommen ungezwungen aussah. Tatsächlich würde ein Komitee eine volle Stunde lang daran herumfummeln. Ich war nur gekommen, um das erste Dutzend Fäustlinge des Strickkreises beim Festkomitee abzugeben, und keine neunzig Sekunden nach meiner Ankunft hatte mir ein Mann, den ich nicht kannte, eine Kiste mit Backkürbissen in die Hand gedrückt und gesagt: „Würden Sie die da vorne an der Bühne verteilen? Passen Sie auf den weichen auf.“ So lief das eben in dieser Stadt, und es machte mir gar nichts aus. Mit einer Kiste Kürbisse im Arm gab es nichts zu grübeln, und das kam mir gerade recht.</w:t>
       </w:r>
     </w:p>
     <w:p>
@@ -1432,7 +1432,7 @@
     </w:p>
     <w:p>
       <w:r>
-        <w:t>Es brach hell und überrascht aus ihr hervor, ein echtes Lachen, von jener Sorte, die einem Kind entschlüpft, bevor es sich überhaupt entscheiden konnte, ob es das zulassen will, und es tat mir besser als eine ganze Woche Schlaf, denn nach dem Tod ihrer Mutter hatte es eine lange Phase gegeben, in der Emma Redfern überhaupt nicht gelacht hatte. Sarah Redferns Krankheit hatte fast ein Jahr gedauert, und danach war Emma durch eine Stadt getrieben, die nicht recht wusste, wie sie sie erreichen sollte, wie ein kleines graues Geistermädchen. Sie hatte sich Anfang des Monats Marthas kleinen Hund geschnorgt, sich ihn genommen, ihn versteckt und behalten, angetrieben von einer Trauer, die viel zu groß war, um in ein achtjähriges Mädchen hineinzupassen. Die ganze Stadt war damals ausgeschwärmt, um nach ihnen zu suchen. Schließlich hatte ich sie beide gefunden, das Mädchen und den Hund zusammen an einer alten Scheune, und dieses Finden war der Anfang davon gewesen, dass Emma zu sich selbst zurückgefunden hatte. Mittlerweile ging sie drei Nachmittage in der Woche mit dem Hund Gassi, eine Abmachung, die Martha frei erfunden hatte, um einem einsamen Kind einen Grund zum Aufstehen und ein warmes Wesen zu geben, für das es Verantwortung tragen konnte, und es hatte funktioniert, auf Umwegen, ohne dass je jemand laut ausgesprochen hätte, wofür das eigentlich gut war.</w:t>
+        <w:t xml:space="preserve">Es brach hell und überrascht aus ihr hervor, ein echtes Lachen, von jener Sorte, die einem Kind entschlüpft, bevor es sich überhaupt entscheiden konnte, ob es das zulassen will, und es tat mir besser als eine ganze Woche Schlaf, denn nach dem Tod ihrer Mutter hatte es eine lange Phase gegeben, in der Emma Redfern überhaupt nicht gelacht hatte. Sarah Redferns Krankheit hatte fast ein Jahr gedauert, und danach war Emma durch eine Stadt getrieben, die nicht recht wusste, wie sie sie erreichen sollte, wie ein kleines graues Geistermädchen. Sie hatte sich Anfang des Monats Marthas kleinen Hund geschnappt, sich ihn genommen, ihn versteckt und behalten, angetrieben von einer Trauer, die viel zu groß war, um in ein achtjähriges Mädchen hineinzupassen. Die ganze Stadt war damals ausgeschwärmt, um nach ihnen zu suchen. Schließlich hatte ich sie beide gefunden, das Mädchen und den Hund zusammen an einer alten Scheune, und dieses Finden war der Anfang davon gewesen, dass Emma zu sich selbst zurückgefunden hatte. Mittlerweile ging sie drei Nachmittage in der Woche mit dem Hund Gassi, eine Abmachung, die Martha frei erfunden hatte, um einem einsamen Kind einen Grund zum Aufstehen und ein warmes Wesen zu geben, für das es Verantwortung tragen konnte, und es hatte funktioniert, auf Umwegen, ohne dass je jemand laut ausgesprochen hätte, wofür das eigentlich gut war.</w:t>
       </w:r>
     </w:p>
     <w:p>
@@ -1457,12 +1457,12 @@
     </w:p>
     <w:p>
       <w:r>
-        <w:t>„Sie löchert mich schon seit einer Woche und will wissen, ob the penguin auch zum Fest kommt“, sagte er. „Ich glaube, was Emma betrifft, ist Pip das eigentliche Fest. Der Rest ist nur das Drumherum, das eben stattfinden muss, damit sich der Pinguin blicken lassen kann.“</w:t>
-      </w:r>
-    </w:p>
-    <w:p>
-      <w:r>
-        <w:t>„Da würde Pip ihr vollkommen zustimmen“, sagte ich. „Sie erwartet eine Bühne und einen Scheinwerfer. Ermutigen Sie sie bloß nicht.“</w:t>
+        <w:t xml:space="preserve">„Sie löchert mich schon seit einer Woche und will wissen, ob der Pinguin auch zum Fest kommt“, sagte er. „Ich glaube, was Emma betrifft, ist Pip das eigentliche Fest. Der Rest ist nur das Drumherum, das eben stattfinden muss, damit sich der Pinguin blicken lassen kann.“</w:t>
+      </w:r>
+    </w:p>
+    <w:p>
+      <w:r>
+        <w:t xml:space="preserve">„Da würde Pip ihr vollkommen zustimmen“, sagte ich. „Sie erwartet eine Bühne und einen Scheinwerfer. Ermutige sie bloß nicht.“</w:t>
       </w:r>
     </w:p>
     <w:p>
@@ -1487,7 +1487,7 @@
     </w:p>
     <w:p>
       <w:r>
-        <w:t>„Besser.“ Er sagte es mit Bedacht, wie ein Mann, der sich auf ein Eis wagt, dessen Tragkraft er noch nicht einschätzen kann. „Es geht. Mittlerweile gibt es ganze Stunden, in denen ich es vergesse, und dann fällt es mir wieder ein, aber dieses Erinnern wirft mich nicht mehr um. Es läuft einfach ein Stück weit neben mir her und flaut dann wieder ab.“ Er setzte sein Ende einer Bank ab. „Es war die Stadt, die das bewirkt hat. Ich versuche ständig herauszufinden, wie man einer ganzen Stadt dafür danken soll, aber es gibt schlicht keinen Weg. Die Leute sind einfach immer weiter aufgetaucht. Aufläufe. Irgendjemand nahm Emma für einen Nachmittag zu sich. Martha und dieser Hund. Sie und dieser lässige Vogel. Niemand hat irgendwas repariert. Niemand konnte das. Sie sind einfach so lange aufgetaucht, bis dieses Auftauchen wieder ein Leben war, und eines Tages sah ich mich um und stellte fest, dass wir es tatsächlich lebten.“</w:t>
+        <w:t xml:space="preserve">„Besser.“ Er sagte es mit Bedacht, wie ein Mann, der sich auf ein Eis wagt, dessen Tragkraft er noch nicht einschätzen kann. „Es geht uns besser. Mittlerweile gibt es ganze Stunden, in denen ich es vergesse, und dann fällt es mir wieder ein, aber dieses Erinnern wirft mich nicht mehr um. Es läuft einfach ein Stück weit neben mir her und flaut dann wieder ab.“ Er setzte sein Ende einer Bank ab. „Es war die Stadt, die das bewirkt hat. Ich versuche ständig herauszufinden, wie man einer ganzen Stadt dafür danken soll, aber es gibt schlicht keinen Weg. Die Leute sind einfach immer weiter aufgetaucht. Aufläufe. Irgendjemand nahm Emma für einen Nachmittag zu sich. Martha und dieser Hund. Sie und dieser lächerliche Vogel. Niemand hat irgendwas repariert. Niemand konnte das. Sie sind einfach so lange aufgetaucht, bis dieses Auftauchen wieder ein Leben war, und eines Tages sah ich mich um und stellte fest, dass wir es tatsächlich lebten.“</w:t>
       </w:r>
     </w:p>
     <w:p>
@@ -1577,7 +1577,7 @@
     </w:p>
     <w:p>
       <w:r>
-        <w:t>Dann richtete ich mich auf. In meinem Mantel steckte nach wie vor ein Erpresserbrief, eine Vorstandssitzung stand bevor, und ein erschöpfter Mann saß da zwischen seinen Umzugskartons.</w:t>
+        <w:t xml:space="preserve">Dann richtete ich mich auf. In meinem Mantel steckte nach wie vor ein Erpresserbrief, eine Vorstandssitzung stand bevor, und ein erschöpfter Mann saß da zwischen seinen Kisten.</w:t>
       </w:r>
     </w:p>
     <w:p>
@@ -1587,12 +1587,12 @@
     </w:p>
     <w:p>
       <w:r>
-        <w:t>„Morgen um dieselbe Zeit“, sagte ich. „Wegen Pip. Achten Sie nur darauf, dass sie nicht den Rest des Fests auseinanderbricht.“</w:t>
-      </w:r>
-    </w:p>
-    <w:p>
-      <w:r>
-        <w:t>Und ich klaubte meinen schamfreien, kürbisbäuchigen Vogel auf und machte mich in der heraufziehenden Kälte auf den Heimweg.</w:t>
+        <w:t xml:space="preserve">„Morgen um dieselbe Zeit“, sagte ich. „Wegen Pip. Achte nur darauf, dass sie nicht den Rest des Fests auseinanderbricht.“</w:t>
+      </w:r>
+    </w:p>
+    <w:p>
+      <w:r>
+        <w:t xml:space="preserve">Und ich klaubte meinen schamlosen, kürbisverschmierten Vogel auf und machte mich in der heraufziehenden Kälte auf den Heimweg.</w:t>
       </w:r>
     </w:p>
     <w:p>
@@ -1628,7 +1628,7 @@
     </w:p>
     <w:p>
       <w:r>
-        <w:t>„Ich muss ständig an sie denken“, sagte sie nach einer Weile und legte den Löffel hin. „Constance. Früher habe ich das nie getan. Sie war nur anonymer Name an einer Wand, ein ernstes Gesicht im Bilderrahmen. Und jetzt muss ich an nichts anderes mehr denken. An dieses Mädchen, an das, was sie getan hat, und was das hundert Jahre später aus mir gemacht hat.“ Sie lachte kurz und freudlos. „Komisch, nicht wahr. Ich habe mein ganzes Leben in ihrem Haus verbracht und nie versucht, sie kennenzulernen. Komm und sieh es dir an. Ich möchte dir etwas zeigen.“</w:t>
+        <w:t xml:space="preserve">„Ich muss ständig an sie denken“, sagte sie nach einer Weile und legte den Löffel hin. „Constance. Früher habe ich das nie getan. Sie war nur ein Name an einer Wand, ein ernstes Gesicht im Bilderrahmen. Und jetzt muss ich an nichts anderes mehr denken. An dieses Mädchen, an das, was sie getan hat, und was das hundert Jahre später aus mir gemacht hat.“ Sie lachte kurz und freudlos. „Komisch, nicht wahr. Ich habe mein ganzes Leben in ihrem Haus verbracht und nie versucht, sie kennenzulernen. Komm und sieh es dir an. Ich möchte dir etwas zeigen.“</w:t>
       </w:r>
     </w:p>
     <w:p>
@@ -1648,7 +1648,7 @@
     </w:p>
     <w:p>
       <w:r>
-        <w:t>„Sie hat den Gasthof vierzig Jahre lang geführt“, fuhr Fiona fort. „Wusstest du das? Vierzig Jahre lang. Meine Urgroßmutter. Sie hat spät geheiratet, meine Großmutter spät bekommen, und die ganze Zeit über hat sie dieses Haus geleitet und jede Seele gefüttert, die frierend hereinkam. Es gibt eine Geschichte, die meine Großmutter erzählte: In einem besonders schlimmen Grippewinter nahm Constance drei Familien auf, die nirgendwo hinwussten. Sie ernährte sie aus ihrer Speisekammer bis zum Frühling, verlangte nie einen Cent und sprach nie darüber. Das ist die Frau, die sie geworden ist. Das ist es, was sie auf das aufbaute, was sie damals getan hatte.“ Fionas Stimme wurde rauchig. „Und ich habe mich so geschämt für sie. So viel Angst vor ihr gehabt. Dabei ist die Wahrheit, dass sie der mutigste Mensch ist, mit dem ich verwandt bin, und dass sie all das hier, all diese Wärme, aus einem einzigen grausamen, verzweifelten Winter erschaffen hat, und ich darf darin leben, und das Schlimmste, was ich je tun musste, ist Stühle zu zählen.“</w:t>
+        <w:t xml:space="preserve">„Sie hat den Gasthof vierzig Jahre lang geführt“, fuhr Fiona fort. „Wusstest du das? Vierzig Jahre lang. Meine Urgroßmutter. Sie hat spät geheiratet, meine Großmutter spät bekommen, und die ganze Zeit über hat sie dieses Haus geleitet und jede Seele gefüttert, die frierend hereinkam. Es gibt eine Geschichte, die meine Großmutter erzählte: In einem besonders schlimmen Grippewinter nahm Constance drei Familien auf, die nirgendwo hinwussten. Sie ernährte sie aus ihrer Speisekammer bis zum Frühling, verlangte nie einen Cent und sprach nie darüber. Das ist die Frau, die sie geworden ist. Das ist es, was sie auf das aufbaute, was sie damals getan hatte.“ Fionas Stimme wurde belegt. „Und ich habe mich so geschämt für sie. So viel Angst vor ihr gehabt. Dabei ist die Wahrheit, dass sie der mutigste Mensch ist, mit dem ich verwandt bin, und dass sie all das hier, all diese Wärme, aus einem einzigen grausamen, verzweifelten Winter erschaffen hat, und ich darf darin leben, und das Schlimmste, was ich je tun musste, ist Stühle zu zählen.“</w:t>
       </w:r>
     </w:p>
     <w:p>
@@ -1658,7 +1658,7 @@
     </w:p>
     <w:p>
       <w:r>
-        <w:t>„Du bist mutiger, als du denkst“, sagte ich schließlich. „Du hast ihr Geheimnis all die Jahre lang ganz allein getragen und nie zugelassen, dass es dein Herz erstarren lässt. Der Gasthof ist noch immer warm, Fiona. Nach hundert Jahren, einer verschlossenen Truhe und einem Erpresserbrief ist er nach wie vor das wärmste Haus in der ganzen Stadt. Das ist kein Nichts. Das ist der Inbegriff dessen, was sie aufgebaut hat, von dir am Leben erhalten.“</w:t>
+        <w:t xml:space="preserve">„Du bist mutiger, als du denkst“, sagte ich schließlich. „Du hast ihr Geheimnis all die Jahre lang ganz allein getragen und nie zugelassen, dass es dein Herz erstarren lässt. Der Gasthof ist noch immer warm, Fiona. Nach hundert Jahren, einem verschlossenen Koffer und einem Erpresserbrief ist er nach wie vor das wärmste Haus in der ganzen Stadt. Das ist kein Nichts. Das ist der Inbegriff dessen, was sie aufgebaut hat, von dir am Leben erhalten.“</w:t>
       </w:r>
     </w:p>
     <w:p>
@@ -1683,12 +1683,12 @@
     </w:p>
     <w:p>
       <w:r>
-        <w:t>Das entlockte ihr ein echtes Lachen, das tiefe Lachen, das mit einem Mal aus ihr herausbricht, jenes Lachen, das mir gefehlt hatte, und es tat mir beim Zuhören ebenso gut wie der Suppe bei ihr. Wir gingen gemeinsam wieder zu den Stühlen zurück. Ich zählte, während sie die wackligen reparierte, und Pip beaufsichtigte das Ganze von ihrem warmen Sonnenfleck aus. Eine Stunde lang war der Gasthof wieder einfach nur ein Gasthof, warm und geschäftig, der sich auf ein Fest vorbereitete. Was immer sonst noch geschah, das hier war es wert, beschützt zu werden: die Wärme, die ein verängstigtes Mädchen aus dem Nichts erschaffen und ein Jahrhundert lang an eine andere Frau weitergereicht hatte, die Stühle zählte.</w:t>
-      </w:r>
-    </w:p>
-    <w:p>
-      <w:r>
-        <w:t>Pip und ich gingen in der Dämmerung nach Hause, und mir war verdammt klar geworden, wofür genau ich eigentlich kämpfte.</w:t>
+        <w:t xml:space="preserve">Das entlockte ihr ein echtes Lachen, das tiefe Lachen, das mit einem Mal aus ihr herausbricht, jenes Lachen, das mir gefehlt hatte, und es tat mir beim Zuhören ebenso gut wie ihr die Suppe. Wir gingen gemeinsam wieder zu den Stühlen zurück. Ich zählte, während sie die wackligen reparierte, und Pip beaufsichtigte das Ganze von ihrem warmen Sonnenfleck aus. Eine Stunde lang war der Gasthof wieder einfach nur ein Gasthof, warm und geschäftig, der sich auf ein Fest vorbereitete. Was immer sonst noch geschah, das hier war es wert, beschützt zu werden: die Wärme, die ein verängstigtes Mädchen aus dem Nichts erschaffen und ein Jahrhundert lang an eine andere Frau weitergereicht hatte, die Stühle zählte.</w:t>
+      </w:r>
+    </w:p>
+    <w:p>
+      <w:r>
+        <w:t xml:space="preserve">Pip und ich gingen in der Dämmerung nach Hause, und mir war um einiges klarer geworden, wofür genau ich eigentlich kämpfte.</w:t>
       </w:r>
     </w:p>
     <w:p>
@@ -1708,7 +1708,7 @@
     </w:p>
     <w:p>
       <w:r>
-        <w:t>Sam Patel stand am Amboss. Er hielt einen flachen Eisenstern in seiner Zange, dessen eine Spitze in der Mitte orange glühte, und bearbeitete ihn mit kurzen, gleichmäßigen Schlägen, wobei er ihn zwischen jedem Schlag um ein paar Grade drehte. Er sah mich zunächst nicht, und ich drängte ihn nicht. Pip watschelte an den Rand des warmen Kreises, den das Feuer warf, und blieb dort stehen, ein vernünftiger Vogel, und setzte sich hin, um das orangefarbene Licht mit geneigtem Kopf zu beobachten.</w:t>
+        <w:t xml:space="preserve">Sam Patel stand am Amboss. Er hielt einen flachen Eisenstern in seiner Zange, dessen eine Spitze in der Mitte orange glühte, und bearbeitete ihn mit kurzen, gleichmäßigen Schlägen, wobei er ihn zwischen jedem Schlag um ein paar Grad drehte. Er sah mich zunächst nicht, und ich drängte ihn nicht. Pip watschelte an den Rand des warmen Kreises, den das Feuer warf, und blieb dort stehen, ein vernünftiger Vogel, und setzte sich hin, um das orangefarbene Licht mit geneigtem Kopf zu beobachten.</w:t>
       </w:r>
     </w:p>
     <w:p>
@@ -1733,17 +1733,17 @@
     </w:p>
     <w:p>
       <w:r>
-        <w:t>Und während ich ihn bewunderte, atmete ich den Geruch der Schmiede ein, und da war er, unverkennbar, genau der Geruch, der an einem Bogen cremefarbenem Papier haftete, welcher in meinem Mantel gefaltet lag. Er war auf dem Zettel, und er war hier. Und ich zwang mich, langsam vorzugehen, zwang mich, die Kohle in meiner offenen Hand zu halten und die Faust nicht darum zu schließen, denn ein Geruch ist kein Geständnis. Sam Patel war nach allen Berichten zehn Jahre lang nichts als anständig zu dieser ganzen Stadt gewesen, und ich war gekommen, um nachzusehen, nicht um zu urteilen.</w:t>
-      </w:r>
-    </w:p>
-    <w:p>
-      <w:r>
-        <w:t>„Sie haben das Gasthaus gemacht“, sagte ich unbefangen, während ich den Leuchter drehte. „All diese Eisenarbeiten in Fionas Empfangsbereich. Die Sterne auf dem Kaminsims, die Lampenhalter, den Funkenschirm.“</w:t>
-      </w:r>
-    </w:p>
-    <w:p>
-      <w:r>
-        <w:t>„Alles davon.“ Seine Kiefer spannten sich an, und er nahm einen Lappen zur Hand und begann damit über eine Zange zu wischen, die bereits sauber war. „Nicht, dass ich auch nur einen Cent vom Rest gesehen hätte.“ Er sah mich nicht an. „Zwanzig Dollar schuldet sie mir. Ich weiß, wie das klingt. Ein erwachsener Mann, der sich wegen zwanzig Dollar aufregt wie ein Kind, das sein Taschengeld bekommt. Es geht nicht um das Geld.“</w:t>
+        <w:t xml:space="preserve">Und während ich ihn bewunderte, atmete ich den Geruch der Schmiede ein, und da war er, unverkennbar, genau der Geruch, der an einem Bogen cremefarbenen Papiers haftete, der in meinem Mantel gefaltet lag. Er war auf dem Zettel, und er war hier. Und ich zwang mich, langsam vorzugehen, zwang mich, die Kohle in meiner offenen Hand zu halten und die Faust nicht darum zu schließen, denn ein Geruch ist kein Geständnis. Sam Patel war nach allen Berichten zehn Jahre lang nichts als anständig zu dieser ganzen Stadt gewesen, und ich war gekommen, um nachzusehen, nicht um zu urteilen.</w:t>
+      </w:r>
+    </w:p>
+    <w:p>
+      <w:r>
+        <w:t xml:space="preserve">„Sie haben den Gasthof gemacht“, sagte ich unbefangen, während ich den Leuchter drehte. „All diese Eisenarbeiten in Fionas Empfangsbereich. Die Sterne auf dem Kaminsims, die Lampenhalter, den Funkenschirm.“</w:t>
+      </w:r>
+    </w:p>
+    <w:p>
+      <w:r>
+        <w:t xml:space="preserve">„Alles davon.“ Seine Kiefer spannten sich an, und er nahm einen Lappen zur Hand und begann damit über eine Zange zu wischen, die bereits sauber war. „Nicht, dass ich auch nur einen Cent vom Rest gesehen hätte.“ Er sah mich nicht an. „Zwanzig Dollar schuldet sie mir. Ich weiß, wie das klingt. Ein erwachsener Mann, der sich wegen zwanzig Dollar aufregt wie ein Kind, dem man sein Taschengeld schuldet. Es geht nicht um das Geld.“</w:t>
       </w:r>
     </w:p>
     <w:p>
@@ -1763,7 +1763,7 @@
     </w:p>
     <w:p>
       <w:r>
-        <w:t>Und doch war der Geruch hier, und der Geruch war auf dem Zettel. Ich konnte diese beiden wahren Dinge nicht einfach unwahr sein lassen, nur weil ich beschlossen hatte, dass mir the Mann sympathisch war.</w:t>
+        <w:t xml:space="preserve">Und doch war der Geruch hier, und der Geruch war auf dem Zettel. Ich konnte diese beiden wahren Dinge nicht einfach unwahr sein lassen, nur weil ich beschlossen hatte, dass mir der Mann sympathisch war.</w:t>
       </w:r>
     </w:p>
     <w:p>
@@ -1773,7 +1773,7 @@
     </w:p>
     <w:p>
       <w:r>
-        <w:t>„Alle sind jedes Jahr am Ende.“ Er legte schließlich den Lappen aus der Hand und sah mir direkt in die Augen. „Es macht mir nichts aus, wenn mir eine Freundin, die zu kämpfen hat, Geld schuldet, Mrs. Claus. Die ganze Stadt jongliert, das weiß so gut wie jeder andere, ich mache die Hälfte meiner Arbeit auf Vertrauen. Hätte sie einfach gesagt: Sam, es ist knapp, gib mir Zeit bis zum Frühling, hätte ich die Rechnung zerrissen und ihr gesagt, sie solle nicht mehr daran denken. Es ist dieses Nicht-Ansehen-Können, das ich nicht ertragen kann. Eine Frau, der es einfach an Bargeld mangelt, verhält sich nicht so. Sie schämt sich oder hat vor irgendetwas Angst, und das hat nichts mit meinen zwanzig Dollar zu tun, und ich komme nicht nah genug heran, um ihr zu helfen.“ Er breitete seine rußgeschwärzten Hände aus. „Ist sie in Schwierigkeiten? Echten Schwierigkeiten? Denn wenn das so ist, würde ich es viel lieber wissen und helfen, als hier draußen zu stehen und wegen Kleinigkeiten beleidigt zu sein wie ein kleiner Mensch.“</w:t>
+        <w:t xml:space="preserve">„Alle sind jedes Jahr am Ende.“ Er legte schließlich den Lappen aus der Hand und sah mir direkt in die Augen. „Es macht mir nichts aus, wenn mir eine Freundin, die zu kämpfen hat, Geld schuldet, Mrs. Claus. Die ganze Stadt jongliert, das weiß ich so gut wie jeder andere, ich mache die Hälfte meiner Arbeit auf Vertrauen. Hätte sie einfach gesagt: Sam, es ist knapp, gib mir Zeit bis zum Frühling, hätte ich die Rechnung zerrissen und ihr gesagt, sie solle nicht mehr daran denken. Es ist dieses Nicht-Ansehen-Können, das ich nicht ertragen kann. Eine Frau, der es einfach an Bargeld mangelt, verhält sich nicht so. Sie schämt sich oder hat vor irgendetwas Angst, und das hat nichts mit meinen zwanzig Dollar zu tun, und ich komme nicht nah genug heran, um ihr zu helfen.“ Er breitete seine rußgeschwärzten Hände aus. „Ist sie in Schwierigkeiten? Echten Schwierigkeiten? Denn wenn das so ist, würde ich es viel lieber wissen und helfen, als hier draußen zu stehen und wegen Kleinigkeiten beleidigt zu sein wie ein kleinlicher Mensch.“</w:t>
       </w:r>
     </w:p>
     <w:p>
@@ -1833,7 +1833,7 @@
     </w:p>
     <w:p>
       <w:r>
-        <w:t>Ich war in die Schmiede gekommen in dem halben Glauben, ich würde schnurstracks auf eine Antwort zustehen. Ich ging mit einer besseren Frage davon, während der Kohlegeruch in der Wolle meines Mantels hing, und mit einem wachsenden Verdacht, dass der Geruch auf dem Zettel verriet, wo er gewesen war.</w:t>
+        <w:t xml:space="preserve">Ich war in die Schmiede gekommen in dem halben Glauben, ich würde schnurstracks auf eine Antwort zusteuern. Ich ging mit einer besseren Frage davon, während der Kohlegeruch in der Wolle meines Mantels hing, und mit einem wachsenden Verdacht, dass der Geruch auf dem Zettel verriet, wo er gewesen war.</w:t>
       </w:r>
     </w:p>
     <w:p>
@@ -1855,13 +1855,13 @@
     <w:p/>
     <w:p>
       <w:r>
-        <w:t>Ich hatte vorgehabt, den Vormittag ruhig in der öffentlichen Bibliothek zu verbringen und mich über die Blackburns schlau zu lesen. Dort fand ich Neil bereits vor, eingerichtet an dem großen Eichentisch an den hohen Fenstern. Vor ihm lagen drei Archivkartons mit Stadtakten offen aufgeschlagen, und einen vierten trug gerade Mrs. Johnson herbei, die ihn mit der gequerten Sorgfalt absetzte, die eine Bibliothekarin an den Tag legt, wenn sie beschlossen hat, dass ein Besucher Ärger machen wird. In der einen Hand hielt er eine Lupe. Seine Lesebrille hatte er sich ins Haar geschoben, während seine normale Brille auf seiner Nase saß. Er blickte in der Sekunde auf, als ich durch die Tür trat, als hätte er auf eine Bekannte gewartet, und winkte mich herüber.</w:t>
-      </w:r>
-    </w:p>
-    <w:p/>
-    <w:p>
-      <w:r>
-        <w:t>„Mrs. Claus! Kommen Sie her und sehen Sie sich das an, das wird Ihnen gefallen.“ Er drehte ein sprödes Kassenbuch zu mir herum, als ich herantrat. „Einundneunzig. Die Blackburns haben die Hälfte des Geldes für die Kirche am Anger aufgebracht. Wussten Sie das? Die Hälfte. Großzügig, diese alten Herrschaften, wenn es ihnen in den Kram passte, gesehen zu werden.“ Er schüttelte den Kopf mit etwas, das wie echte Bewunderung wirkte. „Ich liebe eine Gründerfamilie. All dieser rohe, gierige Ehrgeiz in der ersten Generation, der in der dritten zu Ehrsamkeit gerinnt, und bis zur vierten haben sie vergessen, dass sie jemals irgendetwas an sich gerissen haben. Überall dieselbe Leier in jedem kleinen Nest, in das ich je einen Fuß gesetzt habe.“</w:t>
+        <w:t xml:space="preserve">Ich hatte vorgehabt, den Vormittag ruhig in der öffentlichen Bibliothek zu verbringen und mich über die Blackburns schlau zu lesen. Dort fand ich Neil bereits vor, eingerichtet an dem großen Eichentisch an den hohen Fenstern. Vor ihm lagen drei Archivkartons mit Stadtakten offen aufgeschlagen, und einen vierten trug gerade Mrs. Johnson herbei, die ihn mit der leidgeprüften Sorgfalt absetzte, die eine Bibliothekarin an den Tag legt, wenn sie beschlossen hat, dass ein Besucher Ärger machen wird. In der einen Hand hielt er eine Lupe. Seine Lesebrille hatte er sich ins Haar geschoben, während seine normale Brille auf seiner Nase saß. Er blickte in der Sekunde auf, als ich durch die Tür trat, als hätte er auf eine Bekannte gewartet, und winkte mich herüber.</w:t>
+      </w:r>
+    </w:p>
+    <w:p/>
+    <w:p>
+      <w:r>
+        <w:t xml:space="preserve">„Mrs. Claus! Kommen Sie her und sehen Sie sich das an, das wird Ihnen gefallen.“ Er drehte ein sprödes Kassenbuch zu mir herum, als ich herantrat. „Achtzehnhunderteinundneunzig. Die Blackburns haben die Hälfte des Geldes für die Kirche am Anger aufgebracht. Wussten Sie das? Die Hälfte. Großzügig, diese alten Herrschaften, wenn es ihnen in den Kram passte, gesehen zu werden.“ Er schüttelte den Kopf mit etwas, das wie echte Bewunderung wirkte. „Ich liebe eine Gründerfamilie. All dieser rohe, gierige Ehrgeiz in der ersten Generation, der in der dritten zu Ehrsamkeit gerinnt, und bis zur vierten haben sie vergessen, dass sie jemals irgendetwas an sich gerissen haben. Überall dieselbe Leier in jedem kleinen Nest, in das ich je einen Fuß gesetzt habe.“</w:t>
       </w:r>
     </w:p>
     <w:p/>
@@ -1891,7 +1891,7 @@
     <w:p/>
     <w:p>
       <w:r>
-        <w:t>„Noch nicht das Ende. Aber nah dran.“ Er tippte gegen die Seite eines Kartons. „Ich weiß, dass sie das Haus der Blackburns im Winter von vierundzwanzig verlassen hat. Ich weiß, dass sie durch keine der ordnungsgemäßen Türen hinausging. Kein Verkauf verzeichnet, kein Geschenk, kein Vermächtnis, nichts Niedergeschriebenes, was meiner Erfahrung nach bedeutet, dass sie durch die falsche Tür verschwunden ist. Diebstahl, so gut wie sicher, auch wenn es hundert Jahre zu spät ist, um dagegen noch etwas zu unternehmen.“ Er lehnte sich zurück. „Nachdem sie das Haus verlässt, reißt die Spur hier ab und wird zwei Orte weiter wieder ganz schwach. Ein Pfandhaus in Ridgeline. Die haben fürchterliche Aufzeichnungen geführt, diese alten Läden, aber ein paar gab es doch, und es hat sich ein Tagebuch des Gehilfen erhalten, und ich versuche, ein Datum darin mit dem Winter abzugleichen, in dem die Brosche abhandenkam. Dann habe ich den ganzen Bogen der Geschichte, vom Haus zum Pfandhaus, und ich kann meinen Schlussstrich ziehen, meine Akte schließen und nach Hause fahren.“</w:t>
+        <w:t xml:space="preserve">„Noch nicht das Ende. Aber nah dran.“ Er tippte gegen die Seite eines Kartons. „Ich weiß, dass sie das Haus der Blackburns im Winter von vierundzwanzig verlassen hat. Ich weiß, dass sie durch keine der ordnungsgemäßen Türen hinausging. Kein Verkauf verzeichnet, kein Geschenk, kein Vermächtnis, nichts Niedergeschriebenes, was meiner Erfahrung nach bedeutet, dass sie durch die falsche Tür verschwunden ist. Diebstahl, so gut wie sicher, auch wenn es hundert Jahre zu spät ist, um dagegen noch etwas zu unternehmen.“ Er lehnte sich zurück. „Nachdem sie das Haus verlässt, reißt die Spur hier ab und wird zwei Orte weiter wieder warm, wenn auch schwach. Ein Pfandhaus in Ridgeline. Die haben fürchterliche Aufzeichnungen geführt, diese alten Läden, aber ein paar gab es doch, und es hat sich ein Tagebuch des Gehilfen erhalten, und ich versuche, ein Datum darin mit dem Winter abzugleichen, in dem die Brosche abhandenkam. Dann habe ich den ganzen Bogen der Geschichte, vom Haus zum Pfandhaus, und ich kann meinen Schlussstrich ziehen, meine Akte schließen und nach Hause fahren.“</w:t>
       </w:r>
     </w:p>
     <w:p/>
@@ -1991,7 +1991,7 @@
     </w:p>
     <w:p>
       <w:r>
-        <w:t>„Mrs. Claus!“ Bram kam im Trab um die Ecke des Häuschens und rang die Mütze zwischen den Händen. Bram war der Elf, der mit uns nach Süden gekommen war, der Vorarbeiter der umgezogenen Werkstatt, treu, pingelig und von der Statur her im Groben wie eine besorgte Kartoffel geformt, und er stand nun völlig auf dem Schlauch vor lauter Aufregung. „Es ist Dancer. Sie hat sich schon wieder losgemacht. Zum dritten Mal diese Woche, Mrs. Claus, zum dritten. Und ich schwöre bei jedem einzelnen Knopf an meiner Weste, dass der Riegel vorgeschoben war, als ich ihn verlassen habe, vorgeschoben und geprüft, und jetzt steht sie hier und frisst den guten Kohl und lässt sich nicht führen, und mir gefällt das ganz und gar nicht, das muss ich Ihnen sagen.“</w:t>
+        <w:t xml:space="preserve">„Mrs. Claus!“ Bram kam im Trab um die Ecke des Häuschens und rang die Mütze zwischen den Händen. Bram war der Elf, der mit uns nach Süden gekommen war, der Vorarbeiter der umgezogenen Werkstatt, treu, pingelig und von der Statur her im Groben wie eine besorgte Kartoffel geformt, und er war nun in heller Aufregung. „Es ist Dancer. Sie hat sich schon wieder losgemacht. Zum dritten Mal diese Woche, Mrs. Claus, zum dritten. Und ich schwöre bei jedem einzelnen Knopf an meiner Weste, dass der Riegel vorgeschoben war, als ich ihn verlassen habe, vorgeschoben und geprüft, und jetzt steht sie hier und frisst den guten Kohl und lässt sich nicht führen, und mir gefällt das ganz und gar nicht, das muss ich Ihnen sagen.“</w:t>
       </w:r>
     </w:p>
     <w:p>
@@ -2046,7 +2046,7 @@
     </w:p>
     <w:p>
       <w:r>
-        <w:t>„Der Riegel“, wiederholte er, und seine Freude trübte sich ein wenig in etwas Ernsteres. „Es zieht an ihnen. Die Rentiere spüren es vor uns allen. Das tun sie schon immer, seit dem ersten Mal.“ Er trat heraus und zog die Tür hinter sich ins Schloss, und als er sich davon entfernte, wurden die goldenen Fugen matt. „Geh ein Stück mit mir. Ich erzähle dir, was ich kann, was nicht viel ist, weil ich selbst noch nicht viel weiß. Aber du hast dir verdient, was ich weiß.“</w:t>
+        <w:t xml:space="preserve">„Der Riegel“, wiederholte er, und seine Freude trübte sich ein wenig in etwas Ernsteres. „Es zieht an ihnen. Die Rentiere spüren es vor uns allen. Das tun sie schon immer, seit dem allerersten Rentier.“ Er trat heraus und zog die Tür hinter sich ins Schloss, und als er sich davon entfernte, wurden die goldenen Fugen matt. „Geh ein Stück mit mir. Ich erzähle dir, was ich kann, was nicht viel ist, weil ich selbst noch nicht viel weiß. Aber du hast dir verdient, was ich weiß.“</w:t>
       </w:r>
     </w:p>
     <w:p>
@@ -2081,7 +2081,7 @@
     </w:p>
     <w:p>
       <w:r>
-        <w:t>Er schwieg einen Augenblick, während unser Atem die Dämmerung einnebelte. „Es ist ein Ort, an den sie sich setzen kann“, sagte er schließlich leise. „Mehr sage ich nicht, und selbst das ist mehr, als ich sollte, denn sie ist noch nicht fertig, und ich weiß nicht, ob sie standhalten wird. Ich versuche das Ding zu bauen, nach dem sie sucht, Jess. Eine Herdstelle. Damit sie aufhört, im Dunkeln von Tür zu Tür zu gehen, nach Hause kommt und sich hinlegt.“ Er drückte meine Hand. „Sag niemandem etwas. Nicht, weil es ein Geheimnis ist, das man horten muss. Sondern weil ich es nicht laut aussprechen will, bevor ich weiß, dass es funktioniert.“</w:t>
+        <w:t xml:space="preserve">Er schwieg einen Augenblick, während unser Atem die Dämmerung einnebelte. „Es ist ein Ort, an den sie sich setzen kann“, sagte er schließlich leise. „Mehr sage ich nicht, und selbst das ist mehr, als ich sollte, denn er ist noch nicht fertig, und ich weiß nicht, ob er standhalten wird. Ich versuche das Ding zu bauen, nach dem sie sucht, Jess. Eine Herdstelle. Damit sie aufhört, im Dunkeln von Tür zu Tür zu gehen, nach Hause kommt und sich hinlegt.“ Er drückte meine Hand. „Sag niemandem etwas. Nicht, weil es ein Geheimnis ist, das man horten muss. Sondern weil ich es nicht laut aussprechen will, bevor ich weiß, dass es funktioniert.“</w:t>
       </w:r>
     </w:p>
     <w:p>
@@ -2091,7 +2091,7 @@
     </w:p>
     <w:p>
       <w:r>
-        <w:t>Pip hatte die ganze Zeit am unteren Querholz des Koppels entlanggeschnüffelt. Ich trug den Zettel in meiner Manteltasche, und nun tat sie das, was sie sich angewöhnt hatte, wann immer er in der Nähe war. Sie kam auf die Tasche zu, presste ihren Schnabel flach gegen die Außenseite und verharrte ganz ruhig, in jene Reglosigkeit verfallend, wenn sie eine Fährte aufgenommen hatte und sich ihrer Sache vergewissern musste. Dann drehte sie sich um und watschelte mit großem Ernst von mir weg, den Weg direkt zur Küchentür hinauf, und wartete dort, bis ich sie öffnete. Sie überquerte den Boden und blieb an dem Korb stehen, in den ich den Leuchter gelegt hatte, den ich an jenem Morgen von der Schmiede nach Hause getragen hatte. Sie setzte sich neben den Korb, blickte zu mir auf und stieß einen einzigen, scharfen und sicheren Schrei aus, wie einen ausgestreckten Zeigefinger.</w:t>
+        <w:t xml:space="preserve">Pip hatte die ganze Zeit am unteren Querholz der Koppel entlanggeschnüffelt. Ich trug den Zettel in meiner Manteltasche, und nun tat sie das, was sie sich angewöhnt hatte, wann immer er in der Nähe war. Sie kam auf die Tasche zu, presste ihren Schnabel flach gegen die Außenseite und verharrte ganz ruhig, in jene Reglosigkeit verfallend, wenn sie eine Fährte aufgenommen hatte und sich ihrer Sache vergewissern musste. Dann drehte sie sich um und watschelte mit großem Ernst von mir weg, den Weg direkt zur Küchentür hinauf, und wartete dort, bis ich sie öffnete. Sie überquerte den Boden und blieb an dem Korb stehen, in den ich den Leuchter gelegt hatte, den ich an jenem Morgen von der Schmiede nach Hause getragen hatte. Sie setzte sich neben den Korb, blickte zu mir auf und stieß einen einzigen, scharfen und sicheren Piepser aus, wie einen ausgestreckten Zeigefinger.</w:t>
       </w:r>
     </w:p>
     <w:p>
@@ -2122,12 +2122,12 @@
     <w:p/>
     <w:p>
       <w:r>
-        <w:t>Das Rathaus war ein schnörkelloser Backsteinbau am Ende des Angers mit einem Uhrturm, der, solange sich irgendjemand erinnern konnte, stets vier Minuten nachging. Ich ging dort an jenem Montag mit Pip hin, in zwei Angelegenheiten, von denen die eine echt und die andere weniger echt war. Die echte Angelegenheit bestand darin, den Namen des Zirkels auf die Liste der Festhelfer zu setzen und im Namen der Stadt, und nur für sie, anzufragen, ob Frost Falls nicht ein wenig Geld für den Historischen Verein erübrigen könne, bevor dessen Dach endgültig einstürzte. Die weniger echte Angelegenheit bestand darin, Vera Reed einmal ordentlich und aus der Nähe zu betrachten.</w:t>
-      </w:r>
-    </w:p>
-    <w:p>
-      <w:r>
-        <w:t>Das Foyer war mit Porträts früherer Bürgermeister behängt, goldgerahmt und selbstgefällig, und eine auffallende Anzahl von ihnen waren Blackburns, dieselbe lange Blackburn-Nase wie ein Erbstück von Generation zu Generation weitergereicht. Am Ende des Foyers stand die Tür des jetzigen Amtsinhabers offen. Hinter einem breiten, sauberen Schreibtisch, auf dem außer einem Telefon und einer Schreibunterlage aus Leder nichts lag, saß der Bürgermeister höchstselbst, ein glatter, grauer Mann, der die Nase, das Amt und, soweit irgendjemand in der Stadt sagen konnte, sonst nicht viel geerbt hatte.</w:t>
+        <w:t xml:space="preserve">Das Rathaus war ein verschnörkelter Backsteinbau am Ende des Angers mit einem Uhrturm, der, solange sich irgendjemand erinnern konnte, stets vier Minuten vorging. Ich ging dort an jenem Montag mit Pip hin, in zwei Angelegenheiten, von denen die eine echt und die andere weniger echt war. Die echte Angelegenheit bestand darin, den Namen des Zirkels auf die Liste der Festhelfer zu setzen und im Namen der Stadt, und nur für sie, anzufragen, ob Frost Falls nicht ein wenig Geld für den Historischen Verein erübrigen könne, bevor dessen Dach endgültig einstürzte. Die weniger echte Angelegenheit bestand darin, Vera Reed einmal ordentlich und aus der Nähe zu betrachten.</w:t>
+      </w:r>
+    </w:p>
+    <w:p>
+      <w:r>
+        <w:t xml:space="preserve">Das Foyer war mit Porträts früherer Bürgermeister behängt, goldgerahmt und selbstgefällig, und eine auffallende Anzahl von ihnen waren Blackburns, dieselbe lange Blackburn-Nase wie ein Erbstück von Generation zu Generation weitergereicht. Am Ende des Foyers stand die Tür des jetzigen Amtsinhabers offen. Hinter einem breiten, sauberen Schreibtisch, auf dem außer einem Telefon und einer Schreibunterlage aus Leder nichts lag, saß Bürgermeister Blackburn höchstselbst, ein glatter, grauer Mann, der die Nase, das Amt und, soweit irgendjemand in der Stadt sagen konnte, sonst nicht viel geerbt hatte.</w:t>
       </w:r>
     </w:p>
     <w:p>
@@ -2211,7 +2211,7 @@
     </w:p>
     <w:p>
       <w:r>
-        <w:t>She sah mich an, und für einen unbewachten Moment war ihr korrektes, müdes Gesicht etwas anderes, misstrauisch, fast wie in die Enge getrieben, ehe sie die Korrektheit wieder wie einen Topfdeckel darüberzog. „Ich weiß gar nichts über die Blackburns“, sagte sie, was ein seltsamer Satz war, wenn man bedachte, dass ein Blackburn sechs Fuß entfernt hinter seiner offenen Tür saß und Blackburn-Urkunden die Schubladen hinter ihr füllten. „Das ist Theos Abteilung. Der Historische Verein. Ich verwalte nur die Akten. Ich lese sie nicht.“ Sie schob mir die Festliste über die Unterlage zu. „Da bitte. Der Zirkel ist eingetragen. War da noch etwas?“</w:t>
+        <w:t xml:space="preserve">Sie sah mich an, und für einen unbewachten Moment war ihr korrektes, müdes Gesicht etwas anderes, misstrauisch, fast wie in die Enge getrieben, ehe sie die Korrektheit wieder wie einen Topfdeckel darüberzog. „Ich weiß gar nichts über die Blackburns“, sagte sie, was ein seltsamer Satz war, wenn man bedachte, dass ein Blackburn knapp zwei Meter entfernt hinter seiner offenen Tür saß und Blackburn-Urkunden die Schubladen hinter ihr füllten. „Das ist Theos Abteilung. Der Historische Verein. Ich verwalte nur die Akten. Ich lese sie nicht.“ Sie schob mir die Festliste über die Unterlage zu. „Da bitte. Der Zirkel ist eingetragen. War da noch etwas?“</w:t>
       </w:r>
     </w:p>
     <w:p>
@@ -2226,7 +2226,7 @@
     </w:p>
     <w:p>
       <w:r>
-        <w:t>„Das ist alles“, sagte ich. „Danke, Vera, Sie sehen erschöpft aus, wenn ich mir die Bemerkung erlauben darf. Sie schuften Sie hier auch viel zu hart.“</w:t>
+        <w:t xml:space="preserve">„Das ist alles“, sagte ich. „Danke, Vera, Sie sehen erschöpft aus, wenn ich mir die Bemerkung erlauben darf. Man lässt Sie hier auch viel zu hart schuften.“</w:t>
       </w:r>
     </w:p>
     <w:p>
@@ -2267,7 +2267,7 @@
     <w:p/>
     <w:p>
       <w:r>
-        <w:t>Der Vorstand des Geschichtsvereins trat an jenem Montagabend in dem kalten Hinterzimmer unter dem schadhaften Dach zusammen. Claire hatte mich gebeten, sie zu begleiten, teils weil die Zeitung ein freundliches Gesicht in der Runde haben wollte, und teils, wie ich vermutete, weil sie mehr geahnt als ausgesprochen hatte, was ich bei mir getragen hatte, und wollte, dass ich mit eigenen Augen sah, wie schlimm es stand.</w:t>
+        <w:t xml:space="preserve">Der Vorstand des Historischen Vereins trat an jenem Montagabend in dem kalten Hinterzimmer unter dem schadhaften Dach zusammen. Claire hatte mich gebeten, sie zu begleiten, teils weil die Zeitung ein freundliches Gesicht in der Runde haben wollte, und teils, wie ich vermutete, weil sie mehr geahnt als ausgesprochen hatte, was ich bei mir getragen hatte, und wollte, dass ich mit eigenen Augen sah, wie schlimm es stand.</w:t>
       </w:r>
     </w:p>
     <w:p>
@@ -2277,7 +2277,7 @@
     </w:p>
     <w:p>
       <w:r>
-        <w:t>Sechs Mitglieder des Vorstands saßen da, vier alte und zwei lediglich im mittleren Alter, gruppiert um einen Klapptisch, der in dem stattlichen, alten Raum deplatziert wirkte. Ein Kaffeeautomat zischte auf einem Beistelltisch. In der Deckenfleck über dem Fenster breitete sich ein brauner Wasserfleck wie ein Bluterguss auf dem Putz aus, während auf dem Fenstersims darunter ein Blecheimer stand, um das Tropfwasser aufzufangen. Niemand erwähnte den Eimer. Jedermanns Blicke glitten zu ihm hin und wieder weg.</w:t>
+        <w:t xml:space="preserve">Sechs Mitglieder des Vorstands saßen da, vier alte und zwei lediglich im mittleren Alter, gruppiert um einen Klapptisch, der in dem stattlichen, alten Raum deplatziert wirkte. Ein Kaffeeautomat zischte auf einem Beistelltisch. In der Deckenecke über dem Fenster breitete sich ein brauner Wasserfleck wie ein Bluterguss auf dem Putz aus, während auf dem Fenstersims darunter ein Blecheimer stand, um das Tropfwasser aufzufangen. Niemand erwähnte den Eimer. Jedermanns Blicke glitten zu ihm hin und wieder weg.</w:t>
       </w:r>
     </w:p>
     <w:p>
@@ -2302,7 +2302,7 @@
     </w:p>
     <w:p>
       <w:r>
-        <w:t>„Das sagen uns die nackten Zahlen.“ Theo nahm die Brille ab und drückte die Finger auf den Nasenrücken, und für einen Augenblick zitterte seine umsichtige Stimme. „Ich habe mich überall beworben. Das möchte ich, dass Sie alle wissen. Jede Beihilfe, jede Stiftung, jeder Fonds in drei Bundesstaaten. Ich besitze einen Ordner voller Absagen. Ich könnte diesen Raum damit tapezieren, und wenigstens wäre er dann trocken.“ Einige von ihnen lachten, jenes traurige, hilflose Lachen von Menschen am Ende ihrer Möglichkeiten. „Die Stadt wird nicht helfen. Ich war im vergangenen Frühjahr selbst beim Bürgermeister, und Frau Claus hier war heute Morgen noch einmal da, und er sagt dasselbe wie immer. Die Geschichte pflügt keine Straßen.“ Er legte die Brille auf seine Papiere. „Ich weiß nicht, was ich noch versuchen soll. Ich habe versucht, vernünftig zu sein. Ich habe versucht, erbärmlich zu sein. Ich bin mir nicht zu schade zuzugeben, dass ich versucht habe, erbärmlich zu sein – schriftlich, bei einer Stiftung in der Stadt –, und sie schickten einen sehr freundlichen Brief zurück, in dem sie ablehnten.“</w:t>
+        <w:t xml:space="preserve">„Das sagen uns die nackten Zahlen.“ Theo nahm die Brille ab und drückte die Finger auf den Nasenrücken, und für einen Augenblick zitterte seine umsichtige Stimme. „Ich habe mich überall beworben. Das möchte ich, dass Sie alle wissen. Jede Beihilfe, jede Stiftung, jeder Fonds in drei Bundesstaaten. Ich besitze einen Ordner voller Absagen. Ich könnte diesen Raum damit tapezieren, und wenigstens wäre er dann trocken.“ Einige von ihnen lachten, jenes traurige, hilflose Lachen von Menschen am Ende ihrer Möglichkeiten. „Die Stadt wird nicht helfen. Ich war im vergangenen Frühjahr selbst beim Bürgermeister, und Frau Claus hier war heute Morgen noch einmal da, und er sagt dasselbe wie immer. Die Geschichte pflügt keine Straßen.“ Er legte die Brille auf seine Papiere. „Ich weiß nicht, was ich noch versuchen soll. Ich habe versucht, vernünftig zu sein. Ich habe versucht, erbärmlich zu sein. Ich bin mir nicht zu schade zuzugeben, dass ich versucht habe, erbärmlich zu sein – schriftlich, bei einer Stiftung in der Großstadt –, und sie schickten einen sehr freundlichen Brief zurück, in dem sie ablehnten.“</w:t>
       </w:r>
     </w:p>
     <w:p>
@@ -2322,7 +2322,7 @@
     </w:p>
     <w:p>
       <w:r>
-        <w:t>Der Vorstand redete eine Stunde lang im Kreis, schlug Kuchenbasare und eine Briefschreibkampagne vor, wobei jede Idee kleiner war als das Loch, das sie stopfen sollte. Der ganze Raum wusste es und sprach die kleinen, hoffnungsvollen Dinge dennoch aus, weil nichts zu sagen noch schlimmer war. Schließlich stimmten sie dafür, die Türen über das neue Jahr hinaus offen zu halten und „alle Optionen zu prüfen“. Sie vertagten sich in die Kälte. Der Automat zischte und verstummte, und Theo blieb zurück, um die Klappstühle ganz allein wegzuräumen.</w:t>
+        <w:t xml:space="preserve">Der Vorstand redete eine Stunde lang im Kreis, schlug Kuchenbasare und eine Briefschreibkampagne vor, wobei jede Idee kleiner war als das Loch, das sie stopfen sollte. Der ganze Raum wusste es und sprach die kleinen, hoffnungsvollen Dinge dennoch aus, weil nichts zu sagen noch schlimmer war. Schließlich stimmten sie dafür, die Türen bis zum neuen Jahr offen zu halten und „alle Optionen zu prüfen“. Sie vertagten sich in die Kälte. Der Automat zischte und verstummte, und Theo blieb zurück, um die Klappstühle ganz allein wegzuräumen.</w:t>
       </w:r>
     </w:p>
     <w:p>
@@ -2348,7 +2348,7 @@
     <w:p/>
     <w:p>
       <w:r>
-        <w:t>Frost Fitness war das neueste Geschäft an der Evergreen Avenue, ganz aus Glas und hellem, greifbarem Licht, mit dem Quietschen von sauberem Gummi unter den Sohlen. Jamal Washington hatte sich mit Haut und Haar in das Fest gestürzt, wie er es bei allem tat. Er hatte silberne Papierschneeflocken von der Decke gehängt und weiße Lichterketten um jeden Spiegel gewickelt, so dass der ganze Laden funkelte wie das Innere einer geschüttelten Schneekugel. Irgendwo spielte eine Musikanlage einen Beat, den man im Fußboden spürte. Er stand hinter dem Empfang, als ich eintrat, und sein Gesicht öffnete sich zu dem großen, warmen Lächeln, das zur Hälfte der Grund dafür war, dass das Geschäft so gut lief.</w:t>
+        <w:t xml:space="preserve">Frost Fitness war das neueste Geschäft an der Evergreen Avenue, ganz aus Glas und hellem, hartem Licht, mit dem Quietschen von sauberem Gummi unter den Sohlen. Jamal Washington hatte sich mit Haut und Haar in das Fest gestürzt, wie er es bei allem tat. Er hatte silberne Papierschneeflocken von der Decke gehängt und weiße Lichterketten um jeden Spiegel gewickelt, so dass der ganze Laden funkelte wie das Innere einer geschüttelten Schneekugel. Irgendwo spielte eine Musikanlage einen Beat, den man im Fußboden spürte. Er stand hinter dem Empfang, als ich eintrat, und sein Gesicht öffnete sich zu dem großen, warmen Lächeln, das zur Hälfte der Grund dafür war, dass das Geschäft so gut lief.</w:t>
       </w:r>
     </w:p>
     <w:p/>
@@ -2384,7 +2384,7 @@
     <w:p/>
     <w:p>
       <w:r>
-        <w:t>„Die Erweiterung“, sagte ich und deutete auf die hintere Wand, wo eine Türöffnung in rohe Ständerbauten gezimmert und dann so belassen worden war; die Lücke war mit Plastikfolie behängt, die im Durchzug ein wenig hin und her wölbte. „Wie kommt sie voran?“</w:t>
+        <w:t xml:space="preserve">„Die Erweiterung“, sagte ich und deutete auf die hintere Wand, wo eine Türöffnung in rohe Ständerbauten gezimmert und dann so belassen worden war; die Lücke war mit Plastikfolie behängt, die sich im Durchzug ein wenig hin und her wölbte. „Wie kommt sie voran?“</w:t>
       </w:r>
     </w:p>
     <w:p/>
@@ -2408,7 +2408,7 @@
     <w:p/>
     <w:p>
       <w:r>
-        <w:t>Ich ließ das auf mich wirken, so wie ich Sams zwanzig Dollar auf mich wirken gelassen hatte. Hier war ein Mann, der tief in Schulden steckte, mit jedem Grund der Welt und jeder Gelegenheit dazu. Seine Antwort darauf bestand darin, die ganze Nacht lang für einen Obolus über das Stadtfest zu wachen und Großmüttern um halb sechs Uhr morgens Kniebeugen beizubringen. Jamal arbeitete in drei Jobs, um auf ehrliche, anstrengende, zentimetergenaue Weise aus seinem Loch zu klettern, und das passte nicht zu einer Erpresserforderung über eine halbe Million Dollar. Die Rechnung ging nicht auf. Wenn Jamal Washington auch nur irgendeinen Weg gehabt hätte, diese Art von Geld aus einem Geheimnis herbeizuzaubern, würde er sich nicht den Wecker auf fünf stellen.</w:t>
+        <w:t xml:space="preserve">Ich ließ das auf mich wirken, so wie ich Sams zwanzig Dollar auf mich wirken gelassen hatte. Hier war ein Mann, der tief in Schulden steckte, mit jedem Grund der Welt und jeder Gelegenheit dazu. Seine Antwort darauf bestand darin, die ganze Nacht lang für einen Obolus über das Stadtfest zu wachen und Großmüttern um halb sechs Uhr morgens Ausfallschritte beizubringen. Jamal arbeitete in drei Jobs, um auf ehrliche, anstrengende Weise Zentimeter für Zentimeter aus seinem Loch zu klettern, und das passte nicht zu einer Erpresserforderung über eine halbe Million Dollar. Die Rechnung ging nicht auf. Wenn Jamal Washington auch nur irgendeinen Weg gehabt hätte, diese Art von Geld aus einem Geheimnis herbeizuzaubern, würde er sich nicht den Wecker auf fünf stellen.</w:t>
       </w:r>
     </w:p>
     <w:p/>
@@ -2426,13 +2426,13 @@
     <w:p/>
     <w:p>
       <w:r>
-        <w:t>„Sie ansehen?“ Er lachte, von der Frage überrascht. „Mrs. Claus, ich habe Vitrinen zu zweit geschleppt und versucht, meinen Fuß nicht durch einen hundert Jahre alten Stuhl zu stecken. Ich habe kein einziges Wort gelesen. Ich hätte Ihnen eine Blackburn von einer Brombeere nicht unterscheiden können. Theo reichte mir eine Kiste und sagte, Vorsicht jetzt, vorsicht, die da ist kostbar, und ich trug die kostbare Kiste dorthin, wohin er zeigte, und ging sofort zurück für die nächste kostbare Kiste.“ Er schüttelte den Kopf und grinste bei der Erinnerung. „Am Ende der Woche war ich so ausgelaugt, dass ich alles unterschrieben hätte, nur um die Erlaubnis zu bekommen, mich hinzusetzen. Das war meine gesamte Laufbahn als Historiker.“</w:t>
-      </w:r>
-    </w:p>
-    <w:p/>
-    <w:p>
-      <w:r>
-        <w:t>Er sagte es leichthin, ohne jede Ahnung, dass er mir auch nur irgendetwas verraten hatte, und ich behielt ein ruhiges Gesicht bei dem kleinen, sauberen Klicken, das es in meinem Inneren auslöste. Er hatte die Briefe nicht gelesen. Er hatte die Kisten getragen und dabei auf seine Füße geschaut. Was auch immer der Erpresser in den Blackburn-Papieren, der Brosche, dem Stein, dem Pfandhaus gelesen hatte, Jamal hatte es nie vor Augen gehabt. Er hatte es im Arm gehalten, verschlossen in einer Kiste, und nie hineingesehen.</w:t>
+        <w:t xml:space="preserve">„Sie ansehen?“ Er lachte, von der Frage überrascht. „Mrs. Claus, ich habe Vitrinen zu zweit geschleppt und versucht, meinen Fuß nicht durch einen hundert Jahre alten Stuhl zu stecken. Ich habe kein einziges Wort gelesen. Ich hätte einen Blackburn nicht von einer Brombeere unterscheiden können. Theo reichte mir eine Kiste und sagte, Vorsicht jetzt, Vorsicht, die da ist kostbar, und ich trug die kostbare Kiste dorthin, wohin er zeigte, und ging sofort zurück für die nächste kostbare Kiste.“ Er schüttelte den Kopf und grinste bei der Erinnerung. „Am Ende der Woche war ich so ausgelaugt, dass ich alles unterschrieben hätte, nur um die Erlaubnis zu bekommen, mich hinzusetzen. Das war meine gesamte Laufbahn als Historiker.“</w:t>
+      </w:r>
+    </w:p>
+    <w:p/>
+    <w:p>
+      <w:r>
+        <w:t xml:space="preserve">Er sagte es leichthin, ohne jede Ahnung, dass er mir auch nur irgendetwas verraten hatte, und ich behielt ein ruhiges Gesicht bei dem kleinen, sauberen Klicken, das es in meinem Inneren auslöste. Er hatte die Briefe nicht gelesen. Er hatte die Kisten getragen und dabei auf seine Füße geschaut. Was auch immer der Erpresser in den Blackburn-Papieren gelesen hatte – die Brosche, den Stein, das Pfandhaus –, Jamal hatte es nie vor Augen gehabt. Er hatte es im Arm gehalten, verschlossen in einer Kiste, und nie hineingesehen.</w:t>
       </w:r>
     </w:p>
     <w:p/>
@@ -2462,13 +2462,13 @@
     <w:p/>
     <w:p>
       <w:r>
-        <w:t>Er war rein. Die Gewissheit darüber breitete sich sauber in mir aus, und sie bewirkte zwei Dinge auf einmal. Sie beruhigte mich, weil ich Jamal mochte und nicht gewollt hatte, dass er es war.</w:t>
-      </w:r>
-    </w:p>
-    <w:p/>
-    <w:p>
-      <w:r>
-        <w:t>Und sie beunruhigte mich, weil jeder Name, den ich von der Liste strich, diese kürzer werden ließ. Als ich durch die goldenerleuchtete Kälte nach Hause ging, sah ich genau, wohin die engere Auswahl zu deuten begann, und die Richtung gefiel mir ganz und gar nicht.</w:t>
+        <w:t xml:space="preserve">Er war entlastet. Die Gewissheit darüber breitete sich sauber in mir aus, und sie bewirkte zwei Dinge auf einmal. Sie beruhigte mich, weil ich Jamal mochte und nicht gewollt hatte, dass er es war.</w:t>
+      </w:r>
+    </w:p>
+    <w:p/>
+    <w:p>
+      <w:r>
+        <w:t xml:space="preserve">Und sie beunruhigte mich, weil jeder Name, den ich von der Liste strich, diese kürzer werden ließ. Als ich durch die golden erleuchtete Kälte nach Hause ging, sah ich genau, wohin die engere Auswahl zu deuten begann, und die Richtung gefiel mir ganz und gar nicht.</w:t>
       </w:r>
     </w:p>
     <w:p>
@@ -2503,7 +2503,7 @@
         <w:t>&lt;/bt&gt;</w:t>
       </w:r>
       <w:r>
-        <w:t xml:space="preserve"> bereit, ein Touristenteil mit einem winzigen Keramik-Frost Falls im Inneren, grün und Rathaus und alles drum und dran. An jenem Morgen, als ich wegen Nicks Zimtschnecken vorbeischaute, wollte der Schnee darin sich einfach nicht setzen. Er wirbelte und wirbelte ohne menschliches Zutun, ein winziger Schneesturm drehte sich unaufhörlich hinter dem Glas. Greta hatte ein Geschirrtuch über die Hälfte davon gebreitet, als ob das helfen würde, und verkaufte ihre Schnecken daneben mit der entschlossenen Fröhlichkeit einer Frau, die beschlossen hatte, nicht über die Schneekugel zu sprechen.</w:t>
+        <w:t xml:space="preserve"> bereit, ein Touristenteil mit einem winzigen Keramik-Frost Falls im Inneren, Anger und Rathaus und alles drum und dran. An jenem Morgen, als ich wegen Nicks Zimtschnecken vorbeischaute, wollte der Schnee darin sich einfach nicht setzen. Er wirbelte und wirbelte ohne menschliches Zutun, ein winziger Schneesturm drehte sich unaufhörlich hinter dem Glas. Greta hatte ein Geschirrtuch über die Hälfte davon gebreitet, als ob das helfen würde, und verkaufte ihre Schnecken daneben mit der entschlossenen Fröhlichkeit einer Frau, die beschlossen hatte, nicht über die Schneekugel zu sprechen.</w:t>
       </w:r>
     </w:p>
     <w:p/>
@@ -2533,7 +2533,7 @@
     <w:p/>
     <w:p>
       <w:r>
-        <w:t>Draußen auf dem Anger lag der Ärger bei Bram. Prancer hatte sich in der Nacht selbst aus dem Paddock gelassen und war herunter ins Dorf gekommen. Nun stand sie knietief in verwehtem Laub im Becken des Brunnens, den die Gemeinde jeden Oktober abstellte. Sie stand da mit erhobenem Kopf und rührte sich nicht vom Fleck.</w:t>
+        <w:t xml:space="preserve">Draußen auf dem Anger lag der Ärger bei Bram. Prancer hatte sich in der Nacht selbst aus der Koppel gelassen und war herunter ins Dorf gekommen. Nun stand sie knöcheltief in verwehtem Laub im Becken des Brunnens, den die Gemeinde jeden Oktober abstellte. Sie stand da mit erhobenem Kopf und rührte sich nicht vom Fleck.</w:t>
       </w:r>
     </w:p>
     <w:p/>
@@ -2575,7 +2575,7 @@
     <w:p/>
     <w:p>
       <w:r>
-        <w:t>Sie hob den Kopf und sah mich an. Eine ganze Weile lang blickte sie danach den Weg hinauf in Richtung Hütte und der Werkstatt dahinter, so wie es ein Tier eben tut, wenn es den Duft von etwas Besserem in der Nase hat als das, was gerade vor ihm liegt. Sie stieg über den Beckenrand, streute dabei Laub auf Brams Stiefel und entlockte den Kindern einen Jubelruf. Dann machte sie sich in einem gemütlichen Schrittmaß auf den Weg nach Hause, voller Würde, und wir alle sahen ihr dabei nach.</w:t>
+        <w:t xml:space="preserve">Sie hob den Kopf und sah mich an. Eine ganze Weile lang blickte sie danach den Weg hinauf in Richtung unseres Häuschens und der Werkstatt dahinter, so wie es ein Tier eben tut, wenn es den Duft von etwas Besserem in der Nase hat als das, was gerade vor ihm liegt. Sie stieg über den Beckenrand, streute dabei Laub auf Brams Stiefel und entlockte den Kindern einen Jubelruf. Dann machte sie sich in einem gemütlichen Schrittmaß auf den Weg nach Hause, voller Würde, und wir alle sahen ihr dabei nach.</w:t>
       </w:r>
     </w:p>
     <w:p/>
@@ -2587,7 +2587,7 @@
     <w:p/>
     <w:p>
       <w:r>
-        <w:t>„Das wirst du ihn wohl selbst fragen müssen“, sagte ich. „Aber sie können es von hier aus spüren, genau wie das Licht. Es zieht alles in dieselbe Richtung, Bram. Nach Hause.“ Ich sah zu, wie Prancer die Biegung umrundete und den Weg hinauf verschwand. „Sie wird gerufen.“</w:t>
+        <w:t xml:space="preserve">„Das wirst du ihn wohl selbst fragen müssen“, sagte ich. „Aber sie können es von hier aus spüren, genau wie die Lichter. Es zieht alles in dieselbe Richtung, Bram. Nach Hause.“ Ich sah zu, wie Prancer die Biegung umrundete und den Weg hinauf verschwand. „Sie wird gerufen.“</w:t>
       </w:r>
     </w:p>
     <w:p/>
@@ -2605,7 +2605,7 @@
     <w:p/>
     <w:p>
       <w:r>
-        <w:t>Ich ging den Hufabdrücken eines Reentiers nach nach Hause, mit Pip an meiner Seite. Was immer die Magie nun anstellte, sie zog zu einer Feuerstelle hin, von der niemand im Ort wusste, dass sie existierte. Genau das hatte Nick gemeint. Die Magie wusste schlicht nicht, wie man Böses tat. Sie wusste nur, wie man nach Hause kam, und sie kam jeden Tag ein kleines Stück näher, während sie kleine, unmögliche Dinge hinterließ: Schnee in einer Kugel, die sich partout nicht setzen wollte, ein Rentier, das aus eigenem Antrieb zu einer Feuerstelle nach Hause wanderte, die es noch nie zuvor erblickt hatte.</w:t>
+        <w:t xml:space="preserve">Ich ging den Hufabdrücken eines Rentiers nach nach Hause, mit Pip an meiner Seite. Was immer die Magie nun anstellte, sie zog zu einer Herdstelle hin, von der niemand im Ort wusste, dass sie existierte. Genau das hatte Nick gemeint. Die Magie wusste schlicht nicht, wie man Böses tat. Sie wusste nur, wie man nach Hause kam, und sie kam jeden Tag ein kleines Stück näher, während sie kleine, unmögliche Dinge hinterließ: Schnee in einer Kugel, die sich partout nicht setzen wollte, ein Rentier, das aus eigenem Antrieb zu einer Herdstelle nach Hause wanderte, die es noch nie zuvor erblickt hatte.</w:t>
       </w:r>
     </w:p>
     <w:p/>
@@ -2657,7 +2657,7 @@
     </w:p>
     <w:p>
       <w:r>
-        <w:t>Dot strickte an einem Bündchen und zog dabei den Mund kraus. „Alle in dieser Stadt wollen über ein Rentier reden“, sagte sie. „Niemand will darüber reden, dass das Historische Museum schließt.“</w:t>
+        <w:t xml:space="preserve">Dot strickte an einem Bündchen und zog dabei den Mund kraus. „Alle in dieser Stadt wollen über ein Rentier reden“, sagte sie. „Niemand will darüber reden, dass der Historische Verein schließt.“</w:t>
       </w:r>
     </w:p>
     <w:p>
@@ -2677,7 +2677,7 @@
     </w:p>
     <w:p>
       <w:r>
-        <w:t>„Apropos Museum“, sagte Ivy, „hat noch jemand diesen Mann aus der Bibliothek getroffen?“</w:t>
+        <w:t xml:space="preserve">„Apropos Verein“, sagte Ivy, „hat noch jemand diesen Mann aus der Bibliothek getroffen?“</w:t>
       </w:r>
     </w:p>
     <w:p>
@@ -2727,7 +2727,7 @@
     </w:p>
     <w:p>
       <w:r>
-        <w:t>„Hast du seine Visitenkarte?“ fragte sie.</w:t>
+        <w:t xml:space="preserve">„Hast du seine Visitenkarte?“, fragte sie.</w:t>
       </w:r>
     </w:p>
     <w:p>
@@ -2772,7 +2772,7 @@
     </w:p>
     <w:p>
       <w:r>
-        <w:t>Wir arbeiteten, bis das Tageslicht schwand. Um fünf Uhr hing die Leine über der Theke in der Mitte durch, und in den Körben lagen noch neun Paare. Ellie nahm drei Paare mit nach Hause und Ivy zwei. Auf den letzten Nadeln meines Bündchens stand MAXIMILIAN in Grün und Weiß, und ich musste das Strickstück flach auf mein Knie legen, um jeden einzelnen Buchstaben unterzubringen.</w:t>
+        <w:t xml:space="preserve">Wir arbeiteten, bis das Tageslicht schwand. Um fünf Uhr hing die Leine über der Theke in der Mitte durch, und in den Körben lagen noch neun Paare. Ellie nahm drei Paare mit nach Hause und Ivy zwei. Auf dem letzten Bündchen auf meinen Nadeln stand MAXIMILIAN in Grün und Weiß, und ich musste das Strickstück flach auf mein Knie legen, um jeden einzelnen Buchstaben unterzubringen.</w:t>
       </w:r>
     </w:p>
     <w:p>
@@ -2823,7 +2823,7 @@
     <w:p/>
     <w:p>
       <w:r>
-        <w:t>„Jamal hat die Kisten getragen, aber nie eine geöffnet“, sagte ich. „Das hat er mir selbst gesagt, und ich glaube ihm. Sein ganzes Geschichtsstipendium beruhte auf dem Motto: ‚Vorsicht, das ist kostbar.‘ Er hatte die ganze Woche über die Hände an der Außenseite des Geheimnisses und hat nie hineingesehen. Und der Mann arbeitet in drei Jobs, um sich auf ehrliche Weise aus seinem Schlamassel zu ziehen, das Bootcamp um halb sechs und die Nachtwache obendrein. Er ist es nicht.“ Ich strich Jamals Namen entschlossen durch. „Er hatte die Gelegenheit, aber nicht das Wissen. Und außerdem nicht das Herz dafür, was mir wichtig ist, selbst wenn das vor Gericht keinen Bestand hätte.“</w:t>
+        <w:t xml:space="preserve">„Jamal hat die Kisten getragen, aber nie eine geöffnet“, sagte ich. „Das hat er mir selbst gesagt, und ich glaube ihm. Seine ganze Geschichtsgelehrsamkeit beruhte auf dem Motto: ‚Vorsicht, das ist kostbar.‘ Er hatte die ganze Woche über die Hände an der Außenseite des Geheimnisses und hat nie hineingesehen. Und der Mann arbeitet in drei Jobs, um sich auf ehrliche Weise aus seinem Schlamassel zu ziehen, das Bootcamp um halb sechs und die Nachtwache obendrein. Er ist es nicht.“ Ich strich Jamals Namen entschlossen durch. „Er hatte die Gelegenheit, aber nicht das Wissen. Und außerdem nicht das Herz dafür, was mir wichtig ist, selbst wenn das vor Gericht keinen Bestand hätte.“</w:t>
       </w:r>
     </w:p>
     <w:p/>
@@ -2859,7 +2859,7 @@
     <w:p/>
     <w:p>
       <w:r>
-        <w:t>Ich zog bei seinem Namen auf dem Blatt die Stirn in Falten. „Das ist derjenige, bei dem ich mir nicht sicher bin. Er weiß alles, was der Erpresser weiß. Die Brosche, den einzelnen Stein, Ridgeline, das ganze Paket. Er ist von der Seite der Blackburns herangegangen, von der Seite der Nachlassanwälte, und hat es fast bis vor Contances Haustür zurückverfolgt.“ Ich drehte meine Tasse langsam eine halbe Drehung auf dem Tisch. „Aber er erzählt es jedem. Er verteilt Visitenkarten. Er saß in der öffentlichen Bibliothek und hat mir die ganze Geschichte erzählt, bevor ich überhaupt danach gefragt hatte. Ein Erpresser versteckt sich, Nick. Seine ganze Macht liegt im Versteckspiel. Und Neil Carter tut das genaue Gegenteil vom Verstecken, zu jeder Stunde des Tages. Entweder ist er also überhaupt nicht unser Mann, oder er ist der Schlaueste von allen und macht so viel ehrlichen Lärm um die Brosche, dass kein Mensch in der Stadt jemals zweimal auf denjenigen schauen würde, der am meisten darüber redet.“ Ich ließ ein Fragezeichen neben Neil stehen. „Ich bin noch nicht so weit, ihn abzuschreiben. Aber das sage ich dir: Er kennt das Geheimnis, und er ist auf ehrliche Weise daran gelangt, und er ist Fiona nie wegen ein paar Groschen auf die Pelle gerückt. Er hat sie im hellen Tageslicht mit einem Notizbuch in der Hand wegen Antworten aufgesucht.“</w:t>
+        <w:t xml:space="preserve">Ich zog bei seinem Namen auf dem Blatt die Stirn in Falten. „Das ist derjenige, bei dem ich mir nicht sicher bin. Er weiß alles, was der Erpresser weiß. Die Brosche, den einzelnen Stein, Ridgeline, das ganze Paket. Er ist von der Seite der Blackburns herangegangen, von der Seite der Nachlassanwälte, und hat es fast bis vor Constances Haustür zurückverfolgt.“ Ich drehte meine Tasse langsam eine halbe Drehung auf dem Tisch. „Aber er erzählt es jedem. Er verteilt Visitenkarten. Er saß in der öffentlichen Bibliothek und hat mir die ganze Geschichte erzählt, bevor ich überhaupt danach gefragt hatte. Ein Erpresser versteckt sich, Nick. Seine ganze Macht liegt im Versteckspiel. Und Neil Carter tut das genaue Gegenteil vom Verstecken, zu jeder Stunde des Tages. Entweder ist er also überhaupt nicht unser Mann, oder er ist der Schlaueste von allen und macht so viel ehrlichen Lärm um die Brosche, dass kein Mensch in der Stadt jemals zweimal auf denjenigen schauen würde, der am meisten darüber redet.“ Ich ließ ein Fragezeichen neben Neil stehen. „Ich bin noch nicht so weit, ihn abzuschreiben. Aber das sage ich dir: Er kennt das Geheimnis, und er ist auf ehrliche Weise daran gelangt, und er ist Fiona nie wegen ein paar Groschen auf die Pelle gerückt. Er hat sie im hellen Tageslicht mit einem Notizbuch in der Hand wegen Antworten aufgesucht.“</w:t>
       </w:r>
     </w:p>
     <w:p/>
@@ -2889,13 +2889,13 @@
     <w:p/>
     <w:p>
       <w:r>
-        <w:t>„Ich will, dass es überhaupt niemand ist.“ Ich drückte meine Hände flach auf den Tisch beiderseits des Blattes. „Ich möchte das Ganze einfach falsch gelesen haben. Ich möchte, dass sich Neil als cleverer Bösewicht entpuppt, damit es ein Fremder ist, der in die Stadt geweht wurde, und kein Freund, der hier seit dreißig Jahren lebt. Aber Wollen ist kein Beweis, Nick, das war es noch nie, und jede Tatsache, auf die ich stoße, formt dieselbe Gestalt, und diese Gestalt trägt Theos Namen in der Mitte. Die Briefe sind aus dem Archiv herausgekommen. Der Zettel ist auf dem Papier des Archivs selbst geschrieben. Und der Mann, der das Archiv leitet, ist verzweifelt. Er hat an jede ehrliche Tür geklopft und sie alle vor der Nase zugeschlagen bekommen.“ Ich schüttelte den Kopf. „Es ist eine schreckliche Gestalt. Ich hoffe immerfort, die nächste Tatsache wird sie aufbrechen. Und die nächste stattdessen nur einen weiteren Stein hineinsetzen.“</w:t>
-      </w:r>
-    </w:p>
-    <w:p/>
-    <w:p>
-      <w:r>
-        <w:t>„Dann stelle sie auf die Probe“, sagte Nick, „anstatt hier in der Küche zu sitzen und dich davor zu fürchten, was noch nie etwas gelöst hat und es auch nie tun wird. Geh und sieh dir das Einzige an, das du dir noch nicht richtig angesehen hast. Die Briefe selbst oder den Ort, an dem sie sein müssten.“ Er streckte die Hand über den Tisch aus und legte seine warme Hand flach über meine kalte. „Theo könnte ein paar helfende Hände gebrauchen, um dieses Archiv in Ordnung zu bringen. Geh und biete sie ihm an. Und während du hilfst, finde eine einzige Sache heraus: ob die Worte in jenem Zettel mit den Worten in den Briefen übereinstimmen, die verschwunden sind. Denn wenn sie das tun, Jess, dann hat derjenige, der den Zettel geschrieben hat, nicht nur ganz allgemein die Blackburn-Papiere gelesen. Er hatte genau diese Briefe in seinen Händen. Und es gibt einen sehr kurzen Kreis von Leuten in Frost Falls, von denen sich das sagen lässt.“</w:t>
+        <w:t xml:space="preserve">„Ich will, dass es überhaupt niemand ist.“ Ich drückte meine Hände flach auf den Tisch beiderseits des Blattes. „Ich möchte das Ganze einfach falsch gelesen haben. Ich möchte, dass sich Neil als cleverer Bösewicht entpuppt, damit es ein Fremder ist, der in die Stadt geweht wurde, und kein Freund, der hier seit dreißig Jahren lebt. Aber Wollen ist kein Beweis, Nick, das war es noch nie, und jede Tatsache, auf die ich stoße, formt dieselbe Gestalt, und diese Gestalt trägt Theos Namen in der Mitte. Die Briefe sind aus dem Archiv herausgekommen. Der Zettel ist auf dem Papier des Archivs selbst geschrieben. Und der Mann, der das Archiv leitet, ist verzweifelt. Er hat an jede ehrliche Tür geklopft und sie alle vor der Nase zugeschlagen bekommen.“ Ich schüttelte den Kopf. „Es ist eine schreckliche Gestalt. Ich hoffe immerfort, die nächste Tatsache wird sie aufbrechen. Und die nächste setzt stattdessen nur einen weiteren Stein hinein.“</w:t>
+      </w:r>
+    </w:p>
+    <w:p/>
+    <w:p>
+      <w:r>
+        <w:t xml:space="preserve">„Dann stelle sie auf die Probe“, sagte Nick, „anstatt hier in der Küche zu sitzen und dich davor zu fürchten, was noch nie etwas gelöst hat und es auch nie tun wird. Geh und sieh dir das Einzige an, das du dir noch nicht richtig angesehen hast. Die Briefe selbst oder den Ort, an dem sie sein müssten.“ Er streckte die Hand über den Tisch aus und legte seine warme Hand flach über meine kalte. „Theo könnte ein paar helfende Hände gebrauchen, um dieses Archiv in Ordnung zu bringen. Geh und biete sie ihm an. Und während du hilfst, finde eine einzige Sache heraus: ob die Worte in jenem Zettel mit den Worten in den Briefen übereinstimmen, die verschwunden sind. Denn wenn sie das tun, Jess, dann hat derjenige, der den Zettel geschrieben hat, nicht nur ganz allgemein die Blackburn-Papiere gelesen. Er hatte genau diese Briefe in seinen Händen. Und es gibt einen sehr kleinen Kreis von Leuten in Frost Falls, von denen sich das sagen lässt.“</w:t>
       </w:r>
     </w:p>
     <w:p/>
@@ -2907,7 +2907,7 @@
     <w:p/>
     <w:p>
       <w:r>
-        <w:t>„Bald“, sagte ich. „Zuerst müssen noch zwei Fäden verknüpft werden. Sam und der Fremde. Ich möchte, dass sie beide ganz sicher verschwunden sind, über jeden Zweifel erhaben entlastet, bevor ich es wage, in dieses Archiv zu gehen und Theo scharf unter die Lupe zu nehmen. Das bin ich ihm schuldig – ihn erst dann ins Visier zu nehmen, wenn niemand sonst mehr übrig ist, den man verdächtigen könnte. Und dann gehe ich hin, sehe mir die Briefe an und finde heraus, ob die Worte übereinstimmen.“</w:t>
+        <w:t xml:space="preserve">„Bald“, sagte ich. „Zuerst müssen noch zwei Fäden verknüpft werden. Sam und der Fremde. Ich möchte, dass sie beide ganz sicher vom Tisch sind, über jeden Zweifel erhaben entlastet, bevor ich es wage, in dieses Archiv zu gehen und Theo scharf unter die Lupe zu nehmen. Das bin ich ihm schuldig – ihn erst dann ins Visier zu nehmen, wenn niemand sonst mehr übrig ist, den man verdächtigen könnte. Und dann gehe ich hin, sehe mir die Briefe an und finde heraus, ob die Worte übereinstimmen.“</w:t>
       </w:r>
     </w:p>
     <w:p/>
@@ -2945,7 +2945,7 @@
     </w:p>
     <w:p>
       <w:r>
-        <w:t>„Sam, ich schulde Ihnen etwas.“ Ich hatte mir den ganzen Weg dorthin überlegt, wie ich das anstellen sollte, und mich für die Wahrheit entschieden, oder für so viel davon, wie zu geben mir zustand. Ich hatte diesen guten Menschen verdächtigt, und der einzig ehrliche Weg, das wiedergutzumachen, bestand darin, ihm im Gegenzug einen Teil der Sache anzuvertrauen. „Können wir eine Minute lang gehen? Weg von den Fenstern.“</w:t>
+        <w:t xml:space="preserve">„Sam, ich schulde Ihnen etwas.“ Ich hatte mir den ganzen Weg dorthin überlegt, wie ich das anstellen sollte, und mich für die Wahrheit entschieden, oder für so viel davon, wie zu geben mir zustand. Ich hatte diesen guten Menschen verdächtigt, und der einzig ehrliche Weg, das wiedergutzumachen, bestand darin, ihm im Gegenzug einen Teil der Sache anzuvertrauen. „Können wir kurz ein paar Schritte gehen? Weg von den Fenstern.“</w:t>
       </w:r>
     </w:p>
     <w:p>
@@ -2955,7 +2955,7 @@
     </w:p>
     <w:p>
       <w:r>
-        <w:t>Wir gingen zum ruhigen Ende der Veranda hinunter, außer Hörweite des Foyers, wo die Morgensonne noch nicht hingelangt hatte und unser Atem in der Luft zu sehen war. Ich erzählte es ihm. Nicht alles. Aber die Umrisse. Dass Fiona in echten Schwierigkeiten steckte. Dass jemand sie wegen einer alten Familiensache bedrohte, etwas, das seit hundert Jahren vorbei und überhaupt nicht ihre Schuld war. Dass das der Grund war, warum sie seltsam und blass geworden war, warum sie ihn nicht bezahlen konnte, warum sie ihm nicht in die Augen sehen konnte. Dass sie Angst hatte, Sam, nicht kalt. Niemals kalt.</w:t>
+        <w:t xml:space="preserve">Wir gingen zum ruhigen Ende der Veranda hinunter, außer Hörweite des Foyers, wo die Morgensonne noch nicht hingelangt hatte und unser Atem in der Luft zu sehen war. Ich erzählte es ihm. Nicht alles. Aber die Umrisse. Dass Fiona in echten Schwierigkeiten steckte. Dass jemand sie wegen einer alten Familiensache bedrohte, etwas, das seit hundert Jahren vorbei und überhaupt nicht ihre Schuld war. Dass das der Grund war, warum sie seltsam und blass geworden war, warum sie ihn nicht bezahlen konnte, warum sie ihm nicht in die Augen sehen konnte. Dass sie Angst hatte, Sam, nicht abweisend war. Niemals abweisend.</w:t>
       </w:r>
     </w:p>
     <w:p>
@@ -2990,12 +2990,12 @@
     </w:p>
     <w:p>
       <w:r>
-        <w:t>„Achten Sie auf den Empfangsschreibtisch“, sagte ich ihm, da er gefragt hatte und da er sich eine ehrliche Antwort mehr als verdient hatte. „Das Fest ist an diesem Wochenende, und der Gasthof wird den ganzen Tag über voller Fremder sein, die ein- und ausgehen. Wenn jemand etwas auf diesem Schreibtisch abgibt und schnell verschwindet, inmitten all der Menschen, prägen Sie sich mir das Gesicht ein. Sie haben scharfe Augen, und Sie werden ohnehin hier auf dieser Leiter stehen. Das ist alles, was ich will. Halten Sie sie nicht auf, sagen Sie kein Wort, lassen Sie sich nichts anmerken. Merken Sie sich einfach das Gesicht.“</w:t>
-      </w:r>
-    </w:p>
-    <w:p>
-      <w:r>
-        <w:t>„Das kriege ich hin.“ Er drückte meine Hand, eisenbergig und warm. „Und Mrs. Claus. Was immer das kosten mag, um das in Ordnung zu bringen. Wenn es um Geld geht, wenn sie Geld braucht, um sicher zu sein, sagen Sie ihr, die Schmiede in drei Countys stehen bei mir in der Schuld, und ich werde jeden einzelnen von ihnen um einen Gefallen bitten und nicht zweimal darüber nachdenken. Sagen Sie ihr das auch, wenn Sie ihr von den zwanzig Dollar erzählen.“</w:t>
+        <w:t xml:space="preserve">„Achten Sie auf den Empfangsschreibtisch“, sagte ich ihm, da er gefragt hatte und da er sich eine ehrliche Antwort mehr als verdient hatte. „Das Fest ist an diesem Wochenende, und der Gasthof wird den ganzen Tag über voller Fremder sein, die ein- und ausgehen. Wenn jemand etwas auf diesem Schreibtisch abgibt und schnell verschwindet, inmitten all der Menschen, prägen Sie sich für mich das Gesicht ein. Sie haben scharfe Augen, und Sie werden ohnehin hier auf dieser Leiter stehen. Das ist alles, was ich will. Halten Sie sie nicht auf, sagen Sie kein Wort, lassen Sie sich nichts anmerken. Merken Sie sich einfach das Gesicht.“</w:t>
+      </w:r>
+    </w:p>
+    <w:p>
+      <w:r>
+        <w:t xml:space="preserve">„Das kriege ich hin.“ Er drückte meine Hand, eisenrau und warm. „Und Mrs. Claus. Was immer das kosten mag, um das in Ordnung zu bringen. Wenn es um Geld geht, wenn sie Geld braucht, um sicher zu sein, sagen Sie ihr, die Schmiede in drei Countys stehen bei mir in der Schuld, und ich werde jeden einzelnen von ihnen um einen Gefallen bitten und nicht zweimal darüber nachdenken. Sagen Sie ihr das auch, wenn Sie ihr von den zwanzig Dollar erzählen.“</w:t>
       </w:r>
     </w:p>
     <w:p>
@@ -3020,7 +3020,7 @@
     </w:p>
     <w:p>
       <w:r>
-        <w:t>„Echtes Kaliber“, sagte sie, noch bevor ich überhaupt Hallo sagen konnte. „Alte Kanzlei, zwei Bundesstaaten weiter, macht genau das, was dein Mann sagt: Nachlass- und Erbsachen sowie die Suche nach verlorenem Eigentum für Anwälte, die mehr Geld als Zeit haben. Und es gibt tatsächlich einen Nachlass Blackburn, Jessica, einen echten, aktuell laufenden. Der letzte Ast von Adelaide Blackburns Linie ist diesen Frühling in der Stadt gestorben, keine Kinder, kein nennenswertes Testament und ein heilloses Chaos. Unser Bürgermeister stammt aus der Verwandtschaft, von dem Zweig, der die Nase abbekommen hat, aber keinen Cent. Er hat damit nichts zu tun. Carter steht in den Büchern der Kanzlei als der Ermittler, den sie angeheuert haben, um das aufzudröseln. Ich habe es von einer Angestellten, die das Ganze bestätigte, ohne auch nur ein einziges Mal zu merken, dass sie etwas bestätigte. Er ist genau der, als den er sich dir vorgestellt hat. Ein Schnüffler mit Lizenz und Spesenkonto.“</w:t>
+        <w:t xml:space="preserve">„Echte Kanzlei“, sagte sie, noch bevor ich überhaupt Hallo sagen konnte. „Alte Kanzlei, zwei Bundesstaaten weiter, macht genau das, was er behauptet: Nachlass- und Erbsachen sowie die Suche nach verlorenem Eigentum für Anwälte, die mehr Geld als Zeit haben. Und es gibt tatsächlich einen Nachlass Blackburn, Jessica, einen echten, aktuell laufenden. Der letzte Ast von Adelaide Blackburns Linie ist diesen Frühling in der Großstadt gestorben, keine Kinder, kein nennenswertes Testament und ein heilloses Chaos. Unser Bürgermeister stammt aus der Verwandtschaft, von dem Zweig, der die Nase abbekommen hat, aber keinen Cent. Er hat damit nichts zu tun. Carter steht in den Büchern der Kanzlei als der Ermittler, den sie angeheuert haben, um das aufzudröseln. Ich habe es von einer Angestellten, die das Ganze bestätigte, ohne auch nur ein einziges Mal zu merken, dass sie etwas bestätigte. Er ist genau der, als den er sich dir vorgestellt hat. Ein Schnüffler mit Lizenz und Spesenkonto.“</w:t>
       </w:r>
     </w:p>
     <w:p>
@@ -3050,12 +3050,12 @@
     </w:p>
     <w:p>
       <w:r>
-        <w:t>Ich beobachtete sein Gesicht, während ich sprach. Auf Neil Carters Zügen spiegelte sich die offene, gierige, leicht entsetzte Faszination eines Mannes, der sein halbes Leben lang kalten, hundert Jahre alten Papierstapeln hinterhergejagt ist und dem gerade über einen Bibliothekstisch hinweg mitgeteilt wurde, dass die Spur noch heiß genug ist, um einen lebendigen Menschen zu verbrennen.</w:t>
-      </w:r>
-    </w:p>
-    <w:p>
-      <w:r>
-        <w:t>„Eine halbe Million.“ Er lehnte sich zurück und stieß ein leises Pfeifen aus. „Um Himmels willen. Da presst jemand den Nachfahren aus. Wegen einer Sache, die das Gesetz nicht mehr berühren kann.“ Er schüttelte langsam den Kopf, und darin lag Abscheu, echte Abscheu. „Das ist grausam, Mrs. Claus, und das ist dumm. Niemand könnte wegen dieser Brosche heutzutage noch Anklage erheben. Der Nachlass Blackburn will das Geld Ihrer Freundin nicht und ganz gewiss nicht ihre Haut. Er will eine einzige Zeile in einem Kassenbuch, die verrät, wo das Schmuckstück geblieben ist, damit die Anwälte die Akte schließen und aufhören können, sich gegenseitig Honorare in Rechnung zu stellen. Wer immer Ihre Freundin ausblutet, verkauft ihr eine Angst, die nicht einmal real ist. Die Scham ist die einzige Waffe daran. Da ist kein juristischer Fall mehr übrig, nicht nach hundert Jahren.“</w:t>
+        <w:t xml:space="preserve">Ich beobachtete sein Gesicht, während ich sprach. Auf Neil Carters Zügen spiegelte sich die offene, gierige, leicht entsetzte Faszination eines Mannes, der sein ganzes Berufsleben lang einer kalten, hundert Jahre alten Papierspur hinterhergejagt ist und dem gerade über einen Bibliothekstisch hinweg mitgeteilt wurde, dass die Spur noch heiß genug ist, um einen lebendigen Menschen zu verbrennen.</w:t>
+      </w:r>
+    </w:p>
+    <w:p>
+      <w:r>
+        <w:t xml:space="preserve">„Eine halbe Million.“ Er lehnte sich zurück und stieß ein leises Pfeifen aus. „Um Himmels willen. Da presst jemand die Nachfahrin aus. Wegen einer Sache, die das Gesetz nicht mehr berühren kann.“ Er schüttelte langsam den Kopf, und darin lag Abscheu, echte Abscheu. „Das ist grausam, Mrs. Claus, und das ist dumm. Niemand könnte wegen dieser Brosche heutzutage noch Anklage erheben. Der Nachlass Blackburn will das Geld Ihrer Freundin nicht und ganz gewiss nicht ihre Haut. Er will eine einzige Zeile in einem Kassenbuch, die verrät, wo das Schmuckstück geblieben ist, damit die Anwälte die Akte schließen und aufhören können, sich gegenseitig Honorare in Rechnung zu stellen. Wer immer Ihre Freundin ausblutet, verkauft ihr eine Angst, die nicht einmal real ist. Die Scham ist die einzige Waffe daran. Da ist kein juristischer Fall mehr übrig, nicht nach hundert Jahren.“</w:t>
       </w:r>
     </w:p>
     <w:p>
@@ -3095,7 +3095,7 @@
     </w:p>
     <w:p>
       <w:r>
-        <w:t>„Behalten Sie es. Ich habe von jeder Seite Kopien.“ Er hielt inne, und für einen kurzen Moment wurde das Funkeln in ihm still und sanft. „Richten Sie Ihrer Freundin von einem Mann, der beruflich die Post von Toten liest, etwas aus. Die Geheimnisse, die Menschen ins Unglück stürzen, sind die halb erzählten. Jedes verdammte Mal. Es ist das Versteckspiel, das ihnen Zähne verleiht, nicht die Wahrheit. Ich habe in meiner Karriere hundert begrabene Familiengeheimnisse ausgegraben, und jedes einzelne davon erwies sich als kleiner und trauriger, als die Familie befürchtet hatte, während sie ihr Leben lang davor zitterte.“</w:t>
+        <w:t xml:space="preserve">„Behalten Sie es. Ich habe von jeder Seite Kopien.“ Er hielt inne, und für einen kurzen Moment wurde das Funkeln in ihm still und sanft. „Richten Sie Ihrer Freundin von einem Mann, der beruflich die Post von Toten liest, etwas aus. Die Geheimnisse, die Menschen ins Unglück stürzen, sind die halb erzählten. Jedes Mal. Es ist das Versteckspiel, das ihnen Zähne verleiht, nicht die Wahrheit. Ich habe in meiner Karriere hundert begrabene Familiengeheimnisse ausgegraben, und jedes einzelne davon erwies sich als kleiner und trauriger, als die Familie befürchtet hatte, während sie ihr Leben lang davor zitterte.“</w:t>
       </w:r>
     </w:p>
     <w:p>
@@ -3122,7 +3122,7 @@
     <w:p/>
     <w:p>
       <w:r>
-        <w:t>Das Archiv war der lange hintere Raum hinter dem Ausstellungssaal, der vom Boden bis zur Decke mit Pappkartons vollgestopft war, und es glich, wie Theo bei der Eröffnung vor dem ganzen Ort gestanden hatte, einem herrlich aufgetakelten Wrack. Er empfand mich dort aschfahl und dankbar, mit demselben schiefen Krawattenknoten, und setzte mich an den Arbeitstisch, um einen Stapel Haushaltsakten zu sortieren, während er am anderen Ende des Raumes arbeitete. Fast eine Stunde lang arbeiteten wir in der vertrauten Stille zweier Menschen, die beide Ordnung lieben und die beide, auf ihre Art, durch das Schaffen derselben beruhigt werden. Pip bezog einen Posten auf einem niedrigen Kartonstapel neben mir und behielt die Messing-Büroklammern in meiner Schale scharf im Auge. Für diese eine Stunde vergaß ich fast, weshalb ich überhaupt gekommen war.</w:t>
+        <w:t xml:space="preserve">Das Archiv war der lange hintere Raum hinter dem Ausstellungssaal, der vom Boden bis zur Decke mit Pappkartons vollgestopft war, und es glich, wie Theo bei der Eröffnung vor dem ganzen Ort gestanden hatte, einem herrlich aufgetakelten Wrack. Er empfing mich dort aschfahl und dankbar, mit demselben schiefen Krawattenknoten, und setzte mich an den Arbeitstisch, um einen Stapel Haushaltsakten zu sortieren, während er am anderen Ende des Raumes arbeitete. Fast eine Stunde lang arbeiteten wir in der vertrauten Stille zweier Menschen, die beide Ordnung lieben und die beide, auf ihre Art, durch das Schaffen derselben beruhigt werden. Pip bezog einen Posten auf einem niedrigen Kartonstapel neben mir und behielt die Messing-Büroklammern in meiner Schale scharf im Auge. Für diese eine Stunde vergaß ich fast, weshalb ich überhaupt gekommen war.</w:t>
       </w:r>
     </w:p>
     <w:p/>
@@ -3134,7 +3134,7 @@
     <w:p/>
     <w:p>
       <w:r>
-        <w:t xml:space="preserve">Theo führte ein Register, wie es sich für einen guten Archivar gehrte, eine lange, flache Schublade voller Karteikarten, eine Karte für jeden Bestand im Haus, auf jeder eine kurze Zusammenfassung in seiner kleinen, geneigten Handschrift darüber, was in der jeweiligen Mappe zu finden war. Ich hatte mich angeboten, einen Stapel Karten, die durcheinandergeraten waren, wieder einzusortieren. Ich arbeitete mich gerade durch die B-Karten – Bäckereiquittungen, Musikpavillon-Spenden –, als ich zu den Karten für die Papiere der Familie Blackburn kam und darunter drei fand, auf denen ganz oben mit Rotstift stand: </w:t>
+        <w:t xml:space="preserve">Theo führte ein Register, wie es sich für einen guten Archivar gehörte, eine lange, flache Schublade voller Karteikarten, eine Karte für jeden Bestand im Haus, auf jeder eine kurze Zusammenfassung in seiner kleinen, geneigten Handschrift darüber, was in der jeweiligen Mappe zu finden war. Ich hatte mich angeboten, einen Stapel Karten, die durcheinandergeraten waren, wieder einzusortieren. Ich arbeitete mich gerade durch die B-Karten – Bäckereiquittungen, Musikpavillon-Spenden –, als ich zu den Karten für die Papiere der Familie Blackburn kam und darunter drei fand, auf denen ganz oben mit Rotstift stand: </w:t>
       </w:r>
       <w:r>
         <w:rPr>
@@ -3158,7 +3158,7 @@
         <w:rPr>
           <w:i/>
         </w:rPr>
-        <w:t>Korrespondenz, Adelaide Blackburn an ihre Schwester, Winter 1924. Betr.: Der Diebstahl der Brosche der Familie (der Saphir im Herzen) durch eine Hausangestellte; das Stück später bei Ridgeline verpfändet. Von erheblichem ortsgeschichtlichem Interesse.</w:t>
+        <w:t xml:space="preserve">Korrespondenz, Adelaide Blackburn an ihre Schwester, Winter 1924. Betr.: Der Diebstahl der Brosche der Familie (der Saphir im Herzen) durch eine Hausangestellte; das Stück später in Ridgeline verpfändet. Von erheblichem ortsgeschichtlichem Interesse.</w:t>
       </w:r>
     </w:p>
     <w:p/>
@@ -3188,7 +3188,7 @@
     <w:p/>
     <w:p>
       <w:r>
-        <w:t>Ich zwang mich zu atmen. Ich zwang mich dazu, die drei rot markierten Karten zu den anderen zu legen und weiterzusortieren – B, B, Bridge-Turnier, Wimpelketten, Überschuss –, als hätte sich der Boden des Raumes gerade unauffällig unter meinem Stuhl geöffnet. Am anderen Ende des Raumes summte Theo vor sich hin, verschob einen Karton und sagte etwas über den Heizkessel, worauf ich antwortete, ohne meine eigene Antwort zu hören. Der Mann am anderen Ende des Raumes, der gütigste Mann in Frost Falls, der den guten Kakao mit den kleinen Marshmallows aus eigener Tasche kaufte, damit die Kinder nicht heranwuchsen, ohne die Geschichten ihrer Stadt zu kennen, hatte die Briefe geschrieben, die Fiona in Angst und Schrecken versetzten. Oder seine Sorgfalt bei der Aufbewahrung dieser Briefe hatte jemand anderem erlaubt, sie zu schreiben, jemandem von einer so kurzen Liste, dass sein Name ganz oben stand, in seiner sorgfältigen Handschrift.</w:t>
+        <w:t xml:space="preserve">Ich zwang mich zu atmen. Ich zwang mich dazu, die drei rot markierten Karten zu den anderen zu legen und weiterzusortieren – B, B, Bridge-Turnier, Wimpelketten, Überschuss –, als hätte sich der Boden des Raumes nicht gerade unauffällig unter meinem Stuhl geöffnet. Am anderen Ende des Raumes summte Theo vor sich hin, verschob einen Karton und sagte etwas über den Heizkessel, worauf ich antwortete, ohne meine eigene Antwort zu hören. Der Mann am anderen Ende des Raumes, der gütigste Mann in Frost Falls, der den guten Kakao mit den kleinen Marshmallows aus eigener Tasche kaufte, damit die Kinder nicht heranwuchsen, ohne die Geschichten ihrer Stadt zu kennen, hatte die Briefe geschrieben, die Fiona in Angst und Schrecken versetzten. Oder seine Sorgfalt bei der Aufbewahrung dieser Briefe hatte jemand anderem erlaubt, sie zu schreiben, jemandem von einer so kurzen Liste, dass sein Name ganz oben stand, in seiner sorgfältigen Handschrift.</w:t>
       </w:r>
     </w:p>
     <w:p/>
@@ -3224,7 +3224,7 @@
     <w:p/>
     <w:p>
       <w:r>
-        <w:t>„Ich weiß, dass es von ihm oder durch ihn kam.“ Meine Stimme klang rau. „Ich weiß, dass jeder, der diesen Zettel geschrieben hat, Theos eigene Worte über die Brosche gelesen hat. Und ich weiß, dass es nur eine kurze Liste von Leuten gibt, die das gekonnt hätten, und sein Name steht ganz oben drauf, mit Rotstift, in seiner eigenen Handschrift.“ Ich zog die Decke enger um mich. „Ich sehe ihn immer noch vor mir, wie er eben an der Tür stand. Vierzig neue Mitglieder. So glücklich. Nick, wie macht ein Mann so etwas? Wie kann er Fiona im Dunkeln das antun und morgens den Kindern ihren Kakao bringen und beides ernst meinen, in derselben Woche, mit denselben Händen?“</w:t>
+        <w:t xml:space="preserve">„Ich weiß, dass es von ihm oder durch ihn kam.“ Meine Stimme klang rau. „Ich weiß, dass derjenige, der diesen Zettel geschrieben hat, Theos eigene Worte über die Brosche gelesen hat. Und ich weiß, dass es nur eine kurze Liste von Leuten gibt, die das gekonnt hätten, und sein Name steht ganz oben drauf, mit Rotstift, in seiner eigenen Handschrift.“ Ich zog die Decke enger um mich. „Ich sehe ihn immer noch vor mir, wie er eben an der Tür stand. Vierzig neue Mitglieder. So glücklich. Nick, wie macht ein Mann so etwas? Wie kann er Fiona im Dunkeln das antun und morgens den Kindern ihren Kakao bringen und beides ernst meinen, in derselben Woche, mit denselben Händen?“</w:t>
       </w:r>
     </w:p>
     <w:p/>
@@ -3236,7 +3236,7 @@
     <w:p/>
     <w:p>
       <w:r>
-        <w:t>Ich saß da und ließ das auf mich wirken. Es stimmte, und es half nicht. Nick wusste, dass es das nicht tun würde, und ließ es mir trotzdem durchgehen.</w:t>
+        <w:t xml:space="preserve">Ich saß da und ließ das auf mich wirken. Es stimmte, und es half nicht. Nick wusste, dass es das nicht tun würde, und gab es mir trotzdem mit.</w:t>
       </w:r>
     </w:p>
     <w:p/>
@@ -3248,7 +3248,7 @@
     <w:p/>
     <w:p>
       <w:r>
-        <w:t>Plötzlich erstrahlte es golden an den Fenstern, obwohl es draußen stockdunkel war und das schon seit einer Stunde. Warm und fließend strömte es von draußen hinter dem Koppel her, aus der Werkstatt, hell genug, um die Schatten der Fensterrahmen als lange Goldbalken auf den Küchenboden zu werfen. Pip erhob sich von der Feuerstelle. Von draußen drang, schwach und klar, ein Geräusch an mein Ohr wie von vielen fernen Glocken oder einem großen Feuer, das auf einmal in sich zusammensackte.</w:t>
+        <w:t xml:space="preserve">Plötzlich erstrahlte es golden an den Fenstern, obwohl es draußen stockdunkel war und das schon seit einer Stunde. Warm und fließend strömte es von draußen hinter der Koppel her, aus der Werkstatt, hell genug, um die Schatten der Fensterrahmen als lange Goldbalken auf den Küchenboden zu werfen. Pip erhob sich von der Feuerstelle. Von draußen drang, schwach und klar, ein Geräusch an mein Ohr wie von vielen fernen Glocken oder einem großen Feuer, das auf einmal in sich zusammensackte.</w:t>
       </w:r>
     </w:p>
     <w:p/>
@@ -3266,31 +3266,31 @@
     <w:p/>
     <w:p>
       <w:r>
-        <w:t>Ich nahm seine Hand, und wir gingen hinaus über den kalten, silbernen Hof, während das Gold mit jedem Schritt heller aufspritzte und Pip vor uns herwatschelte. Nick legte die Hand auf die Werkstatttür und öffnete sie.</w:t>
-      </w:r>
-    </w:p>
-    <w:p/>
-    <w:p>
-      <w:r>
-        <w:t>In der Mitte des Raumes, wo früher der alte Herdstock gestanden hätte, hatte er einen großen Kamin aus Feldsteinen errichtet, runde Flusssteine, einer auf den anderen von Hand aufgeschichtet. Es brannte kein Feuer darin. Der Rost blieb kalt und leer, und dennoch glühte er. Das warme Gold strömte aus dem nackten Stein selbst hervor. Der heimatlose Zauber, der von Haus zu Haus durch ganz Frost Falls gezogen war, hatte sich zum Teil hier eingefunden und zog langsame Kreise in der warmen Luft über dem leeren Rost, wie ein müdes Geschöpf, das endlich einen Ort gefunden hat, an dem es sich vielleicht eines Tages niederlegen darf.</w:t>
-      </w:r>
-    </w:p>
-    <w:p/>
-    <w:p>
-      <w:r>
-        <w:t>„Ein Kamin“, sagte ich, kaum lauter als ein Flüstern.</w:t>
-      </w:r>
-    </w:p>
-    <w:p/>
-    <w:p>
-      <w:r>
-        <w:t>„Ein Kamin.“ Sein Arm legte sich um mich. „Er ist noch nicht fertig. Er kann es noch nicht halten, noch nicht ganz, nicht für immer. Das sind jahrelange Arbeit, Jess. Aber es ist ein Anfang. Ein Ort, an den er kommen kann. Damit er aufhört, das Dunkel zu durchstreifen.“ Er blickte auf mich herab, und das goldene Licht spielte auf seinem Gesicht. „Ich wollte, dass du es heute Abend siehst, weil du eine schreckliche Last trägst, und ich nicht wollte, dass du durch die Gegend läufst und denkst, die ganze Welt bestehe nur aus Menschen, die im Dunkeln Unheil anrichten. Einige von uns sind eben auch draußen im Dunkeln und bauen Orte, an denen die Wärme landen kann.“</w:t>
-      </w:r>
-    </w:p>
-    <w:p/>
-    <w:p>
-      <w:r>
-        <w:t>Ich stand im Schein des unbefeuerten Feuers und erlaubte mir schließlich, ein wenig zu weinen – um Theo, um Fiona und um das ganze schreckliche, verwickelte Durcheinander. Nick hielt mich fest. Über uns zog der Zauber seine langsamen goldenen Kreise, auf der Suche nach einer Heimat, und fing gerade erst an, sie zu finden.</w:t>
+        <w:t xml:space="preserve">Ich nahm seine Hand, und wir gingen hinaus über den kalten, silbernen Hof, während das Gold mit jedem Schritt heller hervorquoll und Pip vor uns herwatschelte. Nick legte die Hand auf die Werkstatttür und öffnete sie.</w:t>
+      </w:r>
+    </w:p>
+    <w:p/>
+    <w:p>
+      <w:r>
+        <w:t xml:space="preserve">In der Mitte des Raumes, wo der alte Herd am Pol gestanden hätte, hatte er einen großen Kamin aus Feldsteinen errichtet, runde Flusssteine, einer auf den anderen von Hand aufgeschichtet. Es brannte kein Feuer darin. Der Rost blieb kalt und leer, und dennoch glühte er. Das warme Gold strömte aus dem nackten Stein selbst hervor. Der heimatlose Zauber, der von Haus zu Haus durch ganz Frost Falls gezogen war, hatte sich zum Teil hier eingefunden und zog langsame Kreise in der warmen Luft über dem leeren Rost, wie ein müdes Geschöpf, das endlich einen Ort gefunden hat, an dem es sich vielleicht eines Tages niederlegen darf.</w:t>
+      </w:r>
+    </w:p>
+    <w:p/>
+    <w:p>
+      <w:r>
+        <w:t xml:space="preserve">„Eine Herdstelle“, sagte ich, kaum lauter als ein Flüstern.</w:t>
+      </w:r>
+    </w:p>
+    <w:p/>
+    <w:p>
+      <w:r>
+        <w:t xml:space="preserve">„Eine Herdstelle.“ Sein Arm legte sich um mich. „Sie ist noch nicht fertig. Sie kann es noch nicht halten, noch nicht ganz, nicht für immer. Das ist jahrelange Arbeit, Jess. Aber es ist ein Anfang. Ein Ort, an den er kommen kann. Damit er aufhört, das Dunkel zu durchstreifen.“ Er blickte auf mich herab, und das goldene Licht spielte auf seinem Gesicht. „Ich wollte, dass du es heute Abend siehst, weil du eine schreckliche Last trägst, und ich nicht wollte, dass du durch die Gegend läufst und denkst, die ganze Welt bestehe nur aus Menschen, die im Dunkeln Unheil anrichten. Einige von uns sind eben auch draußen im Dunkeln und bauen Orte, an denen die Wärme landen kann.“</w:t>
+      </w:r>
+    </w:p>
+    <w:p/>
+    <w:p>
+      <w:r>
+        <w:t xml:space="preserve">Ich stand im Schein des unentzündeten Feuers und erlaubte mir schließlich, ein wenig zu weinen – um Theo, um Fiona und um das ganze schreckliche, verwickelte Durcheinander. Nick hielt mich fest. Über uns zog der Zauber seine langsamen goldenen Kreise, auf der Suche nach einer Heimat, und fing gerade erst an, sie zu finden.</w:t>
       </w:r>
     </w:p>
     <w:p/>
@@ -3318,7 +3318,7 @@
     <w:p/>
     <w:p>
       <w:r>
-        <w:t>Männer trugen Klapptische auf den Dorfanger, als ich die Evergreen Street herunterkam. Am Gasthof kam Vera Reed gerade die Stufen der Veranda herab, während ich hinaufging; sie trug eine Segeltuchtasche über der Schulter und ein Klemmbrett unter dem Arm, und gegen die Kälte war sie bis zum Kinn zugeknöpft wie bei der Ausstellung.</w:t>
+        <w:t xml:space="preserve">Männer trugen Klapptische auf den Dorfanger, als ich die Evergreen Avenue herunterkam. Am Gasthof kam Vera Reed gerade die Stufen der Veranda herab, während ich hinaufging; sie trug eine Segeltuchtasche über der Schulter und ein Klemmbrett unter dem Arm, und gegen die Kälte war sie bis zum Kinn zugeknöpft wie bei der Ausstellung.</w:t>
       </w:r>
     </w:p>
     <w:p>
@@ -3359,7 +3359,7 @@
         <w:rPr>
           <w:i/>
         </w:rPr>
-        <w:t>Das Fest endet Sonntag. Habt das Geld bis dahin bereit, oder die ganze Stadt liest am Montagmorgen von eurer Familie. Rote Schleife an den Kranz, wenn es erledigt ist. Seid diesbezüglich nicht dumm.</w:t>
+        <w:t xml:space="preserve">Das Fest endet Sonntag. Hab das Geld bis dahin bereit, oder die ganze Stadt liest am Montagmorgen von deiner Familie. Rote Schleife an den Kranz, wenn es erledigt ist. Sei diesbezüglich nicht dumm.</w:t>
       </w:r>
     </w:p>
     <w:p>
@@ -3374,7 +3374,7 @@
     </w:p>
     <w:p>
       <w:r>
-        <w:t>„Nein“, sagte ich, während ich den Zettel in meinen Händen wendete und ihn noch einmal las. „Er will, dass du so verängstigt bist, dass du auftreibst, was es nicht gibt. Leute, die nie wirklich verzweifelt waren, glauben, die Verzweifelten könnten sich irgendwie immer Geld herbeizaubern, wenn man sie nur fest genug auspresst. Er glaubt, es gibt eine reiche Verwandtschaft, um die zu bitten du zu stolz warst. Er glaubt, du wirst etwas verkaufen, etwas beliehen, zu den Worthingtons auf die Knie gehen. Er glaubt, die Angst selbst wird das Geld locker machen wie Münzen aus einer Tasche, die man auf den Kopf stellt.“ Ich blickte zu ihr auf. „Und das verrät mir etwas über ihn, Fiona, ob er es nun verraten wollte oder nicht. Es verrät mir, dass er ebenfalls verzweifelt ist. Wohlhabende Leute stellen sich nicht vor, dass Geld unter Druck entsteht, weil Geld für sie noch nie entstehen musste, es war einfach immer da. Nur jemand, der es in einem harten Monat irgendwie hat herbeischaffen müssen, denkt so. Der Zettel hat mich tagelang an deiner Stelle in Angst versetzt. Erst jetzt kommt mir der Gedanke, ein wenig auch um ihn zu bangen, wer immer er auch sein mag.“</w:t>
+        <w:t xml:space="preserve">„Nein“, sagte ich, während ich den Zettel in meinen Händen wendete und ihn noch einmal las. „Er will, dass du so verängstigt bist, dass du auftreibst, was es nicht gibt. Leute, die nie wirklich verzweifelt waren, glauben, die Verzweifelten könnten sich irgendwie immer Geld herbeizaubern, wenn man sie nur fest genug auspresst. Er glaubt, es gibt eine reiche Verwandtschaft, um die zu bitten du zu stolz warst. Er glaubt, du wirst etwas verkaufen, etwas beleihen, zu den Worthingtons auf die Knie gehen. Er glaubt, die Angst selbst wird das Geld locker machen wie Münzen aus einer Tasche, die man auf den Kopf stellt.“ Ich blickte zu ihr auf. „Und das verrät mir etwas über ihn, Fiona, ob er es nun verraten wollte oder nicht. Es verrät mir, dass er ebenfalls verzweifelt ist. Wohlhabende Leute stellen sich nicht vor, dass Geld unter Druck entsteht, weil Geld für sie noch nie entstehen musste, es war einfach immer da. Nur jemand, der es in einem harten Monat irgendwie hat herbeischaffen müssen, denkt so. Der Zettel hat mich tagelang an deiner Stelle in Angst versetzt. Erst jetzt kommt mir der Gedanke, ein wenig auch um ihn zu bangen, wer immer er auch sein mag.“</w:t>
       </w:r>
     </w:p>
     <w:p>
@@ -3384,7 +3384,7 @@
     </w:p>
     <w:p>
       <w:r>
-        <w:t>Ich hatte einen Blick. Ich habe anscheinend immer einen Blick. Und ich wusste es ja auch, oder nah genug dran, dass das Fast-Wissen nur eine Frage des Wie und des Alleinseins war. Aber ich war noch nicht so weit, seinen Namen in diesem kleinen Raum laut auszusprechen. Theo Hussein gegenüber Fiona laut auszusprechen, würde etwas einen Hang hinabrollen lassen, das ich nicht wieder nach oben rufen konnte, und ich wollte mir völlig sicher sein und wissen, wie man es behutsam anstellt, bevor ich es ins Rollen brachte.</w:t>
+        <w:t xml:space="preserve">Ich hatte einen Blick. Ich habe anscheinend immer einen Blick. Und ich wusste es ja auch, oder nah genug dran, dass das Fast-Wissen nur eine Frage des Wie und des Ob-allein war. Aber ich war noch nicht so weit, seinen Namen in diesem kleinen Raum laut auszusprechen. Theo Hussein gegenüber Fiona laut auszusprechen, würde etwas einen Hang hinabrollen lassen, das ich nicht wieder nach oben rufen konnte, und ich wollte mir völlig sicher sein und wissen, wie man es behutsam anstellt, bevor ich es ins Rollen brachte.</w:t>
       </w:r>
     </w:p>
     <w:p>
@@ -3414,7 +3414,7 @@
     </w:p>
     <w:p>
       <w:r>
-        <w:t>Das klärte das Ortliche ohne jeden Zweifel und fast auch das Wer. Es lag kalt und schwer in mir, denn ich wusste nach dem Archiv bereits, durch wessen Hände diese Briefe gegangen waren. Aber als ich da in dem frostigen kleinen Zimmer saß, stieß ich auf etwas, das nicht passte und sich durch kein Wenden glätten lassen wollte.</w:t>
+        <w:t xml:space="preserve">Das klärte das Wo ohne jeden Zweifel und fast auch das Wer. Es lag kalt und schwer in mir, denn ich wusste nach dem Archiv bereits, durch wessen Hände diese Briefe gegangen waren. Aber als ich da in dem frostigen kleinen Zimmer saß, stieß ich auf etwas, das nicht passte und sich durch kein Wenden glätten lassen wollte.</w:t>
       </w:r>
     </w:p>
     <w:p>
@@ -3428,7 +3428,7 @@
         <w:t>Er ist in meine Eingangshalle gelaufen. Er stand an meinem eigenen Tresen. Er hat es zwischen meine Briefe gelegt und ist weggegangen, und ich habe es nie gesehen.</w:t>
       </w:r>
       <w:r>
-        <w:t xml:space="preserve"> Ich versuchte, den Mann, den ich inzwischen für den Verfasser hielt, in dieses Bild einzufügen, versuchte mir vorzustellen, wie er am helllichten Tag die geschäftige Lobby durchquert, einen Umschlag auf dem Empfangstresen ablegt und unbemerkt davonspaziert. Und ich brachte dieses Bild nicht zur Deckung. Nicht bei ihm. Er war zu bekannt in dieser Stadt, zu sehr beobachtet, an jeder Straßenecke zu oft angehalten. Er konnte Frost Falls nicht durchqueren, ohne dass vier Leute nach seinem Ärmel griffen, um über die Gründung der Kirche zu streiten. Er konnte in einem überfüllten Raum nichts Heimliches tun.</w:t>
+        <w:t xml:space="preserve"> Ich versuchte, den Mann, den ich inzwischen für den Verfasser hielt, in dieses Bild einzufügen, versuchte mir vorzustellen, wie er am helllichten Tag die geschäftige Lobby durchquert, einen Umschlag auf dem Empfangstresen ablegt und unbemerkt davonspaziert. Und ich brachte dieses Bild nicht zur Deckung. Nicht bei ihm. Er war zu bekannt in dieser Stadt, zu sehr beobachtet, an jeder Straßenecke zu oft angehalten. Er konnte in Frost Falls keinen Raum durchqueren, ohne dass vier Leute nach seinem Ärmel griffen, um über die Gründung der Kirche zu streiten. Er konnte in einem überfüllten Raum nichts Heimliches tun.</w:t>
       </w:r>
     </w:p>
     <w:p>
@@ -3448,7 +3448,7 @@
     </w:p>
     <w:p>
       <w:r>
-        <w:t>I ging hinaus in die Kälte, dicht gefolgt von der watschelnden Pip, während über unseren Köpfen die Festbanner flatterten. Ich musste mich nicht länger fragen, wer diese Briefe gelesen hatte. Nun musste ich herausfinden, wie viele Hände sie getragen hatten. Und dann, als das Schlimmste von allem, musste ich entscheiden, was um alles in der Welt ich mit der Antwort anfangen sollte.</w:t>
+        <w:t xml:space="preserve">Ich ging hinaus in die Kälte, dicht gefolgt von der watschelnden Pip, während über unseren Köpfen die Festbanner flatterten. Ich musste mich nicht länger fragen, wer diese Briefe gelesen hatte. Nun musste ich herausfinden, wie viele Hände sie getragen hatten. Und dann, als das Schlimmste von allem, musste ich entscheiden, was um alles in der Welt ich mit der Antwort anfangen sollte.</w:t>
       </w:r>
     </w:p>
     <w:p>
@@ -3468,7 +3468,7 @@
     </w:p>
     <w:p>
       <w:r>
-        <w:t>Pip war eine Sensation. Das hatte ich gewusst. Fiona hatte in einer Ecke der Veranda des Gasthofs eine Fotokabine eingerichtet – einen Stuhl, eine bemalte Winterkulisse und einen Korb voller gestrickter Schals –, und für einen Dollar zugunsten des Historischen Vereins konnte man sich mit dem Pinguin vom Nordpol persönlich ablichten lassen. Die Schlange reichte den ganzen Nachmittag über an der Veranda entlang und die Stufen hinab. Pip trug für jedes Foto einen anderen Schal und nahm die Anbetung als ihr ureigenerstes Recht hin. Sie lehnte jedes Stück Mürbeteig, das die Kinder ihr unter dem Tisch zustecken wollten, mit großer Würde ab. Die Dollarscheine stapelten sich im Glas, und das war das erste Geld, das der Verein seit Olivias Kassette eingenommen hatte. Es würde sie nicht retten. Ein Glas voller Dollarscheine konnte ein Gebäude nicht retten. Aber es war etwas, und es war warm. Fiona stand neben der Kabine, nahm die Dollars entgegen und lächelte ein echtes Lächeln, und für einen Nachmittag sah sie wieder aus wie sie selbst.</w:t>
+        <w:t xml:space="preserve">Pip war eine Sensation. Das hatte ich gewusst. Fiona hatte in einer Ecke der Veranda des Gasthofs eine Fotokabine eingerichtet – einen Stuhl, eine bemalte Winterkulisse und einen Korb voller gestrickter Schals –, und für einen Dollar zugunsten des Historischen Vereins konnte man sich mit dem Pinguin vom Nordpol persönlich ablichten lassen. Die Schlange reichte den ganzen Nachmittag über an der Veranda entlang und die Stufen hinab. Pip trug für jedes Foto einen anderen Schal und nahm die Anbetung als ihr ureigenstes Recht hin. Sie lehnte jedes Stück Mürbegebäck, das die Kinder ihr unter dem Tisch zustecken wollten, mit großer Würde ab. Die Dollarscheine stapelten sich im Glas, und das war das erste Geld, das der Verein seit Olivias Kassette eingenommen hatte. Es würde sie nicht retten. Ein Glas voller Dollarscheine konnte ein Gebäude nicht retten. Aber es war etwas, und es war warm. Fiona stand neben der Kabine, nahm die Dollars entgegen und lächelte ein echtes Lächeln, und für einen Nachmittag sah sie wieder aus wie sie selbst.</w:t>
       </w:r>
     </w:p>
     <w:p>
@@ -3478,12 +3478,12 @@
     </w:p>
     <w:p>
       <w:r>
-        <w:t>Auf der einen Ebene war ich einfach da, eine Stadtbewohnerin auf dem Fest ihrer Gemeinde, und das war herrlich. Emma Redfern spürte mich am Apfelweinstand auf und präsentierte stolz ihr Kostüm, das sie unbedingt einen Tag zu früh hatte anziehen wollen: eine Sternbild-Verkleidung als Orion, ganz in Schwarz, mit silbernen Sternen, die von der sorgsamen Hand ihres Vaters exakt an die richtigen Stellen genäht worden waren, der Gürtel saß haargenau. Sie wollte, dass ich jeden einzelnen Stern benannte, und das tat ich, denn ich kannte diese Sterne schon sehr lange. Sie war hellauf begeistert, dass Frau Claus ihre Sternbilder kannte. Mark stand mit zwei Bechern Apfelwein daneben und dem weichen Blick eines Vaters, der dabei zuschaut, wie seine Tochter mitten in einer Menschenmenge acht Jahre alt ist. Martha drückte mir vom Tisch ein Paar Fausthandschuhe in die Hand, die grünen, „für deine kalten Hände“. Sam Patel hob von der anderen Seite des Angers grüßend den Hut von seinem Posten nahe der Gasthofveranda aus, wo er sich den ganzen Tag über positioniert hatte, mit den Augen fest auf den Empfangstresen direkt hinter der Tür gerichtet, so wie ich es ihn gebeten hatte.</w:t>
-      </w:r>
-    </w:p>
-    <w:p>
-      <w:r>
-        <w:t>Und auf der anderen Ebene, unter all der Wärme, hielt ich ebenfalls Wächterei. Der zweite Zettel hatte besagt, das Fest endet am Sonntag, und der Erpresser war hier, irgendwo in dieser Menschenmenge, eines dieser lachenden Gesichter. Ich konnte nicht aufhören, die Tür des Gasthofs und den Tresen direkt dahinter im Auge zu behalten, wo ein dritter Zettel inmitten des Festtrubels hinterlegt werden konnte.</w:t>
+        <w:t xml:space="preserve">Auf der einen Ebene war ich einfach da, eine Stadtbewohnerin auf dem Fest ihrer Gemeinde, und das war herrlich. Emma Redfern spürte mich am Apfelweinstand auf und präsentierte stolz ihr Kostüm, das sie unbedingt einen Tag zu früh hatte anziehen wollen: eine Sternbild-Verkleidung als Orion, ganz in Schwarz, mit silbernen Sternen, die von der sorgsamen Hand ihres Vaters exakt an die richtigen Stellen genäht worden waren, der Gürtel saß haargenau. Sie wollte, dass ich jeden einzelnen Stern benannte, und das tat ich, denn ich kannte diese Sterne schon sehr lange. Sie war hellauf begeistert, dass Frau Claus ihre Sternbilder kannte. Mark stand mit zwei Bechern Apfelwein daneben und dem weichen Blick eines Vaters, der dabei zuschaut, wie seine Tochter mitten in einer Menschenmenge acht Jahre alt ist. Martha drückte mir vom Tisch ein Paar Fausthandschuhe in die Hand, die grünen, „für deine kalten Hände“. Sam Patel hob von der anderen Seite des Angers grüßend den Hut von seinem Posten nahe der Gasthofveranda aus, wo er sich den ganzen Tag über positioniert hatte, mit den Augen fest auf den Empfangstresen direkt hinter der Tür gerichtet, worum ich ihn gebeten hatte.</w:t>
+      </w:r>
+    </w:p>
+    <w:p>
+      <w:r>
+        <w:t xml:space="preserve">Und auf der anderen Ebene, unter all der Wärme, hielt ich ebenfalls Wache. Der zweite Zettel hatte besagt, das Fest endet am Sonntag, und der Erpresser war hier, irgendwo in dieser Menschenmenge, eines dieser lachenden Gesichter. Ich konnte nicht aufhören, die Tür des Gasthofs und den Tresen direkt dahinter im Auge zu behalten, wo ein dritter Zettel inmitten des Festtrubels hinterlegt werden konnte.</w:t>
       </w:r>
     </w:p>
     <w:p>
@@ -3518,7 +3518,7 @@
     </w:p>
     <w:p>
       <w:r>
-        <w:t>„Heute nicht“, sagte sie.</w:t>
+        <w:t xml:space="preserve">„Heute nicht“, sagte ich.</w:t>
       </w:r>
     </w:p>
     <w:p>
@@ -3533,7 +3533,7 @@
     </w:p>
     <w:p>
       <w:r>
-        <w:t>Die Magie war an diesem Tag allgegenwärtig, auf kleine Weisen, die die Stadt einfach abtun konnte. Als die Kapelle einen Reigen spielte, schwankten die Laternen in den Bäumen ein wenig, obwohl ich keinen Wind spürte. Frostfarne wuchsen an den Innenseiten der Gasthöfchenster in Mustern empor, die viel zu lieblich waren, als dass sie ein Zufall sein könnten, schmolzen dahin und wuchsen wieder nach. Und in der letzten Stunde des Tageslichts, als die Sonne hinter den Hügeln unterging und die goldenen Festlichter voll zur Geltung kamen, begann es sanft zu schneien, zum ersten Mal seit der Woche, in der wir Schneeball gefunden hatten. Dicke, langsame Flocken trieben über den Anger, über die Kapelle, die Buden und die zugewandten Gesichter. Die ganze Stadt hielt inne, wie auf ein geheimes Kommando, blickte nach oben und wurde still.</w:t>
+        <w:t xml:space="preserve">Die Magie war an diesem Tag allgegenwärtig, auf kleine Weisen, die die Stadt einfach abtun konnte. Als die Kapelle einen Reigen spielte, schwankten die Laternen in den Bäumen ein wenig, obwohl ich keinen Wind spürte. Frostfarne wuchsen an den Innenseiten der Gasthoffenster in Mustern empor, die viel zu lieblich waren, als dass sie ein Zufall sein könnten, schmolzen dahin und wuchsen wieder nach. Und in der letzten Stunde des Tageslichts, als die Sonne hinter den Hügeln unterging und die goldenen Festlichter voll zur Geltung kamen, begann es sanft zu schneien, zum ersten Mal seit der Woche, in der wir Schneeball gefunden hatten. Dicke, langsame Flocken trieben über den Anger, über die Kapelle, die Buden und die zugewandten Gesichter. Die ganze Stadt hielt inne, wie auf ein geheimes Kommando, blickte nach oben und wurde still.</w:t>
       </w:r>
     </w:p>
     <w:p>
@@ -3574,17 +3574,17 @@
     <w:p/>
     <w:p>
       <w:r>
-        <w:t>Ich hatte drei Männer entlastet, und diese Entlastung hatte mich allein in einem kleinen Zimmer mit der Wahrheit zurückgelassen, vor der ich sie als Schutzschild benutzt hatte.</w:t>
-      </w:r>
-    </w:p>
-    <w:p>
-      <w:r>
-        <w:t>Ich breitete in jener Nacht alles auf dem Küchentisch aus, jedes einzelne Stück: die beiden Zettel, die Abschrift, die ich von Theos Karteikarte gemacht hatte, und den dicken Ordner, den Neil mir gegeben hatte. Dann zwang ich mich, mich hinzusetzen und es anzusehen, ohne zusammenzucken. Pip hatte mich aufgegeben und war auf dem Teppich vor dem Kamin eingeschlafen.</w:t>
-      </w:r>
-    </w:p>
-    <w:p>
-      <w:r>
-        <w:t>Der Zettel zitierte Theos Worte. Der Saphir in seinem Herzen: fünf Wörter, die Diktion eines Historikers und nicht die eines Diebs, die im Erpresserbrief genau so standen wie auf der Karte in Theos sorgfältiger, geneigter Handschrift. Der Zettel war auf dem cremefarbenen Briefpapier der Gesellschaft geschrieben, dem schweren Büttenpapier, das ich gestapelt auf dem Empfangstresen der Ausstellung gesehen hatte. Der Mann, der das Archiv leitete, ging unter. Er hatte an jede ehrliche Tür in drei Bundesstaaten geklopft und zugesehen, wie sie zufielen. Er hatte sich vor die gesamte Stadt gestellt und reumütig verkündet, dass just die Briefe, die die Brosche beschrieben, abhanden gekommen waren.</w:t>
+        <w:t xml:space="preserve">Ich hatte drei Männer entlastet, und diese Entlastung hatte mich allein in einem kleinen Zimmer mit der Wahrheit zurückgelassen, der ich mit ihrer Hilfe ausgewichen war.</w:t>
+      </w:r>
+    </w:p>
+    <w:p>
+      <w:r>
+        <w:t xml:space="preserve">Ich breitete in jener Nacht alles auf dem Küchentisch aus, jedes einzelne Stück: die beiden Zettel, die Abschrift, die ich von Theos Karteikarte gemacht hatte, und den dicken Ordner, den Neil mir gegeben hatte. Dann zwang ich mich, mich hinzusetzen und es anzusehen, ohne zusammenzuzucken. Pip hatte mich aufgegeben und war auf dem Teppich vor dem Kamin eingeschlafen.</w:t>
+      </w:r>
+    </w:p>
+    <w:p>
+      <w:r>
+        <w:t xml:space="preserve">Der Zettel zitierte Theos Worte. Der Saphir in seinem Herzen: fünf Wörter, die Diktion eines Historikers und nicht die eines Diebs, die im Erpresserbrief genau so standen wie auf der Karte in Theos sorgfältiger, geneigter Handschrift. Der Zettel war auf dem cremefarbenen Briefpapier des Vereins geschrieben, dem schweren Büttenpapier, das ich gestapelt auf dem Empfangstresen der Ausstellung gesehen hatte. Der Mann, der das Archiv leitete, ging unter. Er hatte an jede ehrliche Tür in drei Bundesstaaten geklopft und zugesehen, wie sie zufielen. Er hatte sich vor die gesamte Stadt gestellt und reumütig verkündet, dass just die Briefe, die die Brosche beschrieben, abhanden gekommen waren.</w:t>
       </w:r>
     </w:p>
     <w:p>
@@ -3594,12 +3594,12 @@
     </w:p>
     <w:p>
       <w:r>
-        <w:t>Ich nahm den zweiten Zettel und einen Bogen des Briefpapiers der Gesellschaft, einen unbeschriebenen, den Theo mir im Archiv für neue Reiter in die Hand gedrückt hatte und den ich in meiner Tasche nach Hause getragen hatte. Ich hielt beide zusammen gegen die Lampe. Dasselbe Creme. Dasselbe Gewicht in den Fingern. Dieselben schwachen Rippen, die in die Maserung gepresst waren, die feinen, parallelen Grate, die das Sieb eines Papiermachers hinterlässt, gut zu erkennen, wenn man weiß, dass man einen Bogen ins Licht halten und hinsehen muss. Sie passten zusammen. Natürlich passten sie zusammen. Der Zettel war auf Papier aus Theos Vorrat geschrieben worden, dem Stapel auf dem Empfangstresen des Gebäudes, das er seit Tagen nicht verlassen hatte.</w:t>
-      </w:r>
-    </w:p>
-    <w:p>
-      <w:r>
-        <w:t>Ich lehnte mich zurück und ließ es wahr werden, endlich, ganz und gar, die Sache, die ich seit Tagen mit beiden Händen von mir gehalten hatte. Theo Hussein war der Erpresser. Der gütigste Mann in Frost Falls. Der Mann, der meine Hände am Eingang der Ausstellung gehalten hatte, während seine müden Augen über vierzig neue Mitglieder strahlten. Er hatte die Geschichte der Brosche in seinem Archiv gefunden und darin die halbe Million Dollar gesehen, die vielleicht das Einzige retten konnte, was er mehr liebte als seine eigene Ruhe. Er hatte seinen Kummer über eine sterbende Gesellschaft genommen und ihn gegen einen Freund gerichtet.</w:t>
+        <w:t xml:space="preserve">Ich nahm den zweiten Zettel und einen Bogen des Briefpapiers des Vereins, einen unbeschriebenen, den Theo mir im Archiv für neue Reiter in die Hand gedrückt hatte und den ich in meiner Tasche nach Hause getragen hatte. Ich hielt beide zusammen gegen die Lampe. Dasselbe Creme. Dasselbe Gewicht in den Fingern. Dieselben schwachen Rippen, die in die Maserung gepresst waren, die feinen, parallelen Grate, die das Sieb eines Papiermachers hinterlässt, gut zu erkennen, wenn man weiß, dass man einen Bogen ins Licht halten und hinsehen muss. Sie passten zusammen. Natürlich passten sie zusammen. Der Zettel war auf Papier aus Theos Vorrat geschrieben worden, dem Stapel auf dem Empfangstresen des Gebäudes, das er seit Tagen nicht verlassen hatte.</w:t>
+      </w:r>
+    </w:p>
+    <w:p>
+      <w:r>
+        <w:t xml:space="preserve">Ich lehnte mich zurück und ließ es wahr werden, endlich, ganz und gar, die Sache, die ich seit Tagen mit beiden Händen von mir gehalten hatte. Theo Hussein war der Erpresser. Der gütigste Mann in Frost Falls. Der Mann, der meine Hände am Eingang der Ausstellung gehalten hatte, während seine müden Augen über vierzig neue Mitglieder strahlten. Er hatte die Geschichte der Brosche in seinem Archiv gefunden und darin die halbe Million Dollar gesehen, die vielleicht das Einzige retten konnte, was er mehr liebte als seine eigene Ruhe. Er hatte seinen Kummer über einen sterbenden Verein genommen und ihn gegen einen Freund gerichtet.</w:t>
       </w:r>
     </w:p>
     <w:p>
@@ -3620,7 +3620,7 @@
         <w:rPr>
           <w:i/>
         </w:rPr>
-        <w:t>Ich weiß, wie Ihre Familie zu diesem Gasthof gekommen ist</w:t>
+        <w:t xml:space="preserve">Ich weiß, wie deine Familie zu diesem Gasthof gekommen ist</w:t>
       </w:r>
       <w:r>
         <w:t>, hatte der erste Zettel gelautet. Der Diebstahl selbst, die Brosche, der Stein, das Pfandhaus in Ridgeline, stand all das in den Blackburn-Briefen, in Theos Archiv. Aber der Kauf des Gasthofs, der Erwerb von 1924, die Papierspur einer Immobilie, die den Besitzer wechselte, stand in keinem Blackburn-Brief. Das war ein Grundbucheintrag. Eine Urkunde.</w:t>
@@ -3628,7 +3628,7 @@
     </w:p>
     <w:p>
       <w:r>
-        <w:t>Und die Urkunde des Gasthofs wurde in einer Wand von Aktenordnern hinter dem Schreibtisch der Sekretärin des Bürgermeisters aufbewahrt.</w:t>
+        <w:t xml:space="preserve">Und die Urkunde des Gasthofs wurde in einer Wand von Aktenschubladen hinter dem Schreibtisch der Sekretärin des Bürgermeisters aufbewahrt.</w:t>
       </w:r>
     </w:p>
     <w:p>
@@ -3675,7 +3675,7 @@
     <w:p/>
     <w:p>
       <w:r>
-        <w:t>Die Geschichte war zu langweilig, um eine Lüge zu sein, worauf es ankam. Ich erzählte ihr, das Festkomitee benötige die alte Urkunde für das Anger, das Gemeindeland selbst, um einen kleinen Streit darüber beizulegen, wo ein Händler seinen Stand aufbauen durfte, und ob sie so lieb sein und sie für mich heraussuchen könnte. Sie seufzte, das geplagte Seufzen einer Frau, die gebeten wurde, an einem langen Tag noch eine Kleinigkeit zu erledigen, und ging in den Archivraum im Hintergrund, um sie zu finden.</w:t>
+        <w:t xml:space="preserve">Die Geschichte war zu langweilig, um eine Lüge zu sein, worauf es ankam. Ich erzählte ihr, das Festkomitee benötige die alte Urkunde für den Anger, das Gemeindeland selbst, um einen kleinen Streit darüber beizulegen, wo ein Händler seinen Stand aufbauen durfte, und ob sie so lieb sein und sie für mich heraussuchen könnte. Sie seufzte, das geplagte Seufzen einer Frau, die gebeten wurde, an einem langen Tag noch eine Kleinigkeit zu erledigen, und ging in den Archivraum im Hintergrund, um sie zu finden.</w:t>
       </w:r>
     </w:p>
     <w:p/>
@@ -3693,7 +3693,7 @@
         <w:rPr>
           <w:i/>
         </w:rPr>
-        <w:t>PROPERTY — EVERGREEN AVE — WINTER WONDERLAND INN.</w:t>
+        <w:t xml:space="preserve">GRUNDBESITZ — EVERGREEN AVE — WINTER WONDERLAND INN.</w:t>
       </w:r>
     </w:p>
     <w:p/>
@@ -3705,7 +3705,7 @@
     <w:p/>
     <w:p>
       <w:r>
-        <w:t>Sie hatte diese hier gelesen. Sie hatte sie herausgeholt. Die Urkunde des Gasthofs, das Papier, das den Kauf von 1924 verzeichnete, die Hälfte des Geheimnisses, die in keinem Blackburn-Brief stand und es nie getan hatte. Sie war in Vera Reeds Händen gewesen, lange genug her, dass sie sie nicht weggeräumt hatte.</w:t>
+        <w:t xml:space="preserve">Sie hatte diese hier gelesen. Sie hatte sie herausgeholt. Die Urkunde des Gasthofs, das Papier, das den Kauf von 1924 verzeichnete, die Hälfte des Geheimnisses, die in keinem Blackburn-Brief stand und es nie getan hatte. Sie war in Vera Reeds Händen gewesen, vor so kurzer Zeit, dass sie sie noch nicht weggeräumt hatte.</w:t>
       </w:r>
     </w:p>
     <w:p/>
@@ -3741,7 +3741,7 @@
     <w:p/>
     <w:p>
       <w:r>
-        <w:t>Theo hatte den Diebstahl begangen. Er hatte ihn in den Blackburn-Briefen gefunden, die Brosche, den Stein, das Pfandhaus. Er hatte ihn mit sorgfältiger Hand katalogisiert, den Saphir in ihrem Herzen, und dann hatte er diese Briefe aus den Akten gezogen und sie als vermisst gemeldet. Aber Theo, der unterging, von der ganzen Stadt beobachtet, nie zu Hause, hätte den Rest nicht tun können. Er hätte nicht bestätigen können, dass der Gasthof mit dem Geld gekauft worden war, denn dieser Beweis befand sich nicht in seinem Gebäude. Und er hätte die Zettel nicht quer durch die Stadt tragen und an einem belebten Festtag hellen Tages auf einen vollen Schreibtisch legen können, denn Theo Hussein konnte sich nicht unbemerkt die Evergreen Avenue entlangwagen, um sein Leben zu retten.</w:t>
+        <w:t xml:space="preserve">Theo wusste vom Diebstahl. Er hatte ihn in den Blackburn-Briefen gefunden, die Brosche, den Stein, das Pfandhaus. Er hatte ihn mit sorgfältiger Hand katalogisiert, den Saphir in ihrem Herzen, und dann hatte er diese Briefe aus den Akten gezogen und sie als vermisst gemeldet. Aber Theo, der unterging, von der ganzen Stadt beobachtet, nie zu Hause, hätte den Rest nicht tun können. Er hätte nicht bestätigen können, dass der Gasthof mit dem Geld gekauft worden war, denn dieser Beweis befand sich nicht in seinem Gebäude. Und er hätte die Zettel nicht quer durch die Stadt tragen und am helllichten Festtag auf einen vollen Schreibtisch legen können, denn Theo Hussein konnte sich nicht unbemerkt die Evergreen Avenue entlangwagen, und wenn sein Leben davon abhinge.</w:t>
       </w:r>
     </w:p>
     <w:p/>
@@ -3794,7 +3794,7 @@
     <w:p/>
     <w:p>
       <w:r>
-        <w:t>Es lief folgendermaßen ab: Ich wusste, wer. Ich wusste, wie. Ich hatte die Beweise dafür: die Katalogkarte, das abgeglichene Papier an der Lampe, die Eigentumsurkunde des Gasthofs, die offen außerhalb ihrer Schublade lag. Ich konnte also leise zu Theo und Vera gehen, nur wir zu dritt, sonst niemand, und sagen: Ich weiß Bescheid. Hört jetzt auf, und hier und heute endet es, ohne dass es jemand erfährt. Niemals wieder. Und das würden sie, weil sie ängstliche Menschen waren und keine abgebrühten. Sie würden vor Erleichterung weinen, dass man sie davonkommen ließ. Die Zettel würden aufhören, und Fiona wäre in Sicherheit. Das Geheimnis würde zurück in seinen Koffer auf dem Dachboden wandern. Theo würde seine Gesellschaft und seinen guten Ruf behalten und Vera ihren Job. Die Stadt müsste nie erfahren, dass zwei ihrer eigenen Leute für eine einzige harte Jahreszeit auf Abwege geraten waren. Allen, die ich liebte, würde der Kummer darüber erspart bleiben.</w:t>
+        <w:t xml:space="preserve">Es lief folgendermaßen ab: Ich wusste, wer. Ich wusste, wie. Ich hatte die Beweise dafür: die Katalogkarte, das abgeglichene Papier an der Lampe, die Eigentumsurkunde des Gasthofs, die offen außerhalb ihrer Schublade lag. Ich konnte also leise zu Theo und Vera gehen, nur wir zu dritt, sonst niemand, und sagen: Ich weiß Bescheid. Hört jetzt auf, und hier und heute endet es, ohne dass es jemand erfährt. Niemals wieder. Und das würden sie, weil sie ängstliche Menschen waren und keine abgebrühten. Sie würden vor Erleichterung weinen, dass man sie davonkommen ließ. Die Zettel würden aufhören, und Fiona wäre in Sicherheit. Das Geheimnis würde zurück in seinen Koffer auf dem Dachboden wandern. Theo würde seinen Verein und seinen guten Ruf behalten und Vera ihren Job. Die Stadt müsste nie erfahren, dass zwei ihrer eigenen Leute für eine einzige harte Jahreszeit auf Abwege geraten waren. Allen, die ich liebte, würde der Kummer darüber erspart bleiben.</w:t>
       </w:r>
     </w:p>
     <w:p/>
@@ -3848,7 +3848,7 @@
     <w:p/>
     <w:p>
       <w:r>
-        <w:t>„Ich kann es nicht vergraben“, sagte ich. „Ich will es. Gott weiß, ich will heute Abend rübergehen, das alles weiflüstern und alle ihr Leben behalten lassen. Aber wenn ich das tue, hört Fiona nie auf, Angst zu haben, nicht wirklich. Theo muss nie zu einem Mann werden, dem man vergeben kann. Und der Schmutz bleibt unten in der Wand, wo ich ihn nicht sehen kann, und wächst.“ Ich drückte die Handballen gegen meine Augen. „Das Gütige und das Einfache sind nicht dasselbe. Es muss ans Licht kommen. Alles davon. Richtig. Mit Noriko Tanaka. Mit dem Gesetz darin, sanft getan, mit Barmherzigkeit getan, aber getan. Das ist der einzige Weg, wie Fiona jemals frei davon wird, und der einzige Weg, wie Theo jemals etwas anderes sein kann als ein Mann mit einem Verbrechen unter seinen Dielen.“</w:t>
+        <w:t xml:space="preserve">„Ich kann es nicht vergraben“, sagte ich. „Ich will es. Gott weiß, ich will heute Abend rübergehen, das alles wegflüstern und alle ihr Leben behalten lassen. Aber wenn ich das tue, hört Fiona nie auf, Angst zu haben, nicht wirklich. Theo muss nie zu einem Mann werden, dem man vergeben kann. Und die Fäulnis bleibt unten in der Wand, wo ich sie nicht sehen kann, und wächst.“ Ich drückte die Handballen gegen meine Augen. „Das Gütige und das Einfache sind nicht dasselbe. Es muss ans Licht kommen. Alles davon. Richtig. Mit Noriko Tanaka. Mit dem Gesetz darin, sanft getan, mit Barmherzigkeit getan, aber getan. Das ist der einzige Weg, wie Fiona jemals frei davon wird, und der einzige Weg, wie Theo jemals etwas anderes sein kann als ein Mann mit einem Verbrechen unter seinen Dielen.“</w:t>
       </w:r>
     </w:p>
     <w:p/>
@@ -3860,7 +3860,7 @@
     <w:p/>
     <w:p>
       <w:r>
-        <w:t>Da war sie, die letzte Angst, die kleinste von allen und die ganz und gar meine eigene. Ich war immer noch halb eine Fremde in dieser Stadt. Alle anderen kannten sich, seit sie Kinder waren und auf denselben Gehältern laufen lernten, und ich hatte mir meinen Platz Zentimeter für Zentimeter erarbeitet, ein Auflauf hier, eine Hundesuche da, ein herbeigerückter Stuhl beim Strickkreis. Theo Hussein ans Licht zu zerren, könnte mich einen Teil dieses mühsam erkämpften Bodens kosten. Die Menschen lieben nicht immer die Person, die die harte Wahrheit ausspricht. Ich konnte genau das Richtige tun und für immer die Außenseiterin sein, die einen guten Mann kaputtgemacht und der Stadt Kummer bereitet hatte.</w:t>
+        <w:t xml:space="preserve">Da war sie, die letzte Angst, die kleinste von allen und die ganz und gar meine eigene. Ich war immer noch halb eine Fremde in dieser Stadt. Alle anderen kannten sich, seit sie Kinder waren und auf denselben Gehwegen laufen lernten, und ich hatte mir meinen Platz Zentimeter für Zentimeter erarbeitet, ein Auflauf hier, eine Hundesuche da, ein herbeigerückter Stuhl beim Strickkreis. Theo Hussein ans Licht zu zerren, könnte mich einen Teil dieses mühsam erkämpften Bodens kosten. Die Menschen lieben nicht immer die Person, die die harte Wahrheit ausspricht. Ich konnte genau das Richtige tun und für immer die Außenseiterin sein, die einen guten Mann kaputtgemacht und der Stadt Kummer bereitet hatte.</w:t>
       </w:r>
     </w:p>
     <w:p/>
@@ -3905,7 +3905,7 @@
     </w:p>
     <w:p>
       <w:r>
-        <w:t>Chief Tanaka hörte sich die Sache in ihrem kleinen Büro auf der Wache an; ihr abgenutztes Notizbuch lag aufgeschlagen auf dem Schreibtisch vor ihr und ihr Füller ruhte still darauf. Sie schrieb nicht mit, während sie abwägte, ob sie einem glauben sollte. Ich breitete alles vor ihr aus, so wie ich es mir am Küchentisch zurechtgelegt hatte. Die beiden Zettel. Theos Katalogkarte mit den fünf übereinstimmenden Wörtern. Das Briefpapier der Gesellschaft, Maserung für Maserung unter der Lampe verglichen. Der Grundbucheintrag des Gasthofs, der in Veras Ablagekorb außerhalb seiner Schublade lag. Constance, die Brosche, das Pfandhaus in Ridgeline, die ganze hundertjährige Wurzel der Sache und Neils Mappe darunter, jener Teil, der aus der Wurzel eine menschliche machte.</w:t>
+        <w:t xml:space="preserve">Polizeichefin Tanaka hörte sich die Sache in ihrem kleinen Büro auf der Wache an; ihr abgenutztes Notizbuch lag aufgeschlagen auf dem Schreibtisch vor ihr und ihr Füller ruhte still darauf. Sie schrieb nicht mit, während sie abwägte, ob sie einem glauben sollte. Ich breitete alles vor ihr aus, so wie ich es mir am Küchentisch zurechtgelegt hatte. Die beiden Zettel. Theos Katalogkarte mit den fünf übereinstimmenden Wörtern. Das Briefpapier des Vereins, Maserung für Maserung unter der Lampe verglichen. Der Grundbucheintrag des Gasthofs, der in Veras Ablagekorb außerhalb seiner Schublade lag. Constance, die Brosche, das Pfandhaus in Ridgeline, die ganze hundertjährige Wurzel der Sache und Neils Mappe darunter, jener Teil, der aus der Wurzel eine menschliche machte.</w:t>
       </w:r>
     </w:p>
     <w:p>
@@ -3930,12 +3930,12 @@
     </w:p>
     <w:p>
       <w:r>
-        <w:t>„Es gibt einen Weg“, sagte sie. „Es gibt fast immer einen Weg, wenn die beteiligten Personen keine Monster sind, und nach allem, was du mir erzählt hast, sind diese beiden keine Monster. Sie sind ein verzweifelter Mann und eine verängstigte Frau, die etwas Schlimmes getan haben aus Gründen, von denen sie sich zu mehr als der Hälfte eingeredet hatten, sie seien gut.“ Sie legte den Füller weg. „Hier ist, was ich nicht tun werde. Ich werde keine Tür eintreten und Theo Hussein mitten im Fest vor der ganzen Stadt in Handschellen abführen. Das hilft niemandem, es ist nicht notwendig, und ich tue nichts so Grausames, wenn etwas Freundlicheres funktioniert.“ Sie sah mich ruhig über den Schreibtisch hinweg an. „Hier ist, what ich tun werde. Ich gebe ihm die Gelegenheit, dazu zu stehen, mit mir im Raum, sodass es rechtlich geregelt und dokumentiert ist. Wenn er freiwillig dazu steht und es wiedergutmacht, mit Wiedergutmachung und einer echten Rechenschaft, dann gibt es Raum dafür, dass dies in etwas anderem als dem Ruin endet. Wir nennen das restorative Gerechtigkeit. Sie repariert, was möglich ist, anstatt nur zu zerbrechen, was übrig geblieben ist. Aber das funktioniert nur, wenn es wahr ist, Jessica. Wenn er lügt oder versucht, sich durch die Hintertür herauszureden, dann geht es den harten Weg, und das ist seine Entscheidung, nicht meine und nicht deine.“</w:t>
-      </w:r>
-    </w:p>
-    <w:p>
-      <w:r>
-        <w:t>„Genau das habe ich gehofft, dass du es sagen würdest.“</w:t>
+        <w:t xml:space="preserve">„Es gibt einen Weg“, sagte sie. „Es gibt fast immer einen Weg, wenn die beteiligten Personen keine Monster sind, und nach allem, was du mir erzählt hast, sind diese beiden keine Monster. Sie sind ein verzweifelter Mann und eine verängstigte Frau, die etwas Schlimmes getan haben aus Gründen, von denen sie sich zu mehr als der Hälfte eingeredet hatten, sie seien gut.“ Sie legte den Füller weg. „Hier ist, was ich nicht tun werde. Ich werde keine Tür eintreten und Theo Hussein mitten im Fest vor der ganzen Stadt in Handschellen abführen. Das hilft niemandem, es ist nicht notwendig, und ich tue nichts so Grausames, wenn etwas Freundlicheres funktioniert.“ Sie sah mich ruhig über den Schreibtisch hinweg an. „Hier ist, was ich tun werde. Ich gebe ihm die Gelegenheit, dazu zu stehen, mit mir im Raum, sodass es rechtlich geregelt und dokumentiert ist. Wenn er freiwillig dazu steht und es wiedergutmacht, mit Wiedergutmachung und einer echten Rechenschaft, dann gibt es Raum dafür, dass dies in etwas anderem als dem Ruin endet. Wir nennen das restaurative Gerechtigkeit. Sie repariert, was möglich ist, anstatt nur zu zerbrechen, was übrig geblieben ist. Aber das funktioniert nur, wenn es wahr ist, Jessica. Wenn er lügt oder versucht, sich durch die Hintertür herauszureden, dann geht es den harten Weg, und das ist seine Entscheidung, nicht meine und nicht deine.“</w:t>
+      </w:r>
+    </w:p>
+    <w:p>
+      <w:r>
+        <w:t xml:space="preserve">„Genau das hatte ich gehofft, von dir zu hören.“</w:t>
       </w:r>
     </w:p>
     <w:p>
@@ -3945,7 +3945,7 @@
     </w:p>
     <w:p>
       <w:r>
-        <w:t>Es war richtig. Es war so viel besser als die Falle, die ich mir halb ausgemalt hatte, eine Nacht mit Scheingeld, angehaltenem Atem und einer Hand, die aus dem Dunkeln greift. Es würde dabei überhaupt kein Dunkel geben. Wir würden es nachmittags in einem warmen Raum tun, mit Barmherzigkeit in unseren Händen und der Polizeichefin an unserer Seite, und wir würden einem anständig gebliebenen Mann, der vom Weg abgekommen ist, die schlichte Würde zugestehen, sich dem auf seinen eigenen zwei Beinen zu stellen.</w:t>
+        <w:t xml:space="preserve">Es war richtig. Es war so viel besser als die Falle, die ich mir halb ausgemalt hatte, eine Nacht mit Scheingeld, angehaltenem Atem und einer Hand, die aus dem Dunkeln greift. Es würde dabei überhaupt kein Dunkel geben. Wir würden es nachmittags in einem warmen Raum tun, mit Barmherzigkeit in unseren Händen und der Polizeichefin an unserer Seite, und wir würden einem guten Mann, der vom Weg abgekommen war, die schlichte Würde zugestehen, sich dem auf seinen eigenen zwei Beinen zu stellen.</w:t>
       </w:r>
     </w:p>
     <w:p>
@@ -3965,7 +3965,7 @@
     </w:p>
     <w:p>
       <w:r>
-        <w:t>Sie las es dort an dem kleinen Tisch, während die Standuhr tickte. Pip hatte sich vor der Uhr postiert, um dem goldenen Pendel hinter seinem Glas beim Schwingen zuzusehen, und sie wandte die Augen nicht davon ab, während Fiona las. Fiona weinte, aber es war ein anderes Weinen als das, das ich in den Tagen zuvor bei ihr gesehen hatte. Es lag eine tiefe Erleichterung darin.</w:t>
+        <w:t xml:space="preserve">Sie las es dort an dem kleinen Tisch, während die Standuhr tickte. Pip hatte sich vor der Uhr postiert, um dem Messingpendel hinter seinem Glas beim Schwingen zuzusehen, und sie wandte die Augen nicht davon ab, während Fiona las. Fiona weinte, aber es war ein anderes Weinen als das, das ich in den Tagen zuvor bei ihr gesehen hatte. Es lag eine tiefe Erleichterung darin.</w:t>
       </w:r>
     </w:p>
     <w:p>
@@ -3995,7 +3995,7 @@
     </w:p>
     <w:p>
       <w:r>
-        <w:t>Also machten wir es aus. Keine Falle. Eine Abrechnung, sanft durchgeführt, im Warmen, mit dem Gesetz und der Barmherzigkeit gemeinsam im Raum. Am letzten Nachmittag des Festes, wenn der Gasthof für eine Stunde vor dem Abend zur Ruhe kommen würde, die Menschenmassen nach Hause gegangen und das Aufräumen noch nicht begonnen hatte.</w:t>
+        <w:t xml:space="preserve">Also machten wir es aus. Keine Falle. Eine Abrechnung, sanft durchgeführt, im Warmen, mit dem Gesetz und der Barmherzigkeit gemeinsam im Raum. Am letzten Nachmittag des Festes, wenn der Gasthof für eine Stunde vor dem Abend zur Ruhe kommen würde, die Menschenmassen nach Hause gegangen waren und das Aufräumen noch nicht begonnen hatte.</w:t>
       </w:r>
     </w:p>
     <w:p>
@@ -4011,7 +4011,7 @@
     <w:p/>
     <w:p>
       <w:r>
-        <w:t>Wir taten es am letzten Nachmittag des Festes, in Fionas kleinem Wohnzimmer, während die Geräusche des ausklingenden Jahrmarkts durch das Fenster drangen: ein Kind, das sich darüber beschwerte, nach Hause gehen zu müssen, das Scharren von Biertischen, die auf dem Dorfanger zusammengeklappt wurden. Noriko hatte Theo gebeten zu kommen, um über etwas zu sprechen, das sie eine Angelegenheit der Gesellschaft genannt hatte, und Vera gebeten, wegen einer Sache zu erscheinen, die sie als Botengang für das Bürgermeisterbüro bezeichnet hatte. Die beiden trafen also wenige Minuten nacheinander ein, getrennt voneinander, ohne zu wissen, dass auch der andere kam.</w:t>
+        <w:t xml:space="preserve">Wir taten es am letzten Nachmittag des Festes, in Fionas kleinem Wohnzimmer, während die Geräusche des ausklingenden Jahrmarkts durch das Fenster drangen: ein Kind, das sich darüber beschwerte, nach Hause gehen zu müssen, das Scharren von Biertischen, die auf dem Dorfanger zusammengeklappt wurden. Noriko hatte Theo gebeten zu kommen, um über etwas zu sprechen, das sie eine Angelegenheit des Vereins genannt hatte, und Vera gebeten, wegen einer Sache zu erscheinen, die sie als Botengang für das Bürgermeisterbüro bezeichnet hatte. Die beiden trafen also wenige Minuten nacheinander ein, getrennt voneinander, ohne zu wissen, dass auch der andere kam.</w:t>
       </w:r>
     </w:p>
     <w:p/>
@@ -4047,16 +4047,16 @@
     <w:p/>
     <w:p>
       <w:r>
-        <w:t xml:space="preserve">„Theo“, sagte ich. „Die Erpresserbriefe an Fiona wurden auf dem Briefpapier der Gesellschaft geschrieben. Dem schweren, cremefarbenen Papier mit den gerippten Linien. Ich habe es Faser für Faser mit einem Bogen aus deinem Vorrat verglichen.“ Er zuckte zusammen, aber ich sprach stetig weiter. „Und darin wird die Brosche als </w:t>
+        <w:t xml:space="preserve">„Theo“, sagte ich. „Die Erpresserbriefe an Fiona wurden auf dem Briefpapier des Vereins geschrieben. Dem schweren, cremefarbenen Papier mit den gerippten Linien. Ich habe es Faser für Faser mit einem Bogen aus deinem Vorrat verglichen.“ Er zuckte zusammen, aber ich sprach stetig weiter. „Und darin wird die Brosche als </w:t>
       </w:r>
       <w:r>
         <w:rPr>
           <w:i/>
         </w:rPr>
-        <w:t>the sapphire at its heart</w:t>
-      </w:r>
-      <w:r>
-        <w:t xml:space="preserve"> bezeichnet. Das sind deine Worte, Theo. Sie stehen auf deiner Katalogkarte, mit deiner eigenen Handschrift, der Karte für die Blackburn-Briefe, von denen du der ganzen Stadt bei der Eröffnung erzählt hast, sie seien verschollen. Die Briefe sind nicht verschollen. Du hast sie an dich genommen, weil sie das Geheimnis enthielten, und hast sie dann als verloren bezeichnet, damit niemand auf die Idee käme zu fragen, was darin stand.“ Ich machte eine Pause und ließ den nächsten Teil leise folgen. „Du hast einen Weg gefunden, die Gesellschaft mit diesen Briefen zu retten. Und du hast ihn gewählt. Nicht wahr?“</w:t>
+        <w:t xml:space="preserve">der Saphir im Herzen</w:t>
+      </w:r>
+      <w:r>
+        <w:t xml:space="preserve"> bezeichnet. Das sind deine Worte, Theo. Sie stehen auf deiner Katalogkarte, mit deiner eigenen Handschrift, der Karte für die Blackburn-Briefe, von denen du der ganzen Stadt bei der Eröffnung erzählt hast, sie seien verschollen. Die Briefe sind nicht verschollen. Du hast sie an dich genommen, weil sie das Geheimnis enthielten, und hast sie dann als verloren bezeichnet, damit niemand auf die Idee käme zu fragen, was darin stand.“ Ich machte eine Pause und ließ den nächsten Teil leise folgen. „Du hast einen Weg gefunden, den Verein mit diesen Briefen zu retten. Und du hast ihn gewählt. Nicht wahr?“</w:t>
       </w:r>
     </w:p>
     <w:p/>
@@ -4068,7 +4068,7 @@
     <w:p/>
     <w:p>
       <w:r>
-        <w:t>„Ich redete mir ein, es sei eigentlich kein Diebstahl“, sagte er. „Nicht an Fiona. Ich redete mir ein, das Gasthaus sei sowieso mit gestohlenem Geld gekauft worden, also sei es kein Raub, sich ein wenig davon zurückzuholen, sondern, ich weiß nicht, Geschichte, die sich selbst korrigiert, eine Schuld, die endlich fällig wird. Ich bin so gut darin, der Vergangenheit die Bedeutung zu geben, die ich gerade brauche. Das ist meine ganze Ausbildung, die Vergangenheit verständlich zu machen.“ Er drückte seine Fäuste wie ein Kind gegen die Augen. „Das Dach bricht ein. Die Heizung geht kaputt. Hundert Jahre Erinnerung dieser Stadt, jeder Brief und jedes Foto und jede Urkunde, alles verkommt, und jede ehrliche Tür, an die ich klopfte, wurde mir vor der Nase zugeschlagen, der Bürgermeister, die Fördermittel, die Stiftungen, jede einzelne. Und dann fand ich diese Briefe, und da war es, eine halbe Million Dollar, einfach so in der Vergangenheit liegend, und ich dachte, ich kann es retten. Ich kann das alles retten, jeden Schnipsel, und niemand kommt wirklich zu Schaden, weil das Geld von vornherein schmutzig war.“ Er blickte auf, elend. „Und dann sah ich, was es mit ihr machte. Mit Fiona. Ich sah zu, wie sie grau wurde. Und ich sagte mir, ich würde aufhören, und ich hörte nicht auf, weil ich da schon so tief drinsteckte, und als ich es einmal getan hatte, sagte ich mir, auf einen weiteren käme es auch nicht mehr an.“ Er wandte sich Fiona zu, und seine Stimme brach. „Es tut mir so leid. Es tut mir so leid, Fiona. Ich habe mich irgendwo darin verloren. Ich liebe die Geschichte dieser Stadt so sehr, dass ich vergaß, dass die Stadt aus lebendigen Menschen besteht.“</w:t>
+        <w:t xml:space="preserve">„Ich redete mir ein, es sei eigentlich kein Diebstahl“, sagte er. „Nicht an Fiona. Ich redete mir ein, der Gasthof sei sowieso mit gestohlenem Geld gekauft worden, also sei es kein Raub, sich ein wenig davon zurückzuholen, sondern, ich weiß nicht, Geschichte, die sich selbst korrigiert, eine Schuld, die endlich fällig wird. Ich bin so gut darin, der Vergangenheit die Bedeutung zu geben, die ich gerade brauche. Das ist meine ganze Ausbildung, die Vergangenheit verständlich zu machen.“ Er drückte seine Fäuste wie ein Kind gegen die Augen. „Das Dach bricht ein. Die Heizung geht kaputt. Hundert Jahre Erinnerung dieser Stadt, jeder Brief und jedes Foto und jede Urkunde, alles verkommt, und jede ehrliche Tür, an die ich klopfte, wurde mir vor der Nase zugeschlagen, der Bürgermeister, die Fördermittel, die Stiftungen, jede einzelne. Und dann fand ich diese Briefe, und da war es, eine halbe Million Dollar, einfach so in der Vergangenheit liegend, und ich dachte, ich kann es retten. Ich kann das alles retten, jeden Schnipsel, und niemand kommt wirklich zu Schaden, weil das Geld von vornherein schmutzig war.“ Er blickte auf, elend. „Und dann sah ich, was es mit ihr machte. Mit Fiona. Ich sah zu, wie sie grau wurde. Und ich sagte mir, ich würde aufhören, und ich hörte nicht auf, weil ich da schon so tief drinsteckte, und als ich es einmal getan hatte, sagte ich mir, auf einen weiteren käme es auch nicht mehr an.“ Er wandte sich Fiona zu, und seine Stimme brach. „Es tut mir so leid. Es tut mir so leid, Fiona. Ich habe mich irgendwo darin verloren. Ich liebe die Geschichte dieser Stadt so sehr, dass ich vergaß, dass die Stadt aus lebendigen Menschen besteht.“</w:t>
       </w:r>
     </w:p>
     <w:p/>
@@ -4086,7 +4086,7 @@
     <w:p/>
     <w:p>
       <w:r>
-        <w:t>„Vera“, sagte ich. „Theo hat den Diebstahl begangen. Aber in den Notizen stand, dass das Gasthaus mit dem Geld der Brosche gekauft worden war, und das stand in keinem Blackburn-Brief. Das ist ein Grundbucheintrag. Eine Urkunde. Und die Urkunde für dieses Gasthaus lag gestern Morgen außerhalb ihrer Schublade in deinem Ablagekorb, griffbereit auf dem Schreibtisch einer Frau, die mir zweimal versichert hatte, sie lese nie in den Akten hinter ihrem Rücken.“ Ich hielt meine Stimme leise. „Er beging den Diebstahl. Du hattest die Urkunde. Und du hattest die Beine, Vera. Er hätte dieses Stadtgebiet nicht unbemerkt durchqueren können, jeder kennt Theo, jeder hält ihn auf. Aber niemand zuckt mit der Wimper, wenn die Sekretärin des Bürgermeisters während des Festes kurz im Gasthaus vorbeischaut. Ich bin dir an jenem Morgen selbst auf der Treppe begegnet, mit deinen Parkausweisen. Er hätte das unmöglich allein tun können. Er brauchte jemanden, der sich ungesehen durch die Stadt bewegen konnte. Das warst du.“</w:t>
+        <w:t xml:space="preserve">„Vera“, sagte ich. „Theo wusste vom Diebstahl. Aber in den Zetteln stand, dass der Gasthof mit dem Geld der Brosche gekauft worden war, und das stand in keinem Blackburn-Brief. Das ist ein Grundbucheintrag. Eine Urkunde. Und die Urkunde für diesen Gasthof lag gestern Morgen außerhalb ihrer Schublade in deinem Ablagekorb, kürzlich angefasst auf dem Schreibtisch einer Frau, die mir zweimal versichert hatte, sie lese nie in den Akten hinter ihrem Rücken.“ Ich hielt meine Stimme leise. „Er wusste vom Diebstahl. Du hattest die Urkunde. Und du hattest die Beine, Vera. Er hätte dieses Stadtgebiet nicht unbemerkt durchqueren können, jeder kennt Theo, jeder hält ihn auf. Aber niemand zuckt mit der Wimper, wenn die Sekretärin des Bürgermeisters während des Festes kurz im Gasthof vorbeischaut. Ich bin dir an jenem Morgen selbst auf der Treppe begegnet, mit deinen Parkausweisen. Er hätte das unmöglich allein tun können. Er brauchte jemanden, der sich ungesehen durch die Stadt bewegen konnte. Das warst du.“</w:t>
       </w:r>
     </w:p>
     <w:p/>
@@ -4098,7 +4098,7 @@
     <w:p/>
     <w:p>
       <w:r>
-        <w:t>„Er kam zu mir“, sagte sie. „Vor Wochen. Völlig von Sinnen, erzählte von der Gesellschaft, davon, dass er dieses Ding gefunden hatte und es nicht allein schaffen konnte. Und ich hätte Nein sagen müssen. Ich weiß, dass ich Nein hätte sagen müssen, ich wusste es damals schon.“ Sie wog sich ein wenig hin und her, die Arme fest um sich geschlungen. „Aber ich bin so im Rückstand, Mrs. Claus. Der Bürgermeister bezahlt mich miserabel und treibt mich bis zur Erschöpfung an, und ich habe Schulden, dass Sie es nicht glauben würden, solche, bei denen man nicht schlafen kann, und Theo sagte, das sei Geld, das vor hundert Jahren von einer reichen Familie gestohlen worden war, und dass es die Gesellschaft retten würde und ein Stück davon an mich abfallen und ich endlich aus dem Schneider sein würde. Er klang fast edel dabei. Darin ist er gut, eine Sache wie Geschichte klingen zu lassen statt wie ein Verbrechen. Und ich wollte so unbedingt aus dem Schneider sein, dass ich zuließ, dass es sich so anhörte, weil ich es glauben wollte.“ Sie blickte Fiona an, tief getroffen. „Ich habe nie an dich als Menschen gedacht. Das ist das Schlimmste daran, das ist das, was ich mit mir herumtragen werde. Ich dachte nur an das Geld und das Nichtschlafen. Es tut mir leid. Es tut mir so unglaublich leid, Fiona.“</w:t>
+        <w:t xml:space="preserve">„Er kam zu mir“, sagte sie. „Vor Wochen. Völlig von Sinnen, erzählte von dem Verein, davon, dass er dieses Ding gefunden hatte und es nicht allein schaffen konnte. Und ich hätte Nein sagen müssen. Ich weiß, dass ich Nein hätte sagen müssen, ich wusste es damals schon.“ Sie wog sich ein wenig hin und her, die Arme fest um sich geschlungen. „Aber ich bin so im Rückstand, Mrs. Claus. Der Bürgermeister bezahlt mich miserabel und treibt mich bis zur Erschöpfung an, und ich habe Schulden, dass Sie es nicht glauben würden, solche, bei denen man nicht schlafen kann, und Theo sagte, das sei Geld, das vor hundert Jahren von einer reichen Familie gestohlen worden war, und dass es den Verein retten würde und ein Stück davon an mich abfallen und ich endlich aus dem Schneider sein würde. Er klang fast edel dabei. Darin ist er gut, eine Sache wie Geschichte klingen zu lassen statt wie ein Verbrechen. Und ich wollte so unbedingt aus dem Schneider sein, dass ich zuließ, dass es sich so anhörte, weil ich es glauben wollte.“ Sie blickte Fiona an, tief getroffen. „Ich habe nie an dich als Menschen gedacht. Das ist das Schlimmste daran, das ist das, was ich mit mir herumtragen werde. Ich dachte nur an das Geld und das Nichtschlafen. Es tut mir leid. Es tut mir so unglaublich leid, Fiona.“</w:t>
       </w:r>
     </w:p>
     <w:p/>
@@ -4133,7 +4133,7 @@
     <w:p/>
     <w:p>
       <w:r>
-        <w:t>Noriko ging die Sache gleichzeitig nach Vorschrift und mit dem Herzen an. Es gab kein leises Vertuschen, kein „Lasst-uns-alle-vergessen-dass-das-je-passiert-ist“, kein Vortäuschen, ein Verbrechen sei kein Verbrechen gewesen. Theo und Vera legten jeweils einen vollständigen, schriftlichen und unterzeichneten Bericht über alles ab, was sie getan hatten, der Reihe nach, ohne etwas zu beschönigen. Die beiden Briefe wurden zu Beweismitteln, etikettiert und abgeheftet. Es stand nun schwarz auf weiß und offiziell fest, dass zwei Bürger von Frost Falls versucht hatten, einen Dritten um eine halbe Million Dollar zu erpressen.</w:t>
+        <w:t xml:space="preserve">Noriko ging die Sache gleichzeitig nach Vorschrift und mit dem Herzen an. Es gab kein leises Vertuschen, kein „Lasst-uns-alle-vergessen-dass-das-je-passiert-ist“, kein Vortäuschen, ein Verbrechen sei kein Verbrechen gewesen. Theo und Vera legten jeweils einen vollständigen, schriftlichen und unterzeichneten Bericht über alles ab, was sie getan hatten, der Reihe nach, ohne etwas zu beschönigen. Die beiden Briefe wurden zu Beweismitteln, etikettiert und abgeheftet. Es stand nun schwarz auf weiß und offiziell fest, dass zwei Bürger von Frost Falls versucht hatten, eine Dritte um eine halbe Million Dollar zu erpressen.</w:t>
       </w:r>
     </w:p>
     <w:p/>
@@ -4145,7 +4145,7 @@
     <w:p/>
     <w:p>
       <w:r>
-        <w:t>„Restorative Justice“, erklärte sie uns allen hinterher mit einfacheren Worten bei Kaffee im Gasthof. „Das funktioniert nur, wenn die Person, die das Unrecht begangen hat, sich dem Schaden stellt und ihn mit eigenen Händen wiedergutmacht. Also werden sie genau das tun. Keine Zelle. Etwas, das auf seine Art härter ist als eine Zelle. Sie werden es wieder gutmachen, vor den Menschen, denen sie wehgetan haben, über einen langen Zeitraum hinweg. Und wenn sie daran scheitern, steht die härtere Tür nach wie vor direkt hinter ihnen.“</w:t>
+        <w:t xml:space="preserve">„Restaurative Gerechtigkeit“, erklärte sie uns allen hinterher mit einfacheren Worten bei Kaffee im Gasthof. „Das funktioniert nur, wenn die Person, die das Unrecht begangen hat, sich dem Schaden stellt und ihn mit eigenen Händen wiedergutmacht. Also werden sie genau das tun. Keine Zelle. Etwas, das auf seine Art härter ist als eine Zelle. Sie werden es wieder gutmachen, vor den Menschen, denen sie wehgetan haben, über einen langen Zeitraum hinweg. Und wenn sie daran scheitern, steht die härtere Tür nach wie vor direkt hinter ihnen.“</w:t>
       </w:r>
     </w:p>
     <w:p/>
@@ -4157,25 +4157,25 @@
     <w:p/>
     <w:p>
       <w:r>
-        <w:t>Für Vera bedeutete das, zurückzuzahlen, was sie konnte, in Raten, die sie jeden Monat in den Knochen spüren würde, eine lange Bewährungszeit und der Abschied aus dem Bürgermeisteramt. Sie trat in der Woche darauf zurück. Es war das Richtige, und es kostete sie verdammt viel, denn so schlecht der Bürgermeister sie auch bezahlt hatte, dieser Schreibtisch war seit fünfzehn Jahren ihr Platz in dieser Stadt gewesen. Das belastete mich. Ich hatte es ins Rollen gebracht. Es hatte einen echten Preis, und ich zwang mich, ihn mir unverblümt anzusehen, statt wegzuschauen.</w:t>
-      </w:r>
-    </w:p>
-    <w:p/>
-    <w:p>
-      <w:r>
-        <w:t>Für Theo war es schlimmer, denn die Gesellschaft war sein ganzer Lebensinhalt gewesen, und die Gesellschaft war das Einzige, was er aufgeben musste.</w:t>
-      </w:r>
-    </w:p>
-    <w:p/>
-    <w:p>
-      <w:r>
-        <w:t>Er trat zurück. Nicht für eine Weile, um klammheimlich wieder auf seinen Stuhl zurückzukehren, sobald die Stadt es leid war, wütend zu sein. Er trat als Leiter der Frost Falls Historical Society zurück, und der Vorstand nahm, nachdem er alles wusste, den Rücktritt an und meinte es ernst. Ein Mann konnte nicht mithilfe der Sammlung und des Briefpapiers der Gesellschaft einen Nachbarn erpressen und danach die Schlüssel zu dem Ort behalten.</w:t>
-      </w:r>
-    </w:p>
-    <w:p/>
-    <w:p>
-      <w:r>
-        <w:t>Aber sie verwarfen ihn nicht völlig. Sie taten nicht so, als hätte ein Mann, der die Geschichte dieser Stadt dreißig Jahre lang geliebt hatte, sie nie geliebt. Noriko, der Vorstand und Fiona, die jedes Recht der Welt gehabt hätte, seinen Kopf zu fordern, und es nicht tat, bauten ihm stattdessen eine Tür, durch die er eines Tages vielleicht wieder eintreten konnte – über Jahre hinweg, notfalls auf den Knien, wenn es darauf ankam. Er durfte bei der Gesellschaft ehrenamtlich mitarbeiten. Unter Aufsicht. Bei den demütigsten Arbeiten, die es gab, beim Ausbessern und Sortieren, den geduldigen Aufgaben, für die einem nie jemand dankt. Nichts leitend. Ohne Vertrauen in die Schlüssel. Einfach nur zugelassen, langsam, Zoll für Zoll den Platz zurückzuverdienen, den er weggeworfen hatte. Wenn er sich über eine hinreichend lange Zeit bewährte, würde die Stadt es sehen. Wenn nicht, läge das an ihm.</w:t>
+        <w:t xml:space="preserve">Für Vera bedeutete das, zurückzuzahlen, was sie konnte, in Raten, die sie jeden Monat in den Knochen spüren würde, eine lange Bewährungszeit und der Abschied aus dem Bürgermeisteramt. Sie trat in der Woche darauf zurück. Es war das Richtige, und es kostete sie sehr viel, denn so schlecht der Bürgermeister sie auch bezahlt hatte, dieser Schreibtisch war seit fünfzehn Jahren ihr Platz in dieser Stadt gewesen. Das belastete mich. Ich hatte es ins Rollen gebracht. Es hatte einen echten Preis, und ich zwang mich, ihn mir unverblümt anzusehen, statt wegzuschauen.</w:t>
+      </w:r>
+    </w:p>
+    <w:p/>
+    <w:p>
+      <w:r>
+        <w:t xml:space="preserve">Für Theo war es schlimmer, denn der Verein war sein ganzer Lebensinhalt gewesen, und der Verein war das Einzige, was er aufgeben musste.</w:t>
+      </w:r>
+    </w:p>
+    <w:p/>
+    <w:p>
+      <w:r>
+        <w:t xml:space="preserve">Er trat zurück. Nicht für eine Weile, um klammheimlich wieder auf seinen Stuhl zurückzukehren, sobald die Stadt es leid war, wütend zu sein. Er trat als Leiter des Historischen Vereins von Frost Falls zurück, und der Vorstand nahm, nachdem er alles wusste, den Rücktritt an und meinte es ernst. Ein Mann konnte nicht mithilfe der Sammlung und des Briefpapiers des Vereins einen Nachbarn erpressen und danach die Schlüssel zu dem Ort behalten.</w:t>
+      </w:r>
+    </w:p>
+    <w:p/>
+    <w:p>
+      <w:r>
+        <w:t xml:space="preserve">Aber sie verstießen ihn nicht. Sie taten nicht so, als hätte ein Mann, der die Geschichte dieser Stadt dreißig Jahre lang geliebt hatte, sie nie geliebt. Noriko, der Vorstand und Fiona, die jedes Recht der Welt gehabt hätte, seinen Kopf zu fordern, und es nicht tat, bauten ihm stattdessen eine Tür, durch die er eines Tages vielleicht wieder eintreten konnte – über Jahre hinweg, notfalls auf den Knien, wenn es darauf ankam. Er durfte beim Verein ehrenamtlich mitarbeiten. Unter Aufsicht. Bei den demütigsten Arbeiten, die es gab, beim Ausbessern und Sortieren, den geduldigen Aufgaben, für die einem nie jemand dankt. Nichts leitend. Ohne dass man ihm die Schlüssel anvertraute. Einfach nur zugelassen, langsam, Zentimeter für Zentimeter den Platz zurückzuverdienen, den er weggeworfen hatte. Wenn er sich über eine hinreichend lange Zeit bewährte, würde die Stadt es sehen. Wenn nicht, läge das an ihm.</w:t>
       </w:r>
     </w:p>
     <w:p/>
@@ -4199,7 +4199,7 @@
     <w:p/>
     <w:p>
       <w:r>
-        <w:t>Vera ging ich danach allein besuchen. Ich traf sie an, als sie die letzten Sachen von ihrem Schreibtisch im Rathaus einpackte, und half ihr, einen Karton zu ihrem Auto zu tragen. Pip wartete auf der untersten Stufe und behielt einen Briefbeschwerer aus Messing im Auge, der oben aus dem Karton herausliff. Auf den kalten Stufen sagte ich Vera, was ich ihr sagen wollte.</w:t>
+        <w:t xml:space="preserve">Vera ging ich danach allein besuchen. Ich traf sie an, als sie die letzten Sachen von ihrem Schreibtisch im Rathaus einpackte, und half ihr, einen Karton zu ihrem Auto zu tragen. Pip wartete auf der untersten Stufe und behielt einen Briefbeschwerer aus Messing im Auge, der oben aus dem Karton herauslugte. Auf den kalten Stufen sagte ich Vera, was ich ihr sagen wollte.</w:t>
       </w:r>
     </w:p>
     <w:p/>
@@ -4211,19 +4211,19 @@
     <w:p/>
     <w:p>
       <w:r>
-        <w:t>Sie weinte. Sie umarmte mich, diese steife,geknöpfte Frau, die ich noch nie einen Menschen hatte umarmen sehen, und sagte an meiner Schulter Danke. Dann fuhr sie zu ihrer Schwester, und Pip und ich gingen im anbrechenden Dunkel nach Hause. Es lag absolut kein Triumph darin. Ich war schwer und bis ins Innerste müde, als hätte ich eine Wunde bis zum Grund ausgereinigt: Es tat weh, weit mehr, als sie in Ruhe zu lassen, aber nun konnte sie heilen.</w:t>
-      </w:r>
-    </w:p>
-    <w:p/>
-    <w:p>
-      <w:r>
-        <w:t>Fiona war frei. Die Briefe hatten aufgehört. Das Geheimnis war ans Licht gekommen, und im Licht hatte es keinerlei Zähne mehr. Zwei Menschen, die vom Weg abgekommen waren, sahen der Realität nun ins Auge und begannen – gerade erst zu beginnen –, den langen Marsch zurück zu sich selbst anzutreten.</w:t>
-      </w:r>
-    </w:p>
-    <w:p/>
-    <w:p>
-      <w:r>
-        <w:t>Das hätte das Ende sein müssen. Doch da war nach wie vor die Sache mit der Gesellschaft selbst, genau jenem Ort, den Theo sich ruiniert hatte zu retten. Er war nun weg von dort. Das Dach ließ nach wie vor Regen durch, und die Heizung gab weiterhin den Geist auf, und nichts in der ganzen Abrechnung hatte auch nur einen einzigen Dollar zu dem einen oder dem anderen beigesteuert.</w:t>
+        <w:t xml:space="preserve">Sie weinte. Sie umarmte mich, diese steife, zugeknöpfte Frau, die ich noch nie einen Menschen hatte umarmen sehen, und sagte an meiner Schulter Danke. Dann fuhr sie zu ihrer Schwester, und Pip und ich gingen im anbrechenden Dunkel nach Hause. Es lag absolut kein Triumph darin. Ich war schwer und bis ins Innerste müde, als hätte ich eine Wunde bis zum Grund ausgereinigt: Es tat weh, weit mehr, als sie in Ruhe zu lassen, aber nun konnte sie heilen.</w:t>
+      </w:r>
+    </w:p>
+    <w:p/>
+    <w:p>
+      <w:r>
+        <w:t xml:space="preserve">Fiona war frei. Die Briefe hatten aufgehört. Das Geheimnis war ans Licht gekommen, und im Licht hatte es keinerlei Zähne mehr. Zwei Menschen, die vom Weg abgekommen waren, sahen der Realität nun ins Auge und begannen – gerade erst –, den langen Marsch zurück zu sich selbst anzutreten.</w:t>
+      </w:r>
+    </w:p>
+    <w:p/>
+    <w:p>
+      <w:r>
+        <w:t xml:space="preserve">Das hätte das Ende sein müssen. Doch da war nach wie vor die Sache mit dem Verein selbst, genau jenem Ort, den Theo sich ruiniert hatte zu retten. Er war nun weg von dort. Das Dach ließ nach wie vor Regen durch, und die Heizung gab weiterhin den Geist auf, und nichts in der ganzen Abrechnung hatte auch nur einen einzigen Dollar zu dem einen oder dem anderen beigesteuert.</w:t>
       </w:r>
     </w:p>
     <w:p/>
@@ -4250,7 +4250,7 @@
     </w:p>
     <w:p>
       <w:r>
-        <w:t>„Mrs. Claus“, sagte er. „Wir haben diese Stadt in den Wochen hier ins Herz geschlossen. Aufrichtig ins Herz geschlossen. Und wir haben gehört, dass der Historische Verein in arigen finanziellen Nöten ist. Ernsthaften Nöten, wie man uns zugetragen hat.“ Er lächelte, warm und zuversichtlich. „Wir sind in der Lage zu helfen. Großzügig. Genug, um die ganze Sache mit einem Schlag zu regeln – das Dach, die Heizung und obendrein eine Stiftung, damit der Ort für eine Generation sicher ist. Ich würde den Scheck heute Vormittag vor unserer Abreise gern noch ausstellen. Uns würde das fast nichts kosten, aber hier würde es eine Menge bedeuten, und ehrlich gesagt, nach all dem Unschönen, finde ich, dass die Stadt zum Ausklang der Saison ein paar gute Nachrichten gebrauchen könnte.“</w:t>
+        <w:t xml:space="preserve">„Mrs. Claus“, sagte er. „Wir haben diese Stadt in den Wochen hier ins Herz geschlossen. Aufrichtig ins Herz geschlossen. Und wir haben gehört, dass der Historische Verein in argen finanziellen Nöten ist. Ernsthaften Nöten, wie man uns zugetragen hat.“ Er lächelte, warm und zuversichtlich. „Wir sind in der Lage zu helfen. Großzügig. Genug, um die ganze Sache mit einem Schlag zu regeln – das Dach, die Heizung und obendrein eine Stiftung, damit der Ort für eine Generation sicher ist. Ich würde den Scheck heute Vormittag vor unserer Abreise gern noch ausstellen. Uns würde das fast nichts kosten, aber hier würde es eine Menge bedeuten, und ehrlich gesagt, nach all dem Unschönen, finde ich, dass die Stadt zum Ausklang der Saison ein paar gute Nachrichten gebrauchen könnte.“</w:t>
       </w:r>
     </w:p>
     <w:p>
@@ -4280,7 +4280,7 @@
     </w:p>
     <w:p>
       <w:r>
-        <w:t>„In dieser Stadt ist gerade etwas Unschönes passiert“, sagte ich, „weil ein anständiger Mann zu der Überzeugung gelangte, die Rettung des Vereins heilige alles, eine Rettung sei ein Unrecht wert, und das Ende werde die Mittel schon heiligen. Nun. Wenn der Scheck eines vorbeikommenden Fremden den Verein nächste Woche rettet, so gütig er auch sein mag, dann zieht die ganze Stadt daraus insgeheim den Schluss, dass Theo zumindest in diesem einen Punkt recht hatte. Dass das Überleben des Gebäudes etwas ist, das von außen kommt – durch Geld, durch eine Abkürzung, durch einen Wohltäter –, und eben nichts, was die Stadt selbst wollen, wofür sie arbeiten und was sie sich verdienen muss.“ Ich schüttelte den Kopf. „Ein Verein, den ein großzügiger Gast rettet, ist nur aufgeschoben, Mr. Worthington. In fünf Jahren sitzt er in derselben Klemme und wartet darauf, dass der nächste reiche Besucher Gefallen an den Quilts findet. Dieser Ort ist nur dann wirklich sicher, wenn Frost Falls von sich aus beschließt, dass er es wert ist, gerettet zu werden, und ihn mit den eigenen Händen rettet, aus den eigenen Taschen, mögen sie noch so leer sein. Das dauert länger. Es ist ungleich schwerer. Aber das ist die Variante, die Bestand hat, und sie heilt das, was hier gerade passiert ist, anstatt nur ein fröhliches Plakat drüberzukleben.“</w:t>
+        <w:t xml:space="preserve">„In dieser Stadt ist gerade etwas Unschönes passiert“, sagte ich, „weil ein anständiger Mann zu der Überzeugung gelangte, die Rettung des Vereins heilige alles, eine Rettung sei ein Unrecht wert, und das Ende werde die Mittel schon heiligen. Nun. Wenn der Scheck eines vorbeikommenden Fremden den Verein nächste Woche rettet, so gütig er auch sein mag, dann zieht die ganze Stadt daraus insgeheim den Schluss, dass Theo zumindest in diesem einen Punkt recht hatte. Dass das Überleben des Gebäudes etwas ist, das von außen kommt – durch Geld, durch eine Abkürzung, durch einen Wohltäter –, und eben nichts, was die Stadt selbst wollen, wofür sie arbeiten und was sie sich verdienen muss.“ Ich schüttelte den Kopf. „Ein Verein, den ein großzügiger Gast rettet, ist nur aufgeschoben, Mr. Worthington. In fünf Jahren sitzt er in derselben Klemme und wartet darauf, dass der nächste reiche Besucher Gefallen an den Steppdecken findet. Dieser Ort ist nur dann wirklich sicher, wenn Frost Falls von sich aus beschließt, dass er es wert ist, gerettet zu werden, und ihn mit den eigenen Händen rettet, aus den eigenen Taschen, mögen sie noch so leer sein. Das dauert länger. Es ist ungleich schwerer. Aber das ist die Variante, die Bestand hat, und sie heilt das, was hier gerade passiert ist, anstatt nur ein fröhliches Plakat drüberzukleben.“</w:t>
       </w:r>
     </w:p>
     <w:p>
@@ -4341,7 +4341,7 @@
     </w:p>
     <w:p>
       <w:r>
-        <w:t>Ein paar Tage darauf kam sie zu mir in die Hütte, Nials Ordner unter dem Arm und mit einem Gesichtsausdruck, den ich so noch nie bei ihr gesehen hatte – entschlossen und ein wenig wild.</w:t>
+        <w:t xml:space="preserve">Ein paar Tage darauf kam sie zu mir ins Häuschen, Neils Ordner unter dem Arm und mit einem Gesichtsausdruck, den ich so noch nie bei ihr gesehen hatte – entschlossen und ein wenig wild.</w:t>
       </w:r>
     </w:p>
     <w:p>
@@ -4356,12 +4356,12 @@
     </w:p>
     <w:p>
       <w:r>
-        <w:t>Und Fiona tat es. Sie ließ Claire die wahre und vollständige Version für den Gazette schreiben, zusammen mit Nials Dokumenten als Beleg. Nicht die Klatschversion mit ihrem sauberen kleinen Bösewicht und ihrem sauberen kleinen Verbrechen, sondern die echte. Constance Okafor, ein neunzehnjähriges Stubenmädchen im Winter von 1924, monatelang unbezahlt, während ihre Mutter drei Straßen weiter ohne Geld für einen Arzt im Sterben lag, der man eingetrichtert hatte, dankbar für ein Dach über dem Kopf zu sein, während sie Tag für Tag eine Brosche abstaubte, die mehr wert war, als sie in drei Leben verdienen würde. Ein verzweifeltes Mädchen, das sich das Einzige nahm, was sie erreichen konnte, von einer Familie, die sie zuerst bestohlen hatte, und daraus hundert Jahre ehrliche Gastfreundschaft für die Reisenden machte, die in der Kälte durch Frost Falls zogen.</w:t>
-      </w:r>
-    </w:p>
-    <w:p>
-      <w:r>
-        <w:t>Claire schrieb es einfühlsam, weil Claire einfühlsam war und weil die Wahrheit sich als gut erwies, sobald man die ganze Geschichte erzählte statt nur die schlimmste Hälfte. Der Artikel erschien an einem Donnerstag, auf der gesamten Vorderseite des Innenteils. Natürlich redeten die Leute. Sie hätten selbst über das Wetter geredet, wenn es sonst nichts gegeben hätte. Aber sie redeten nicht so, wie Fiona ihr Leben lang befürchtet hatte. Niemand wandte sich ab. Niemand musterte sie im Bäckereiladen von der Seite. Meistens fügten sie es nahtlos ein in all das, was sie von ihren eigenen Leuten wussten, die gekämpft, Fehler gemacht und ausgeharrt hatten. Die Hälfte von ihnen hatte eine Urgroßmutter, die in einem harten Winter einst etwas Leises und Verzweifeltes getan hatte.</w:t>
+        <w:t xml:space="preserve">Und Fiona tat es. Sie ließ Claire die wahre und vollständige Version für die Gazette schreiben, zusammen mit Neils Dokumenten als Beleg. Nicht die Klatschversion mit ihrem sauberen kleinen Bösewicht und ihrem sauberen kleinen Verbrechen, sondern die echte. Constance Okafor, ein neunzehnjähriges Stubenmädchen im Winter von 1924, monatelang unbezahlt, während ihre Mutter drei Straßen weiter ohne Geld für einen Arzt im Sterben lag, der man eingetrichtert hatte, dankbar für ein Dach über dem Kopf zu sein, während sie Tag für Tag eine Brosche abstaubte, die mehr wert war, als sie in drei Leben verdienen würde. Ein verzweifeltes Mädchen, das sich das Einzige nahm, was sie erreichen konnte, von einer Familie, die sie zuerst bestohlen hatte, und daraus hundert Jahre ehrliche Gastfreundschaft für die Reisenden machte, die in der Kälte durch Frost Falls zogen.</w:t>
+      </w:r>
+    </w:p>
+    <w:p>
+      <w:r>
+        <w:t xml:space="preserve">Claire schrieb es einfühlsam, weil Claire einfühlsam war und weil die Wahrheit sich als gütig erwies, sobald man die ganze Geschichte erzählte statt nur die schlimmste Hälfte. Der Artikel erschien an einem Donnerstag, auf der gesamten Vorderseite des Innenteils. Natürlich redeten die Leute. Sie hätten selbst über das Wetter geredet, wenn es sonst nichts gegeben hätte. Aber sie redeten nicht so, wie Fiona ihr Leben lang befürchtet hatte. Niemand wandte sich ab. Niemand musterte sie im Bäckereiladen von der Seite. Meistens fügten sie es nahtlos ein in all das, was sie von ihren eigenen Leuten wussten, die gekämpft, Fehler gemacht und ausgeharrt hatten. Die Hälfte von ihnen hatte eine Urgroßmutter, die in einem harten Winter einst etwas Leises und Verzweifeltes getan hatte.</w:t>
       </w:r>
     </w:p>
     <w:p>
@@ -4371,7 +4371,7 @@
     </w:p>
     <w:p>
       <w:r>
-        <w:t>„Constance Okafor hat gestohlen, um zu versuchen, ihre Mutter zu retten“, sagte sie, „und hat ein Haus gebaut, das diesen Ort seither seit hundert Jahren warmgehalten hat. Wenn hier in Frost Falls irgendjemand den ersten Stein nach ihr werfen will wegen einer Brosche, dann kann derjenige kommen und ihn zuerst nach mir werfen, denn ich habe solche Not gekannt, als ich ein Mädchen war, echte Not, und die Großmütter der Hälfte der Leute, die hier im Laden sitzen, ebenfalls. Lasst sie ruhen. Lasst Fiona aufrecht stehen. Das ist eine gute Geschichte. Sie hat eben nur einen schweren Teil in der Mitte.“</w:t>
+        <w:t xml:space="preserve">„Constance Okafor hat gestohlen, um zu versuchen, ihre Mutter zu retten“, sagte sie, „und hat ein Haus gebaut, das diesen Ort seither hundert Jahre lang warmgehalten hat. Wenn hier in Frost Falls irgendjemand den ersten Stein nach ihr werfen will wegen einer Brosche, dann kann derjenige kommen und ihn zuerst nach mir werfen, denn ich habe solche Not gekannt, als ich ein Mädchen war, echte Not, und die Großmütter der Hälfte der Leute, die hier im Laden sitzen, ebenfalls. Lasst sie ruhen. Lasst Fiona aufrecht stehen. Das ist eine gute Geschichte. Sie hat eben nur einen schweren Teil in der Mitte.“</w:t>
       </w:r>
     </w:p>
     <w:p>
@@ -4391,17 +4391,17 @@
     </w:p>
     <w:p>
       <w:r>
-        <w:t>Aber meistens geschah das Gegenteil. Die Leute fingen an, leise, von der Seite, so wie dieses Städtchen seine tiefsten Dinge tat, zu kommen und sich bei mir zu bedanken. Dot drückte mir auf dem Markt ein Glas ihrer eingemachten Früchte in die Hand und sagte brummig, während sie auf die Äpfel blickte und nicht auf mich: „Du hast dich Fiona gegenüber richtig verhalten. Die meisten hätten weggeschaut.“ Sam Patel zog drüben auf lauter Evergreen Avenue respektvoll den Hut vor mir. Sogar Noriko, die mit Lob sparsam umging, sagte mir bei einer Tasse Kaffee, ich hätte die Sache besser gehandelt als die meisten professionellen Leute, mit denen sie in ihrer Laufbahn zusammengearbeitet hatte, und ich hätte einen warmen Weg durch etwas gefunden, das fast immer nur kalte Wege kenne.</w:t>
-      </w:r>
-    </w:p>
-    <w:p>
-      <w:r>
-        <w:t>Und Martha. Martha ergriff an einem grauen Nachmittag im Strickkreis meine Hand, hielt sie fest und sagte: „Weißt du noch, vor einiger Zeit, als ich dir gesagt habe, du müsstest Dinge nicht allein mit dir herumtragen? Dass ein Kreis zum Anlehnen da ist?“ Ich antwortete, dass ich mich gut daran erinnerte. „Nun“, sagte sie, „du bist hingegangen und hast bewiesen, dass du eine von uns bist, indem du das so getragen hast. Du hast dich nicht nur an den Kreis angelehnt, wenn du es brauchst. Du warst der Kreis, für Fiona, als sie niemanden sonst hatte. Eine Fremde tut das nicht, Jessica. Das tut nur jemand von uns.“ Und sie klopfte mir einmal sanft auf die Hand und ging sofort wieder an ihren Fäustling, als hätte sie mich in diesem Augenblick auf meinem Stuhl nicht gerade völlig aus der Fassung gebracht.</w:t>
-      </w:r>
-    </w:p>
-    <w:p>
-      <w:r>
-        <w:t>Ich war als halbe Fremde von der Spitze der Welt heruntergekommen und hatte jeden kalten Morgen nach einem Mantel gegriffen, der noch nicht richtig eingenäht war. Und irgendwo in der schlimmsten Geschichte, die ich in Frost Falls je erlebt hatte, während des Vollbringens einer schweren Tat auf die richtige Weise, hatte sich der Mantel eingetragen. Niemand hatte sich hingesetzt und das beschlossen. Ich hatte diesen Ort genug geliebt, um das Richtige und Schwere für ihn zu tun. Die Menschen hier hatten mir dabei zugesehen und in ihrer langsamen, verschmitzten Art beschlossen, dass ich zu ihnen gehörte.</w:t>
+        <w:t xml:space="preserve">Aber meistens geschah das Gegenteil. Die Leute fingen an, leise, von der Seite, so wie dieses Städtchen seine tiefsten Dinge tat, zu kommen und sich bei mir zu bedanken. Dot drückte mir auf dem Markt ein Glas ihrer eingemachten Früchte in die Hand und sagte brummig, während sie auf die Äpfel blickte und nicht auf mich: „Du hast dich Fiona gegenüber richtig verhalten. Die meisten hätten weggeschaut.“ Sam Patel zog quer über die Evergreen Avenue hinweg respektvoll den Hut vor mir. Sogar Noriko, die mit Lob sparsam umging, sagte mir bei einer Tasse Kaffee, ich hätte die Sache besser gehandhabt als die meisten professionellen Leute, mit denen sie in ihrer Laufbahn zusammengearbeitet hatte, und ich hätte einen warmen Weg durch etwas gefunden, das fast immer nur kalte Wege kenne.</w:t>
+      </w:r>
+    </w:p>
+    <w:p>
+      <w:r>
+        <w:t xml:space="preserve">Und Martha. Martha ergriff an einem grauen Nachmittag im Strickkreis meine Hand, hielt sie fest und sagte: „Weißt du noch, vor einiger Zeit, als ich dir gesagt habe, du müsstest Dinge nicht allein mit dir herumtragen? Dass ein Kreis zum Anlehnen da ist?“ Ich antwortete, dass ich mich gut daran erinnerte. „Nun“, sagte sie, „du bist hingegangen und hast bewiesen, dass du eine von uns bist, indem du das so getragen hast. Du hast dich nicht nur an den Kreis angelehnt, wenn du es brauchtest. Du warst der Kreis, für Fiona, als sie niemanden sonst hatte. Eine Fremde tut das nicht, Jessica. Das tut nur jemand von uns.“ Und sie klopfte mir einmal sanft auf die Hand und ging sofort wieder an ihren Fäustling, als hätte sie mich in diesem Augenblick auf meinem Stuhl nicht gerade völlig aus der Fassung gebracht.</w:t>
+      </w:r>
+    </w:p>
+    <w:p>
+      <w:r>
+        <w:t xml:space="preserve">Ich war als halbe Fremde von der Spitze der Welt heruntergekommen und hatte jeden kalten Morgen nach einem Mantel gegriffen, der noch nicht richtig eingetragen war. Und irgendwo in der schlimmsten Geschichte, die ich in Frost Falls je erlebt hatte, während des Vollbringens einer schweren Tat auf die richtige Weise, hatte sich der Mantel eingetragen. Niemand hatte sich hingesetzt und das beschlossen. Ich hatte diesen Ort genug geliebt, um das Richtige und Schwere für ihn zu tun. Die Menschen hier hatten mir dabei zugesehen und in ihrer langsamen, verhaltenen Art beschlossen, dass ich zu ihnen gehörte.</w:t>
       </w:r>
     </w:p>
     <w:p>
@@ -4417,7 +4417,7 @@
     <w:p/>
     <w:p>
       <w:r>
-        <w:t>Die Gesellschaft brauchte nach Theo dringend etwas Ordnung, weshalb sich der Kreis und gut die Hälfte der Evergreen Avenue in den nächsten Tagen daran machten, das Archiv wieder in Stand zu setzen.</w:t>
+        <w:t xml:space="preserve">Der Verein brauchte nach Theo dringend etwas Ordnung, weshalb sich der Kreis und gut die Hälfte der Evergreen Avenue in den nächsten Tagen daran machten, das Archiv wieder in Stand zu setzen.</w:t>
       </w:r>
     </w:p>
     <w:p>
@@ -4443,22 +4443,22 @@
     </w:p>
     <w:p>
       <w:r>
-        <w:t>„Die Zeitkapsel“, sagte Olivia leise. „Theo hat sich deswegen schon die Haare gerauft. Jede Aufzeichnung, die er hatte, besagte nur, dass sie auf dem Anger vergraben worden war, und der Anger ist vier Hektar groß. Sie liegt unter der Ulme. Sie war die ganze Zeit über genau da.“</w:t>
-      </w:r>
-    </w:p>
-    <w:p>
-      <w:r>
-        <w:t>Innerhalb einer Stunde stand die halbe Frost Falls auf dem Anger rund um die große Ulme mit Schaufeln und Laternen, in einer gebannten, atemlosen Stille, wie ich sie von dieser lauten und freundlichen Stadt noch nie erlebt hatte.</w:t>
-      </w:r>
-    </w:p>
-    <w:p>
-      <w:r>
-        <w:t>Sam Patel übernahm das Graben, weil Sam die schwere, ehrliche Arbeit verrichtete und sie mochte. Wir standen alle im goldenen Licht der Laternen und der Lichterketten im Kreis um ihn herum, und unser Atem stieg in der Kälte gemeinsam auf. Emma Redfern hielt meine Hand auf der einen Seite, und Pip lehnte sich warm an meinen Stiefel auf der anderen. Schneeball trug seinen Geweihhut. Mark stand hinter seiner Tochter und hatte die Hände auf ihren Schultern. Der ganze Kreis war anwesend, und auch Neil Carter, der länger geblieben war, als er geplant hatte, und hinten stand, wobei sein Notizbuch diesmal in seiner Tasche verstaut war. Als Sams Schaufel auf etwas stieß, das dumpf, massiv und metallisch klang, gab der gesamte Anger gleichzeitig einen Laut von sich, ein leises, erstauntes Oh, das in der kalten Luft hinhängte.</w:t>
-      </w:r>
-    </w:p>
-    <w:p>
-      <w:r>
-        <w:t>Sie kam aus der kalten Erde empor, eingewickelt in Teer und Zeit, eine Kupferkiste, die vom Jahrhundert grün angelaufen war, fest und schwer verschlossen, genau dorthin, wo eine Hand sie hundert Weihnachten, bevor die meisten von uns geboren waren, abgestellt hatte.</w:t>
+        <w:t xml:space="preserve">„Die Zeitkapsel“, sagte Olivia leise. „Theo hat sich deswegen schon die Haare gerauft. Jede Aufzeichnung, die er hatte, besagte nur, dass sie auf dem Anger vergraben worden war, und der Anger ist anderthalb Hektar groß. Sie liegt unter der Ulme. Sie war die ganze Zeit über genau da.“</w:t>
+      </w:r>
+    </w:p>
+    <w:p>
+      <w:r>
+        <w:t xml:space="preserve">Innerhalb einer Stunde stand das halbe Frost Falls auf dem Anger rund um die große Ulme mit Schaufeln und Laternen, in einer gebannten, atemlosen Stille, wie ich sie von dieser lauten und freundlichen Stadt noch nie erlebt hatte.</w:t>
+      </w:r>
+    </w:p>
+    <w:p>
+      <w:r>
+        <w:t xml:space="preserve">Sam Patel übernahm das Graben, weil Sam die schwere, ehrliche Arbeit verrichtete und sie mochte. Wir standen alle im goldenen Licht der Laternen und der Lichterketten im Kreis um ihn herum, und unser Atem stieg in der Kälte gemeinsam auf. Emma Redfern hielt meine Hand auf der einen Seite, und Pip lehnte sich warm an meinen Stiefel auf der anderen. Schneeball trug seinen Geweihhut. Mark stand hinter seiner Tochter und hatte die Hände auf ihren Schultern. Der ganze Kreis war anwesend, und auch Neil Carter, der länger geblieben war, als er geplant hatte, und hinten stand, wobei sein Notizbuch diesmal in seiner Tasche verstaut war. Als Sams Schaufel auf etwas stieß, das dumpf, massiv und metallisch klang, gab der gesamte Anger gleichzeitig einen Laut von sich, ein leises, erstauntes Oh, das in der kalten Luft hängen blieb.</w:t>
+      </w:r>
+    </w:p>
+    <w:p>
+      <w:r>
+        <w:t xml:space="preserve">Sie kam aus der kalten Erde empor, eingewickelt in Teer und Zeit, eine Kupferkiste, die vom Jahrhundert grün angelaufen war, fest und schwer verschlossen, genau dort, wo eine Hand sie hundert Weihnachten, bevor die meisten von uns geboren waren, abgestellt hatte.</w:t>
       </w:r>
     </w:p>
     <w:p>
@@ -4473,7 +4473,7 @@
     </w:p>
     <w:p>
       <w:r>
-        <w:t>„Er hat schließlich die halbe Spur zu ihr gefunden“, fuhr Noriko fort, „selbst wenn er sie auf Umwegen gesucht hat. Er hat dreißig Jahre seines Lebens darauf verwendet zu wissen, wo die vergrabenen Dinge dieser Stadt liegen. Er sollte dabeisein, wenn dieses hier ans Licht kommt. Es ist vielleicht das erste gute Ding, in dessen Nähe er wieder sein darf. Und in der Nähe von etwas Gutem zu stehen, für das er keine Lorbeeren erntet, ist vielleicht genau die Medizin, die er braucht.“</w:t>
+        <w:t xml:space="preserve">„Er hat schließlich die halbe Spur zu ihr gefunden“, fuhr Noriko fort, „selbst wenn er sie auf Umwegen gesucht hat. Er hat dreißig Jahre seines Lebens darauf verwendet zu wissen, wo die vergrabenen Dinge dieser Stadt liegen. Er sollte dabei sein, wenn dieses hier ans Licht kommt. Es ist vielleicht das erste gute Ding, in dessen Nähe er wieder sein darf. Und in der Nähe von etwas Gutem zu stehen, für das er keine Lorbeeren erntet, ist vielleicht genau die Medizin, die er braucht.“</w:t>
       </w:r>
     </w:p>
     <w:p>
@@ -4488,12 +4488,12 @@
     </w:p>
     <w:p>
       <w:r>
-        <w:t>Einen Augenblick später kam Bram über den Anger herbeigeeilt und wring seine Mütze aus, und hinter ihm kam natürlich ein Rentier. Diesmal Dancer, die sich schon wieder aus dem Paddock gelassen und den Laternen in die Stadt gefolgt war. Sie stand mitten auf dem Anger, während Reif auf ihrem Geweih glitzerte, und betrachtete die ausgegrabene Kupferkiste mit mildem, unaufgeregtem Interesse, während hundert Stadtbewohner starrten und ein kleines Mädchen laut vor purer Freude aufschrie.</w:t>
-      </w:r>
-    </w:p>
-    <w:p>
-      <w:r>
-        <w:t>„Das Schloss, Mrs. Claus!“, rief Bram und kam atemlos an. „Schon wieder von der falschen Seite! Ich gebe es auf, ich gebe die ganze Sache auf, die Tiere gehen dorthin, wo die Menschen sind, und jede Seele in der Stadt ist heute Abend hier draußen, was soll ein Vorarbeiter da schon machen, ich frage Sie!“</w:t>
+        <w:t xml:space="preserve">Einen Augenblick später kam Bram über den Anger herbeigeeilt, die Mütze in den Händen ringend, und hinter ihm kam natürlich ein Rentier. Diesmal Dancer, die sich schon wieder aus der Koppel gelassen und den Laternen in die Stadt gefolgt war. Sie stand mitten auf dem Anger, während Reif auf ihrem Geweih glitzerte, und betrachtete die ausgegrabene Kupferkiste mit mildem, unaufgeregtem Interesse, während hundert Stadtbewohner starrten und ein kleines Mädchen laut vor purer Freude aufschrie.</w:t>
+      </w:r>
+    </w:p>
+    <w:p>
+      <w:r>
+        <w:t xml:space="preserve">„Der Riegel, Mrs. Claus!“, rief Bram und kam atemlos an. „Schon wieder von der falschen Seite! Ich gebe es auf, ich gebe die ganze Sache auf, die Tiere gehen dorthin, wo die Menschen sind, und jede Seele in der Stadt ist heute Abend hier draußen, was soll ein Vorarbeiter da schon machen, ich frage Sie!“</w:t>
       </w:r>
     </w:p>
     <w:p>
@@ -4503,12 +4503,12 @@
     </w:p>
     <w:p>
       <w:r>
-        <w:t>Ich stand dort auf dem Anger und blickte mich um: auf die Ulme und das goldene Licht, die grünliche Kupferkiste, das Rentier, das lachende Kind und die ganze Stadt, die im Laternenlicht eng beieinanderstand. Pip war unter Dancers Nase gegangen und musterte das Rentier mit einem langen, strengen Blick, so als wolle sie sie daran erinnern, wem dieser Pinguin gehörte. Nicks Hand fand meine. Hinter dem Paddock lag die Feuerstelle, die er für die Magie gebaut hatte, und ich fragte mich, wie viel mehr davon dort kreisen würde, bis wir nach Hause kamen.</w:t>
-      </w:r>
-    </w:p>
-    <w:p>
-      <w:r>
-        <w:t>Wir trugen die Kiste gemeinsam hinauf zur Gesellschaft, ein Dutzend kalte Hände an einer einzigen grünen Kupferkiste, und stellten sie an den Ehrenplatz im vorderen Raum, noch immer versiegelt, voller all der Dinge, die eine vor hundert Jahren untergegangene Stadt es wert gefunden hatte, für uns aufzuheben. Ein Geheimnis, das im neuen Jahr gelüftet werden sollte. Ein Grund, die Türen der Gesellschaft zumindest so lange offen zu halten.</w:t>
+        <w:t xml:space="preserve">Ich stand dort auf dem Anger und blickte mich um: auf die Ulme und das goldene Licht, die grünliche Kupferkiste, das Rentier, das lachende Kind und die ganze Stadt, die im Laternenlicht eng beieinanderstand. Pip war unter Dancers Nase gegangen und musterte das Rentier mit einem langen, strengen Blick, so als wolle sie sie daran erinnern, wem dieser Pinguin gehörte. Nicks Hand fand meine. Hinter der Koppel lag die Herdstelle, die er für die Magie gebaut hatte, und ich fragte mich, wie viel mehr davon dort kreisen würde, bis wir nach Hause kamen.</w:t>
+      </w:r>
+    </w:p>
+    <w:p>
+      <w:r>
+        <w:t xml:space="preserve">Wir trugen die Kiste gemeinsam hinauf zum Verein, ein Dutzend kalte Hände an einer einzigen grünen Kupferkiste, und stellten sie an den Ehrenplatz im vorderen Raum, noch immer versiegelt, voller all der Dinge, die die Stadt vor hundert Jahren für wert befunden hatte, für uns aufzuheben. Ein Geheimnis, das im neuen Jahr gelüftet werden sollte. Ein Grund, die Türen des Vereins zumindest so lange offen zu halten.</w:t>
       </w:r>
     </w:p>
     <w:p>
@@ -4524,13 +4524,13 @@
     <w:p/>
     <w:p>
       <w:r>
-        <w:t>Die Festtagstische waren längst eingeklappt, das Gras gemäht, die geliehenen Stühle dorthin zurückgebracht worden, wo immer man sie hergehabt hatte. Aber die goldenen Lichter blieben überall im Städtchen hängen. Niemand nahm sie ab, und niemand fragte, warum sie golden geworden waren.</w:t>
-      </w:r>
-    </w:p>
-    <w:p/>
-    <w:p>
-      <w:r>
-        <w:t>Eines Abends in jener Woche begleitete ich Emma und Snowball nach Hause, wobei Pip vor uns herwatschelte und Mark neben mir ging. Emma plapperte den ganzen Weg über, wie sie es mittlerweile tat, über die Kupferkiste und was sich wohl darin befinden könnte. Münzen, glaubte sie. Oder einen Brief. Oder einen Schatz, einen echten Schatz, Gold, hoffte sie, und ob denn das ganze Städtchen zuschauen dürfe, und ob sie ganz nach vorne stehen könne, wenn sie ihn öffneten, schließlich sei sie direkt dagewesen, als er aus der Erde geholt worden war, und das müsse doch schließlich etwas zählen, oder?</w:t>
+        <w:t xml:space="preserve">Die Festtagstische waren längst eingeklappt, der Anger gefegt, die geliehenen Stühle dorthin zurückgebracht worden, wo immer man sie hergehabt hatte. Aber die goldenen Lichter blieben überall im Städtchen hängen. Niemand nahm sie ab, und niemand fragte, warum sie golden geworden waren.</w:t>
+      </w:r>
+    </w:p>
+    <w:p/>
+    <w:p>
+      <w:r>
+        <w:t xml:space="preserve">Eines Abends in jener Woche begleitete ich Emma und Snowball nach Hause, wobei Pip vor uns herwatschelte und Mark neben mir ging. Emma plapperte den ganzen Weg über, wie sie es mittlerweile tat, über die Kupferkiste und was sich wohl darin befinden könnte. Münzen, glaubte sie. Oder einen Brief. Oder einen Schatz, einen echten Schatz, Gold, hoffte sie, und ob denn das ganze Städtchen zuschauen dürfe, und ob sie ganz nach vorne stehen könne, wenn man die Kiste öffnete, schließlich sei sie direkt dabei gewesen, als sie aus der Erde geholt worden war, und das müsse doch schließlich etwas zählen, oder?</w:t>
       </w:r>
     </w:p>
     <w:p/>
@@ -4572,7 +4572,7 @@
     <w:p/>
     <w:p>
       <w:r>
-        <w:t>Am Tor der Redferns drückte Emma mir Snowballs Leine in die Hand. „Warte“, sagte sie. „Geh noch nicht.“ Sie rannte ins Haus und kam mit einem Einmachglas in beiden Händen wieder heraus.</w:t>
+        <w:t xml:space="preserve">Am Tor der Redferns drückte Emma mir Snowballs Leine in die Hand. „Warten Sie“, sagte sie. „Gehen Sie noch nicht.“ Sie rannte ins Haus und kam mit einem Einmachglas in beiden Händen wieder heraus.</w:t>
       </w:r>
     </w:p>
     <w:p/>
@@ -4584,7 +4584,7 @@
     <w:p/>
     <w:p>
       <w:r>
-        <w:t>„Er ist noch nicht einmal welk geworden“, flüsterte sie und warf einen Blick auf ihren Vater, der am Zaun stehen geblieben war, um sich mit einem Nachbarn zu unterhalten. „Ich wechsle das Wasser jeden Morgen. Dad glaubt, ich hätte ihn von dem Kranz im Gasthof.“</w:t>
+        <w:t xml:space="preserve">„Er ist noch nicht einmal welk geworden“, flüsterte sie und warf einen Blick auf ihren Vater, der am Zaun stehen geblieben war, um sich mit einem Nachbarn zu unterhalten. „Ich wechsle das Wasser jeden Morgen. Papa glaubt, ich hätte ihn von dem Kranz im Gasthof.“</w:t>
       </w:r>
     </w:p>
     <w:p/>
@@ -4626,7 +4626,7 @@
     <w:p/>
     <w:p>
       <w:r>
-        <w:t>„Es ist alles, was sie mich tun lassen“, sagte er, und dann schnell, bevor ich antworten konnte: „Was auch richtig ist. Ich beschvähre mich nicht. Es ist weit mehr, als ich mir an ihrer Stelle zugestanden hätte.“ Er glättete das alte Papier mit zwei Fingern. „Sie wollen die Kapsel im neuen Jahr öffnen. Hast du es gehört? Noriko sagt, ich darf dabei sein. Zum Zuschauen.“ Seine Augen liefen über. Er blinzelte heftig und beugte sich tiefer über die Karte. „Ich verdiene es nicht, dabei zu sein. Aber sie sagt, ich darf zusehen. Nach allem darf ich im Raum stehen, wenn das Städtchen sein Herz öffnet. Ich denke jeden Tag daran. Es ist ein großer Teil von dem, was mich am Leben hält, wenn ich ehrlich bin.“</w:t>
+        <w:t xml:space="preserve">„Es ist alles, was sie mich tun lassen“, sagte er, und dann schnell, bevor ich antworten konnte: „Was auch richtig ist. Ich beschwere mich nicht. Es ist weit mehr, als ich mir an ihrer Stelle zugestanden hätte.“ Er glättete das alte Papier mit zwei Fingern. „Sie wollen die Kapsel im neuen Jahr öffnen. Hast du es gehört? Noriko sagt, ich darf dabei sein. Zum Zuschauen.“ Seine Augen liefen über. Er blinzelte heftig und beugte sich tiefer über die Karte. „Ich verdiene es nicht, dabei zu sein. Aber sie sagt, ich darf zusehen. Nach allem darf ich im Raum stehen, wenn das Städtchen sein Herz öffnet. Ich denke jeden Tag daran. Es ist ein großer Teil von dem, was mich am Leben hält, wenn ich ehrlich bin.“</w:t>
       </w:r>
     </w:p>
     <w:p/>
@@ -4644,7 +4644,7 @@
     <w:p/>
     <w:p>
       <w:r>
-        <w:t>Nick wartete auf mich, als ich nach Hause kam. Er nahm an der Tür meine Hand und führte mich ohne ein Wort über den kalten Hof zur Werkstatt hinüber, wo er die Tür öffnete. Der Herd, den er gebaut hatte, glühte in der Mitte des Raumes, die runden Feldsteine warm und golden, und die Magie schwebte in langsamen Kreisen über dem leeren Rost. Es war mehr davon da als zuvor.</w:t>
+        <w:t xml:space="preserve">Nick wartete auf mich, als ich nach Hause kam. Er nahm an der Tür meine Hand und führte mich ohne ein Wort über den kalten Hof zur Werkstatt hinüber, wo er die Tür öffnete. Die Herdstelle, die er gebaut hatte, glühte in der Mitte des Raumes, die runden Feldsteine warm und golden, und die Magie schwebte in langsamen Kreisen über dem leeren Rost. Es war mehr davon da als zuvor.</w:t>
       </w:r>
     </w:p>
     <w:p/>
@@ -4656,7 +4656,7 @@
     <w:p/>
     <w:p>
       <w:r>
-        <w:t>„Ein kleines bisschen. Der Anfang davon.“ Er legte seinen Arm um mich. „Nicht alles, nicht für immer, noch nicht. Das sind noch Jahre an Arbeit, bis ein Herd groß genug gebaut ist, um die ganze Magie von Weihnachten in sich zu tragen. Aber es hat begonnen, Jess.“</w:t>
+        <w:t xml:space="preserve">„Ein kleines bisschen. Der Anfang davon.“ Er legte seinen Arm um mich. „Nicht alles, nicht für immer, noch nicht. Das sind noch Jahre an Arbeit, bis eine Herdstelle groß genug gebaut ist, um die ganze Magie von Weihnachten in sich zu tragen. Aber es hat begonnen, Jess.“</w:t>
       </w:r>
     </w:p>
     <w:p/>
@@ -4686,7 +4686,7 @@
     <w:p/>
     <w:p>
       <w:r>
-        <w:t>Wir gingen zusammen aus der goldenen Nacht hinein. Pip schlug uns beide an der Küchentür und stand dort, um Einlass in die Wärme zu fordern, und hinter uns, über den Hof hinweg, glühte der Herd in der Werkstatt weiter.</w:t>
+        <w:t xml:space="preserve">Wir gingen zusammen aus der goldenen Nacht hinein. Pip war vor uns beiden an der Küchentür und stand dort, um Einlass in die Wärme zu fordern, und hinter uns, über den Hof hinweg, glühte die Herdstelle in der Werkstatt weiter.</w:t>
       </w:r>
     </w:p>
     <w:p/>
@@ -4875,7 +4875,7 @@
     <w:p/>
     <w:p>
       <w:r>
-        <w:t xml:space="preserve">Wir waren an diesem Morgen alle dort. Der ganze Kreis, wenn niemand mit einer Erkältung das Haus hüttete oder Enkelkinder hütete. Olivia an der Spitze in ihrem eigenen Laden, Wollstränge in jeder Farbe, die man sich für den Winter wünschen konnte, hinter ihr aufgetürmt. Dot neben ihr, schlicht und flink. Dann Claire Bennett, die für die </w:t>
+        <w:t xml:space="preserve">Wir waren an diesem Morgen alle dort. Der ganze Kreis, wenn niemand mit einer Erkältung das Bett hütete oder Enkelkinder hütete. Olivia an der Spitze in ihrem eigenen Laden, Wollstränge in jeder Farbe, die man sich für den Winter wünschen konnte, hinter ihr aufgetürmt. Dot neben ihr, schlicht und flink. Dann Claire Bennett, die für die </w:t>
       </w:r>
       <w:r>
         <w:t>&lt;bt&gt;</w:t>
@@ -4935,7 +4935,7 @@
     <w:p/>
     <w:p>
       <w:r>
-        <w:t xml:space="preserve">„Niemand steht auf“, kündigte sie an, was ohnehin niemand auch nur im Geringsten vorgehabt hatte. Sie stellte eine Bäckereischachtel in der Größe einer Hutfuhr auf den Tisch zwischen die Tannenzapfen und das Band und stemmte die Fäuste in die Seiten, um uns zu mustern. Greta gehörte die </w:t>
+        <w:t xml:space="preserve">„Niemand steht auf“, kündigte sie an, was ohnehin niemand auch nur im Geringsten vorgehabt hatte. Sie stellte eine Bäckereischachtel in der Größe einer Hutschachtel auf den Tisch zwischen die Tannenzapfen und das Band und stemmte die Fäuste in die Seiten, um uns zu mustern. Greta gehörte die </w:t>
       </w:r>
       <w:r>
         <w:t>&lt;bt&gt;</w:t>
@@ -4971,7 +4971,7 @@
     <w:p/>
     <w:p>
       <w:r>
-        <w:t>Greta richtete rechtfertigend einen mehligen Finger auf sie und begann, die Cupcakes auf Papierservietten herumzureichen.</w:t>
+        <w:t xml:space="preserve">Greta richtete triumphierend einen mehligen Finger auf sie und begann, die Cupcakes auf Papierservietten herumzureichen.</w:t>
       </w:r>
     </w:p>
     <w:p/>
@@ -4995,7 +4995,7 @@
     <w:p/>
     <w:p>
       <w:r>
-        <w:t>Wir machten uns daraufhin ernsthaft an die Arbeit, acht Frauen, eine Schachtel Cupcakes, ein Pinguin und ein schlafender Hund. Das Gespräch wob sich in die Arbeit ein und wieder heraus, wie es bei solchen Runden üblich ist, die kleinen Neuigkeiten eines ganzen Vormorgens, die in den Pausen zwischen dem Binden der Zweige ausgetauscht wurden. Ivys Tochter hatte einen neuen Job in Concord. Claire hatte für Donnerstag einen Artikel über den Räumdienst, von dem sie uns hoch und heilig versprach, er sei interessanter, als er klinge. Martha erzählte, die Tage würden sich jetzt so schnell verkürzen, dass Emma fast im Dunkeln komme, um Snowball auszuführen, und ich sagte, ich solle das Kind grüßen. Martha erwiderte, Emma frage immer nach Pip. Und Pip, die ihren Namen hörte und ihn völlig zu Recht als Lob verstand, plusterte die Federn auf und sah zufrieden aus.</w:t>
+        <w:t xml:space="preserve">Wir machten uns daraufhin ernsthaft an die Arbeit, acht Frauen, eine Schachtel Cupcakes, ein Pinguin und ein schlafender Hund. Das Gespräch wob sich in die Arbeit ein und wieder heraus, wie es bei solchen Runden üblich ist, die kleinen Neuigkeiten eines ganzen Vormittags, die in den Pausen zwischen dem Binden der Zweige ausgetauscht wurden. Ivys Tochter hatte einen neuen Job in Concord. Claire hatte für Donnerstag einen Artikel über den Räumdienst, von dem sie uns hoch und heilig versprach, er sei interessanter, als er klinge. Martha erzählte, die Tage würden sich jetzt so schnell verkürzen, dass Emma fast im Dunkeln komme, um Snowball auszuführen, und ich sagte, sie solle das Kind von mir grüßen. Martha erwiderte, Emma frage immer nach Pip. Und Pip, die ihren Namen hörte und ihn völlig zu Recht als Lob verstand, plusterte die Federn auf und sah zufrieden aus.</w:t>
       </w:r>
     </w:p>
     <w:p/>
@@ -5013,7 +5013,7 @@
     <w:p/>
     <w:p>
       <w:r>
-        <w:t xml:space="preserve">Das riss den Kreis von der Drahtarbeit los. Der alte Fenwick-Laden hatte ein gutes Jahr lang leer gestanden, mit dunklen Fenstern am Ende eines hellen Blocks. It was the kind of gap in a row of shops people learn not to look at, so as not to feel the little pang of it. </w:t>
+        <w:t xml:space="preserve">Das riss den Kreis von der Drahtarbeit los. Der alte Fenwick-Laden hatte ein gutes Jahr lang leer gestanden, mit dunklen Fenstern am Ende eines hellen Blocks. Es war die Art Lücke in einer Ladenzeile, bei der die Leute lernen wegzusehen, um den kleinen Stich nicht zu spüren. </w:t>
       </w:r>
     </w:p>
     <w:p/>
@@ -5031,7 +5031,7 @@
     <w:p/>
     <w:p>
       <w:r>
-        <w:t>„Nun“, sagte Ivy with satisfaction, „etwas öffnet sich. Wird auch Zeit. Ein dunkles Geschäft ist eine Schande für die Straße.“ Es gab ein allgemeines Gemurmel der Zustimmung, denn die Leute in einem Städtchen wie Frost Falls empfinden ein leeres Schaufenster als einen kleinen persönlichen Kummer und ein neues als ein kleines persönliches Geschenk.</w:t>
+        <w:t xml:space="preserve">„Nun“, sagte Ivy zufrieden, „etwas öffnet sich. Wird auch Zeit. Ein dunkles Geschäft ist eine Schande für die Straße.“ Es gab ein allgemeines Gemurmel der Zustimmung, denn die Leute in einem Städtchen wie Frost Falls empfinden ein leeres Schaufenster als einen kleinen persönlichen Kummer und ein neues als ein kleines persönliches Geschenk.</w:t>
       </w:r>
     </w:p>
     <w:p/>
@@ -5085,7 +5085,7 @@
     <w:p/>
     <w:p>
       <w:r>
-        <w:t>Er stand nun mit dem Rücken zur Straße, die Stockarme weit zur Seite gestreckt, das klobige Kohlegesicht von den Geschäften weg den Anger hinauf gerichtet. Genauer gesagt, wenn man es genau nehmen wollte, auf das fernere Ende des Blocks, wo der alte Fenwick-Laden hinter seinem braunen Papier lag. Die anderen beiden blickten noch immer zur Straße. Nur der mittlere hatte sich bewegt. Hatte sich auf seinem Sockel um die eigene Achse gedreht, um in die andere Richtung zu blicken. Und weit und breit gab es keinen einzigen Fußabdruck in seiner Nähe. Der Schnee rund um alle drei lag glatt und unberührt. Fünfzehn Zentimeter frischer Neuschnee, in den nichts eingeschrieben war als die langen blauen Schatten des Geländers am Musikpavillon.</w:t>
+        <w:t xml:space="preserve">Er stand nun mit dem Rücken zur Straße, die Stockarme weit zur Seite gestreckt, das klobige Kohlegesicht den Anger hinauf zu den Geschäften gerichtet. Genauer gesagt, wenn man es genau nehmen wollte, auf das fernere Ende des Blocks, wo der alte Fenwick-Laden hinter seinem braunen Papier lag. Die anderen beiden blickten noch immer zur Straße. Nur der mittlere hatte sich bewegt. Hatte sich auf seinem Sockel um die eigene Achse gedreht, um in die andere Richtung zu blicken. Und weit und breit gab es keinen einzigen Fußabdruck in seiner Nähe. Der Schnee rund um alle drei lag glatt und unberührt. Fünfzehn Zentimeter frischer Neuschnee, in den nichts eingeschrieben war als die langen blauen Schatten des Geländers am Musikpavillon.</w:t>
       </w:r>
     </w:p>
     <w:p/>
@@ -5121,13 +5121,13 @@
     <w:p/>
     <w:p>
       <w:r>
-        <w:t>Und das war die vernünftige Sichtweise, und der Kreis nahm sie an, und irgendjemand sagte, die Jugend von heute, und jemand anderes sagte, so wie früher habe es nie geschneit, als ich ein Mädchen war, und das Gespräch ging weiter, wie Gespräche im Kreis nun mal gehen, und Ivy ging sich ein weiteres Ingwerplätzchen holen. Aber ich blieb einen Moment länger als die anderen am Fenster stehen, mit meinem halbfertigen Kranz in der Hand. Ich blickte auf diesen mittleren Schneemann, der den Block hinaufblickte. Ich blickte auf den glatten, unberührten Schnee, den die Stiefel keines Spassvogels berührt hatten. Und ich sagte nicht, was ich dachte.</w:t>
-      </w:r>
-    </w:p>
-    <w:p/>
-    <w:p>
-      <w:r>
-        <w:t>Denn ich kenne den Unterschied. Ich lebe nun schon sehr lange an der Seite der Magie von Weihnachten. Lange genug, um sie in meinen Knochen zu spüren, so schlicht wie einen Fußstapfen auf meiner eigenen Treppe. Das war kein Kind mit kalten Fingern. Die Magie lief frei in Frost Falls herum. Sie war frei, seit wir angekommen waren, und suchte nach einem Zuhause. Mein Mann baute ihr eines. Langsam und geduldig in seiner Werkstatt, einen Herd, in dem sie sich niederlassen konnte, und sie zog dem Feuer jeden Tag ein wenig näher. Aber sie war noch nicht zur Ruhe gekommen. Sie war nachts immer noch draußen im Städtchen, warm und tollpatschig und völlig frei von Bosheit, und tat die kleinen, unmöglichen Dinge, die die Magie eben tut, wenn sie mehr Gefühl als Verstand hat. Sie verwandelte die Festtagsbeleuchtung von orange in gold. Und jetzt, wie es aussah, ließ sie im Dunkeln den Schneemann eines Kindes so herumgehen, dass er auf das blickte, was ihre wandernde Aufmerksamkeit erregt hatte.</w:t>
+        <w:t xml:space="preserve">Und das war die vernünftige Sichtweise, und der Kreis nahm sie an, und irgendjemand sagte, die Jugend von heute, und jemand anderes sagte, so wie früher habe es nie geschneit, als ich ein Mädchen war, und das Gespräch ging weiter, wie Gespräche im Kreis nun mal gehen, und Ivy ging sich ein weiteres Ingwerplätzchen holen. Aber ich blieb einen Moment länger als die anderen am Fenster stehen, mit meinem halbfertigen Kranz in der Hand. Ich blickte auf diesen mittleren Schneemann, der den Block hinaufblickte. Ich blickte auf den glatten, unberührten Schnee, den die Stiefel keines Spaßvogels berührt hatten. Und ich sagte nicht, was ich dachte.</w:t>
+      </w:r>
+    </w:p>
+    <w:p/>
+    <w:p>
+      <w:r>
+        <w:t xml:space="preserve">Denn ich kenne den Unterschied. Ich lebe nun schon sehr lange an der Seite der Magie von Weihnachten. Lange genug, um sie in meinen Knochen zu spüren, so schlicht wie einen Fußstapfen auf meiner eigenen Treppe. Das war kein Kind mit kalten Fingern. Die Magie lief frei in Frost Falls herum. Sie war frei, seit wir angekommen waren, und suchte nach einem Zuhause. Mein Mann baute ihr eines. Langsam und geduldig in seiner Werkstatt, eine Herdstelle, in der sie sich niederlassen konnte, und sie zog dem Feuer jeden Tag ein wenig näher. Aber sie war noch nicht zur Ruhe gekommen. Sie war nachts immer noch draußen im Städtchen, warm und tollpatschig und völlig frei von Bosheit, und tat die kleinen, unmöglichen Dinge, die die Magie eben tut, wenn sie mehr Gefühl als Verstand hat. Sie verwandelte die Festtagsbeleuchtung von orange in gold. Und jetzt, wie es aussah, ließ sie im Dunkeln den Schneemann eines Kindes so herumgehen, dass er auf das blickte, was ihre wandernde Aufmerksamkeit erregt hatte.</w:t>
       </w:r>
     </w:p>
     <w:p/>
@@ -5139,7 +5139,7 @@
     <w:p/>
     <w:p>
       <w:r>
-        <w:t>Aber ich sagte nichts davon dem Kreis. Ich nahm ein Ingwerplätzchen, sagte zu Pip nein, als sie die Krümel anäugte, und setzte mich wieder an meinen Kranz. Ich band das Tannenreisig fest, Zweig über Zweig, alle in dieselbe Richtung zeigend. Hinter mir knackte ein Holzscheit im Ofen, und die Frauen unterhielten sich. Der Schnee lag hell auf dem Anger, mit einem einzigen Schneemann, der in die falsche Richtung blickte. Etwas fing an. Ich vertraute auf das kühle Kribbeln in meinem Nacken, und es blieb den ganzen Vormund über bei mir.</w:t>
+        <w:t xml:space="preserve">Aber ich sagte nichts davon dem Kreis. Ich nahm ein Ingwerplätzchen, sagte zu Pip nein, als sie die Krümel anäugte, und setzte mich wieder an meinen Kranz. Ich band das Tannenreisig fest, Zweig über Zweig, alle in dieselbe Richtung zeigend. Hinter mir knackte ein Holzscheit im Ofen, und die Frauen unterhielten sich. Der Schnee lag hell auf dem Anger, mit einem einzigen Schneemann, der in die falsche Richtung blickte. Etwas fing an. Ich vertraute auf das kühle Kribbeln in meinem Nacken, und es blieb den ganzen Vormittag über bei mir.</w:t>
       </w:r>
     </w:p>
     <w:p/>

</xml_diff>